<commit_message>
docs: refresh recruiter portfolio and career downloads
</commit_message>
<xml_diff>
--- a/public/docs/Jakye_Amos_Comprehensive_CV.docx
+++ b/public/docs/Jakye_Amos_Comprehensive_CV.docx
@@ -2,6 +2,21 @@
 <file path=word/document.xml><?xml version="1.0" encoding="utf-8"?>
 <w:document xmlns:wpc="http://schemas.microsoft.com/office/word/2010/wordprocessingCanvas" xmlns:mo="http://schemas.microsoft.com/office/mac/office/2008/main" xmlns:mc="http://schemas.openxmlformats.org/markup-compatibility/2006" xmlns:mv="urn:schemas-microsoft-com:mac:vml" xmlns:o="urn:schemas-microsoft-com:office:office" xmlns:r="http://schemas.openxmlformats.org/officeDocument/2006/relationships" xmlns:m="http://schemas.openxmlformats.org/officeDocument/2006/math" xmlns:v="urn:schemas-microsoft-com:vml" xmlns:wp14="http://schemas.microsoft.com/office/word/2010/wordprocessingDrawing" xmlns:wp="http://schemas.openxmlformats.org/drawingml/2006/wordprocessingDrawing" xmlns:w10="urn:schemas-microsoft-com:office:word" xmlns:w="http://schemas.openxmlformats.org/wordprocessingml/2006/main" xmlns:w14="http://schemas.microsoft.com/office/word/2010/wordml" xmlns:wpg="http://schemas.microsoft.com/office/word/2010/wordprocessingGroup" xmlns:wpi="http://schemas.microsoft.com/office/word/2010/wordprocessingInk" xmlns:wne="http://schemas.microsoft.com/office/word/2006/wordml" xmlns:wps="http://schemas.microsoft.com/office/word/2010/wordprocessingShape" mc:Ignorable="w14 wp14">
   <w:body>
+    <w:p>
+      <w:pPr>
+        <w:spacing w:after="40"/>
+        <w:jc w:val="center"/>
+      </w:pPr>
+      <w:r>
+        <w:rPr>
+          <w:rFonts w:ascii="Aptos Display" w:hAnsi="Aptos Display"/>
+          <w:b/>
+          <w:color w:val="2F5597"/>
+          <w:sz w:val="40"/>
+        </w:rPr>
+        <w:t>JAKYE AMOS</w:t>
+      </w:r>
+    </w:p>
     <w:p>
       <w:pPr>
         <w:spacing w:after="20"/>
@@ -9,82 +24,60 @@
       </w:pPr>
       <w:r>
         <w:rPr>
-          <w:rFonts w:ascii="Aptos Display" w:hAnsi="Aptos Display"/>
-          <w:b/>
-          <w:color w:val="1F3864"/>
-          <w:sz w:val="38"/>
-        </w:rPr>
-        <w:t>JAKYE AMOS</w:t>
-      </w:r>
-    </w:p>
-    <w:p>
-      <w:pPr>
-        <w:spacing w:after="0"/>
-        <w:jc w:val="center"/>
-      </w:pPr>
-      <w:r>
-        <w:rPr>
           <w:rFonts w:ascii="Aptos" w:hAnsi="Aptos"/>
-          <w:sz w:val="19"/>
+          <w:sz w:val="17"/>
         </w:rPr>
         <w:t>Jakyejobs@gmail.com  |  716-578-8221  |  Buffalo, NY  |  linkedin.com/in/jakyeamos</w:t>
       </w:r>
     </w:p>
     <w:p>
       <w:pPr>
-        <w:spacing w:after="100"/>
+        <w:spacing w:after="20"/>
         <w:jc w:val="center"/>
       </w:pPr>
       <w:r>
         <w:rPr>
           <w:rFonts w:ascii="Aptos" w:hAnsi="Aptos"/>
-          <w:sz w:val="19"/>
+          <w:sz w:val="17"/>
         </w:rPr>
         <w:t>github.com/jakyeamos  |  jakye.netlify.app</w:t>
       </w:r>
     </w:p>
     <w:p>
       <w:pPr>
+        <w:spacing w:before="160" w:after="140"/>
         <w:pBdr>
-          <w:bottom w:val="single" w:sz="12" w:space="1" w:color="2F5597"/>
+          <w:bottom w:val="single" w:sz="16" w:space="1" w:color="2F5597"/>
         </w:pBdr>
-        <w:spacing w:after="0"/>
       </w:pPr>
     </w:p>
     <w:p>
       <w:pPr>
         <w:pStyle w:val="CVSection"/>
-        <w:pBdr>
-          <w:bottom w:val="single" w:sz="8" w:space="1" w:color="D9E2F3"/>
-        </w:pBdr>
       </w:pPr>
       <w:r>
-        <w:t>PROFESSIONAL SUMMARY</w:t>
+        <w:t>Professional Summary</w:t>
       </w:r>
     </w:p>
     <w:p>
       <w:pPr>
-        <w:spacing w:after="60" w:line="254" w:lineRule="auto"/>
+        <w:spacing w:after="80"/>
       </w:pPr>
       <w:r>
-        <w:t>Full-stack software engineer with experience building enterprise applications, internal tooling, AI-enabled systems, and product-focused platforms across startups, consulting environments, Amazon engineering teams, and independent projects. Proven ability to ship quickly under pressure, lead end-to-end builds, and deliver measurable outcomes across healthcare, architecture, developer productivity, analytics, and consumer software. Strong technical foundation in TypeScript, JavaScript, Python, Java, Go, React, Next.js, Node.js, Docker, PostgreSQL, AWS, Prisma, tRPC, and real-time systems.</w:t>
+        <w:t>Software engineer with three Amazon SDE internships and CTO-level client delivery experience, building backend, AI, data, developer-tooling, and full-stack systems. Shipped measurable software for healthcare, operations, and startup clients, including Tenure, a LaunchNY cohort knowledge platform, and published quality infrastructure. Available for full-time work immediately; degree completion expected Spring 2027.</w:t>
       </w:r>
     </w:p>
     <w:p>
       <w:pPr>
         <w:pStyle w:val="CVSection"/>
-        <w:pBdr>
-          <w:bottom w:val="single" w:sz="8" w:space="1" w:color="D9E2F3"/>
-        </w:pBdr>
       </w:pPr>
       <w:r>
-        <w:t>TECHNICAL SKILLS</w:t>
+        <w:t>Technical Skills</w:t>
       </w:r>
     </w:p>
     <w:tbl>
       <w:tblPr>
         <w:tblW w:type="auto" w:w="0"/>
-        <w:jc w:val="center"/>
         <w:tblLayout w:type="fixed"/>
         <w:tblLook w:firstColumn="1" w:firstRow="1" w:lastColumn="0" w:lastRow="0" w:noHBand="0" w:noVBand="1" w:val="04A0"/>
       </w:tblPr>
@@ -95,27 +88,18 @@
       <w:tr>
         <w:tc>
           <w:tcPr>
-            <w:tcW w:type="dxa" w:w="2016"/>
-            <w:tcMar>
-              <w:top w:w="70" w:type="dxa"/>
-              <w:start w:w="90" w:type="dxa"/>
-              <w:bottom w:w="70" w:type="dxa"/>
-              <w:end w:w="90" w:type="dxa"/>
-            </w:tcMar>
-            <w:shd w:fill="EDF2F9"/>
-            <w:tcBorders>
-              <w:left w:sz="5" w:val="single" w:color="D9E2F3"/>
-              <w:top w:sz="5" w:val="single" w:color="D9E2F3"/>
-              <w:right w:sz="5" w:val="single" w:color="D9E2F3"/>
-              <w:bottom w:sz="5" w:val="single" w:color="D9E2F3"/>
-            </w:tcBorders>
+            <w:tcW w:type="dxa" w:w="2376"/>
+            <w:shd w:fill="EAF0F8"/>
           </w:tcPr>
           <w:p>
-            <w:pPr/>
+            <w:pPr>
+              <w:spacing w:after="20"/>
+            </w:pPr>
             <w:r>
               <w:rPr>
+                <w:rFonts w:ascii="Aptos" w:hAnsi="Aptos"/>
                 <w:b/>
-                <w:sz w:val="19"/>
+                <w:sz w:val="17"/>
               </w:rPr>
               <w:t>Languages</w:t>
             </w:r>
@@ -123,27 +107,18 @@
         </w:tc>
         <w:tc>
           <w:tcPr>
-            <w:tcW w:type="dxa" w:w="8352"/>
-            <w:tcMar>
-              <w:top w:w="70" w:type="dxa"/>
-              <w:start w:w="90" w:type="dxa"/>
-              <w:bottom w:w="70" w:type="dxa"/>
-              <w:end w:w="90" w:type="dxa"/>
-            </w:tcMar>
-            <w:tcBorders>
-              <w:left w:sz="5" w:val="single" w:color="D9E2F3"/>
-              <w:top w:sz="5" w:val="single" w:color="D9E2F3"/>
-              <w:right w:sz="5" w:val="single" w:color="D9E2F3"/>
-              <w:bottom w:sz="5" w:val="single" w:color="D9E2F3"/>
-            </w:tcBorders>
+            <w:tcW w:type="dxa" w:w="8280"/>
           </w:tcPr>
           <w:p>
-            <w:pPr/>
+            <w:pPr>
+              <w:spacing w:after="20"/>
+            </w:pPr>
             <w:r>
               <w:rPr>
-                <w:sz w:val="19"/>
+                <w:rFonts w:ascii="Aptos" w:hAnsi="Aptos"/>
+                <w:sz w:val="17"/>
               </w:rPr>
-              <w:t>TypeScript, JavaScript, Python, Java, Go, R, MATLAB, SQL</w:t>
+              <w:t>TypeScript, JavaScript, Python, Java, Go, SQL, R, MATLAB</w:t>
             </w:r>
           </w:p>
         </w:tc>
@@ -151,55 +126,37 @@
       <w:tr>
         <w:tc>
           <w:tcPr>
-            <w:tcW w:type="dxa" w:w="2016"/>
-            <w:tcMar>
-              <w:top w:w="70" w:type="dxa"/>
-              <w:start w:w="90" w:type="dxa"/>
-              <w:bottom w:w="70" w:type="dxa"/>
-              <w:end w:w="90" w:type="dxa"/>
-            </w:tcMar>
-            <w:shd w:fill="EDF2F9"/>
-            <w:tcBorders>
-              <w:left w:sz="5" w:val="single" w:color="D9E2F3"/>
-              <w:top w:sz="5" w:val="single" w:color="D9E2F3"/>
-              <w:right w:sz="5" w:val="single" w:color="D9E2F3"/>
-              <w:bottom w:sz="5" w:val="single" w:color="D9E2F3"/>
-            </w:tcBorders>
+            <w:tcW w:type="dxa" w:w="2376"/>
+            <w:shd w:fill="EAF0F8"/>
           </w:tcPr>
           <w:p>
-            <w:pPr/>
+            <w:pPr>
+              <w:spacing w:after="20"/>
+            </w:pPr>
             <w:r>
               <w:rPr>
+                <w:rFonts w:ascii="Aptos" w:hAnsi="Aptos"/>
                 <w:b/>
-                <w:sz w:val="19"/>
+                <w:sz w:val="17"/>
               </w:rPr>
-              <w:t>Frameworks / Tools</w:t>
+              <w:t>Backend / AI</w:t>
             </w:r>
           </w:p>
         </w:tc>
         <w:tc>
           <w:tcPr>
-            <w:tcW w:type="dxa" w:w="8352"/>
-            <w:tcMar>
-              <w:top w:w="70" w:type="dxa"/>
-              <w:start w:w="90" w:type="dxa"/>
-              <w:bottom w:w="70" w:type="dxa"/>
-              <w:end w:w="90" w:type="dxa"/>
-            </w:tcMar>
-            <w:tcBorders>
-              <w:left w:sz="5" w:val="single" w:color="D9E2F3"/>
-              <w:top w:sz="5" w:val="single" w:color="D9E2F3"/>
-              <w:right w:sz="5" w:val="single" w:color="D9E2F3"/>
-              <w:bottom w:sz="5" w:val="single" w:color="D9E2F3"/>
-            </w:tcBorders>
+            <w:tcW w:type="dxa" w:w="8280"/>
           </w:tcPr>
           <w:p>
-            <w:pPr/>
+            <w:pPr>
+              <w:spacing w:after="20"/>
+            </w:pPr>
             <w:r>
               <w:rPr>
-                <w:sz w:val="19"/>
+                <w:rFonts w:ascii="Aptos" w:hAnsi="Aptos"/>
+                <w:sz w:val="17"/>
               </w:rPr>
-              <w:t>React, Next.js, Node.js, Express, Socket.io, Prisma, tRPC, Docker, PostgreSQL, AWS, Git, Expo</w:t>
+              <w:t>Next.js, Node.js, FastAPI, Express, PostgreSQL, Supabase, Prisma, Docker, AWS, MCP, LSP, LLM APIs</w:t>
             </w:r>
           </w:p>
         </w:tc>
@@ -207,111 +164,37 @@
       <w:tr>
         <w:tc>
           <w:tcPr>
-            <w:tcW w:type="dxa" w:w="2016"/>
-            <w:tcMar>
-              <w:top w:w="70" w:type="dxa"/>
-              <w:start w:w="90" w:type="dxa"/>
-              <w:bottom w:w="70" w:type="dxa"/>
-              <w:end w:w="90" w:type="dxa"/>
-            </w:tcMar>
-            <w:shd w:fill="EDF2F9"/>
-            <w:tcBorders>
-              <w:left w:sz="5" w:val="single" w:color="D9E2F3"/>
-              <w:top w:sz="5" w:val="single" w:color="D9E2F3"/>
-              <w:right w:sz="5" w:val="single" w:color="D9E2F3"/>
-              <w:bottom w:sz="5" w:val="single" w:color="D9E2F3"/>
-            </w:tcBorders>
+            <w:tcW w:type="dxa" w:w="2376"/>
+            <w:shd w:fill="EAF0F8"/>
           </w:tcPr>
           <w:p>
-            <w:pPr/>
+            <w:pPr>
+              <w:spacing w:after="20"/>
+            </w:pPr>
             <w:r>
               <w:rPr>
+                <w:rFonts w:ascii="Aptos" w:hAnsi="Aptos"/>
                 <w:b/>
-                <w:sz w:val="19"/>
+                <w:sz w:val="17"/>
               </w:rPr>
-              <w:t>Other</w:t>
+              <w:t>Product / Ops</w:t>
             </w:r>
           </w:p>
         </w:tc>
         <w:tc>
           <w:tcPr>
-            <w:tcW w:type="dxa" w:w="8352"/>
-            <w:tcMar>
-              <w:top w:w="70" w:type="dxa"/>
-              <w:start w:w="90" w:type="dxa"/>
-              <w:bottom w:w="70" w:type="dxa"/>
-              <w:end w:w="90" w:type="dxa"/>
-            </w:tcMar>
-            <w:tcBorders>
-              <w:left w:sz="5" w:val="single" w:color="D9E2F3"/>
-              <w:top w:sz="5" w:val="single" w:color="D9E2F3"/>
-              <w:right w:sz="5" w:val="single" w:color="D9E2F3"/>
-              <w:bottom w:sz="5" w:val="single" w:color="D9E2F3"/>
-            </w:tcBorders>
+            <w:tcW w:type="dxa" w:w="8280"/>
           </w:tcPr>
           <w:p>
-            <w:pPr/>
+            <w:pPr>
+              <w:spacing w:after="20"/>
+            </w:pPr>
             <w:r>
               <w:rPr>
-                <w:sz w:val="19"/>
+                <w:rFonts w:ascii="Aptos" w:hAnsi="Aptos"/>
+                <w:sz w:val="17"/>
               </w:rPr>
-              <w:t>Full-stack architecture, monorepo development, analytics tooling, automation tooling, real-time systems, licensed drone pilot, photography, videography</w:t>
-            </w:r>
-          </w:p>
-        </w:tc>
-      </w:tr>
-      <w:tr>
-        <w:tc>
-          <w:tcPr>
-            <w:tcW w:type="dxa" w:w="2016"/>
-            <w:tcMar>
-              <w:top w:w="70" w:type="dxa"/>
-              <w:start w:w="90" w:type="dxa"/>
-              <w:bottom w:w="70" w:type="dxa"/>
-              <w:end w:w="90" w:type="dxa"/>
-            </w:tcMar>
-            <w:shd w:fill="EDF2F9"/>
-            <w:tcBorders>
-              <w:left w:sz="5" w:val="single" w:color="D9E2F3"/>
-              <w:top w:sz="5" w:val="single" w:color="D9E2F3"/>
-              <w:right w:sz="5" w:val="single" w:color="D9E2F3"/>
-              <w:bottom w:sz="5" w:val="single" w:color="D9E2F3"/>
-            </w:tcBorders>
-          </w:tcPr>
-          <w:p>
-            <w:pPr/>
-            <w:r>
-              <w:rPr>
-                <w:b/>
-                <w:sz w:val="19"/>
-              </w:rPr>
-              <w:t>Human Languages</w:t>
-            </w:r>
-          </w:p>
-        </w:tc>
-        <w:tc>
-          <w:tcPr>
-            <w:tcW w:type="dxa" w:w="8352"/>
-            <w:tcMar>
-              <w:top w:w="70" w:type="dxa"/>
-              <w:start w:w="90" w:type="dxa"/>
-              <w:bottom w:w="70" w:type="dxa"/>
-              <w:end w:w="90" w:type="dxa"/>
-            </w:tcMar>
-            <w:tcBorders>
-              <w:left w:sz="5" w:val="single" w:color="D9E2F3"/>
-              <w:top w:sz="5" w:val="single" w:color="D9E2F3"/>
-              <w:right w:sz="5" w:val="single" w:color="D9E2F3"/>
-              <w:bottom w:sz="5" w:val="single" w:color="D9E2F3"/>
-            </w:tcBorders>
-          </w:tcPr>
-          <w:p>
-            <w:pPr/>
-            <w:r>
-              <w:rPr>
-                <w:sz w:val="19"/>
-              </w:rPr>
-              <w:t>English (Fluent), French (Intermediate)</w:t>
+              <w:t>React, tRPC, Socket.io, Expo, SQLite, CI/CD, data pipelines, analytics, full-stack architecture, client delivery</w:t>
             </w:r>
           </w:p>
         </w:tc>
@@ -319,1708 +202,444 @@
     </w:tbl>
     <w:p>
       <w:pPr>
+        <w:spacing w:after="0"/>
+      </w:pPr>
+    </w:p>
+    <w:p>
+      <w:pPr>
         <w:pStyle w:val="CVSection"/>
-        <w:pBdr>
-          <w:bottom w:val="single" w:sz="8" w:space="1" w:color="D9E2F3"/>
-        </w:pBdr>
       </w:pPr>
       <w:r>
-        <w:t>EXPERIENCE</w:t>
+        <w:t>Experience</w:t>
       </w:r>
     </w:p>
     <w:p>
       <w:pPr>
         <w:pStyle w:val="CVSubhead"/>
-        <w:spacing w:after="0"/>
+        <w:keepNext/>
       </w:pPr>
       <w:r>
-        <w:rPr>
-          <w:b/>
-          <w:sz w:val="21"/>
-        </w:rPr>
-        <w:t>Lead Engineer</w:t>
+        <w:t>CTO  |  Forward Automations</w:t>
       </w:r>
       <w:r>
         <w:rPr>
-          <w:color w:val="787878"/>
+          <w:rFonts w:ascii="Aptos" w:hAnsi="Aptos"/>
+          <w:i/>
+          <w:color w:val="595959"/>
+          <w:sz w:val="18"/>
         </w:rPr>
-        <w:t xml:space="preserve">  |  </w:t>
-      </w:r>
-      <w:r>
-        <w:rPr>
-          <w:b/>
-          <w:sz w:val="21"/>
-        </w:rPr>
-        <w:t>Forward Automations</w:t>
-      </w:r>
-    </w:p>
-    <w:p>
-      <w:pPr>
-        <w:pStyle w:val="CVSmall"/>
-        <w:spacing w:after="20"/>
-      </w:pPr>
-      <w:r>
-        <w:rPr>
-          <w:i/>
-          <w:color w:val="5F5F5F"/>
-        </w:rPr>
-        <w:t>2023 – Present</w:t>
+        <w:t xml:space="preserve">  |  2023 - Present</w:t>
       </w:r>
     </w:p>
     <w:p>
       <w:pPr>
         <w:pStyle w:val="CVBullet"/>
-        <w:spacing w:after="0"/>
+        <w:spacing w:after="30"/>
+        <w:ind w:left="230" w:hanging="173"/>
       </w:pPr>
       <w:r>
-        <w:rPr>
-          <w:sz w:val="19"/>
-        </w:rPr>
-        <w:t>• Delivered a Cleveland Clinic clinical coaching MVP in 2 weeks, managing full-stack architecture for a regulated healthcare deployment.</w:t>
+        <w:t>• Delivered a Cleveland Clinic clinical-coaching MVP in 2 weeks for a regulated healthcare deployment.</w:t>
       </w:r>
     </w:p>
     <w:p>
       <w:pPr>
         <w:pStyle w:val="CVBullet"/>
-        <w:spacing w:after="0"/>
+        <w:spacing w:after="30"/>
+        <w:ind w:left="230" w:hanging="173"/>
       </w:pPr>
       <w:r>
-        <w:rPr>
-          <w:sz w:val="19"/>
-        </w:rPr>
         <w:t>• Built productivity software for a Cleveland architecture firm that increased operational output by 400%, deploying it in under 5 weeks.</w:t>
       </w:r>
     </w:p>
     <w:p>
       <w:pPr>
         <w:pStyle w:val="CVBullet"/>
-        <w:spacing w:after="0"/>
+        <w:spacing w:after="30"/>
+        <w:ind w:left="230" w:hanging="173"/>
       </w:pPr>
       <w:r>
-        <w:rPr>
-          <w:sz w:val="19"/>
-        </w:rPr>
         <w:t>• Led an end-to-end legacy refactor for STEM Playbook, launching a stable application in 11 days for a major live event.</w:t>
       </w:r>
     </w:p>
     <w:p>
       <w:pPr>
         <w:pStyle w:val="CVBullet"/>
-        <w:spacing w:after="0"/>
+        <w:spacing w:after="30"/>
+        <w:ind w:left="230" w:hanging="173"/>
       </w:pPr>
       <w:r>
-        <w:rPr>
-          <w:sz w:val="19"/>
-        </w:rPr>
-        <w:t>• Developed proprietary AI marketing automation tools that reduced production timelines by 90% and generated 1.5M organic views for an A16z startup.</w:t>
+        <w:t>• Developed AI marketing automation tools that reduced production timelines by 90% and generated 1.5M organic views for an a16z startup.</w:t>
       </w:r>
     </w:p>
     <w:p>
       <w:pPr>
         <w:pStyle w:val="CVSubhead"/>
-        <w:spacing w:after="0"/>
+        <w:keepNext/>
       </w:pPr>
       <w:r>
-        <w:rPr>
-          <w:b/>
-          <w:sz w:val="21"/>
-        </w:rPr>
-        <w:t>Technical Consultant</w:t>
+        <w:t>Technical Consultant  |  Deepr (a16z Portfolio Company)</w:t>
       </w:r>
       <w:r>
         <w:rPr>
-          <w:color w:val="787878"/>
+          <w:rFonts w:ascii="Aptos" w:hAnsi="Aptos"/>
+          <w:i/>
+          <w:color w:val="595959"/>
+          <w:sz w:val="18"/>
         </w:rPr>
-        <w:t xml:space="preserve">  |  </w:t>
-      </w:r>
-      <w:r>
-        <w:rPr>
-          <w:b/>
-          <w:sz w:val="21"/>
-        </w:rPr>
-        <w:t>Deepr (A16z Portfolio Company)</w:t>
-      </w:r>
-    </w:p>
-    <w:p>
-      <w:pPr>
-        <w:pStyle w:val="CVSmall"/>
-        <w:spacing w:after="20"/>
-      </w:pPr>
-      <w:r>
-        <w:rPr>
-          <w:i/>
-          <w:color w:val="5F5F5F"/>
-        </w:rPr>
-        <w:t>2025</w:t>
+        <w:t xml:space="preserve">  |  2025</w:t>
       </w:r>
     </w:p>
     <w:p>
       <w:pPr>
         <w:pStyle w:val="CVBullet"/>
-        <w:spacing w:after="0"/>
+        <w:spacing w:after="30"/>
+        <w:ind w:left="230" w:hanging="173"/>
       </w:pPr>
       <w:r>
+        <w:t>• Engineered an AI-powered photo-carousel content-generation system and an inline coverage-vector tool for real-time testing awareness during code review.</w:t>
+      </w:r>
+    </w:p>
+    <w:p>
+      <w:pPr>
+        <w:pStyle w:val="CVSubhead"/>
+        <w:keepNext/>
+      </w:pPr>
+      <w:r>
+        <w:t>Software Development Engineer Intern  |  Amazon</w:t>
+      </w:r>
+      <w:r>
         <w:rPr>
-          <w:sz w:val="19"/>
+          <w:rFonts w:ascii="Aptos" w:hAnsi="Aptos"/>
+          <w:i/>
+          <w:color w:val="595959"/>
+          <w:sz w:val="18"/>
         </w:rPr>
-        <w:t>• Engineered an AI-powered photo carousel system that drove substantial growth in marketing viewership through custom content-generation tooling.</w:t>
+        <w:t xml:space="preserve">  |  2023 - 2025</w:t>
       </w:r>
     </w:p>
     <w:p>
       <w:pPr>
         <w:pStyle w:val="CVBullet"/>
-        <w:spacing w:after="0"/>
+        <w:spacing w:after="30"/>
+        <w:ind w:left="230" w:hanging="173"/>
       </w:pPr>
       <w:r>
-        <w:rPr>
-          <w:sz w:val="19"/>
-        </w:rPr>
-        <w:t>• Developed an inline coverage-vector tool for real-time testing coverage awareness during code reviews.</w:t>
-      </w:r>
-    </w:p>
-    <w:p>
-      <w:pPr>
-        <w:pStyle w:val="CVSubhead"/>
-        <w:spacing w:after="0"/>
-      </w:pPr>
-      <w:r>
-        <w:rPr>
-          <w:b/>
-          <w:sz w:val="21"/>
-        </w:rPr>
-        <w:t>Software Development Engineer Intern</w:t>
-      </w:r>
-      <w:r>
-        <w:rPr>
-          <w:color w:val="787878"/>
-        </w:rPr>
-        <w:t xml:space="preserve">  |  </w:t>
-      </w:r>
-      <w:r>
-        <w:rPr>
-          <w:b/>
-          <w:sz w:val="21"/>
-        </w:rPr>
-        <w:t>Amazon</w:t>
-      </w:r>
-    </w:p>
-    <w:p>
-      <w:pPr>
-        <w:pStyle w:val="CVSmall"/>
-        <w:spacing w:after="20"/>
-      </w:pPr>
-      <w:r>
-        <w:rPr>
-          <w:i/>
-          <w:color w:val="5F5F5F"/>
-        </w:rPr>
-        <w:t>2023 – 2025</w:t>
+        <w:t>• Completed three SDE internship terms across multiple teams, including Ads and FinTech/business-systems environments.</w:t>
       </w:r>
     </w:p>
     <w:p>
       <w:pPr>
         <w:pStyle w:val="CVBullet"/>
-        <w:spacing w:after="0"/>
+        <w:spacing w:after="30"/>
+        <w:ind w:left="230" w:hanging="173"/>
       </w:pPr>
       <w:r>
-        <w:rPr>
-          <w:sz w:val="19"/>
-        </w:rPr>
-        <w:t>• Contributed across multiple terms and teams, including Ads and FinTech / business systems environments.</w:t>
-      </w:r>
-    </w:p>
-    <w:p>
-      <w:pPr>
-        <w:pStyle w:val="CVBullet"/>
-        <w:spacing w:after="0"/>
-      </w:pPr>
-      <w:r>
-        <w:rPr>
-          <w:sz w:val="19"/>
-        </w:rPr>
         <w:t>• Enhanced customer process efficiency and pipeline testing capabilities across distributed systems infrastructure.</w:t>
       </w:r>
     </w:p>
     <w:p>
       <w:pPr>
         <w:pStyle w:val="CVBullet"/>
-        <w:spacing w:after="0"/>
+        <w:spacing w:after="30"/>
+        <w:ind w:left="230" w:hanging="173"/>
       </w:pPr>
       <w:r>
-        <w:rPr>
-          <w:sz w:val="19"/>
-        </w:rPr>
         <w:t>• Built a data analytics project that provided actionable hiring insights to business leaders and hiring managers.</w:t>
       </w:r>
     </w:p>
     <w:p>
       <w:pPr>
         <w:pStyle w:val="CVBullet"/>
-        <w:spacing w:after="0"/>
+        <w:spacing w:after="30"/>
+        <w:ind w:left="230" w:hanging="173"/>
       </w:pPr>
       <w:r>
-        <w:rPr>
-          <w:sz w:val="19"/>
-        </w:rPr>
         <w:t>• Completed coding projects that improved team efficiency and broadened internal testing capabilities.</w:t>
+      </w:r>
+    </w:p>
+    <w:p>
+      <w:r>
+        <w:br w:type="page"/>
+      </w:r>
+    </w:p>
+    <w:p>
+      <w:pPr>
+        <w:pStyle w:val="CVSection"/>
+      </w:pPr>
+      <w:r>
+        <w:t>Selected Client &amp; Product Systems</w:t>
       </w:r>
     </w:p>
     <w:p>
       <w:pPr>
         <w:pStyle w:val="CVSubhead"/>
-        <w:spacing w:after="0"/>
+        <w:keepNext/>
       </w:pPr>
       <w:r>
-        <w:rPr>
-          <w:b/>
-          <w:sz w:val="21"/>
-        </w:rPr>
-        <w:t>CRM Intern</w:t>
+        <w:t>Tenure  |  LaunchNY Cohort Venture  |  AI Knowledge Platform</w:t>
       </w:r>
       <w:r>
         <w:rPr>
-          <w:color w:val="787878"/>
+          <w:rFonts w:ascii="Aptos" w:hAnsi="Aptos"/>
+          <w:i/>
+          <w:color w:val="595959"/>
+          <w:sz w:val="18"/>
         </w:rPr>
-        <w:t xml:space="preserve">  |  </w:t>
+        <w:t xml:space="preserve">  |  Pilot-ready</w:t>
+      </w:r>
+    </w:p>
+    <w:p>
+      <w:pPr>
+        <w:pStyle w:val="CVBullet"/>
+        <w:spacing w:after="30"/>
+        <w:ind w:left="230" w:hanging="173"/>
+      </w:pPr>
+      <w:r>
+        <w:t>• Built a platform that turns specialist-led knowledge capture into reviewed SOPs, permissioned institutional memory, cited Q&amp;A, and process intelligence reports.</w:t>
+      </w:r>
+    </w:p>
+    <w:p>
+      <w:pPr>
+        <w:pStyle w:val="CVBullet"/>
+        <w:spacing w:after="30"/>
+        <w:ind w:left="230" w:hanging="173"/>
+      </w:pPr>
+      <w:r>
+        <w:t>• Implemented Next.js/TypeScript and Supabase/PostgreSQL systems with RLS, transcription, LLM extraction, hybrid retrieval, and human review gates; pre-pilot hardening is underway.</w:t>
+      </w:r>
+    </w:p>
+    <w:p>
+      <w:pPr>
+        <w:pStyle w:val="CVSubhead"/>
+        <w:keepNext/>
+      </w:pPr>
+      <w:r>
+        <w:t>BidCamp  |  Multi-Tenant Government-Contracting SaaS</w:t>
       </w:r>
       <w:r>
         <w:rPr>
-          <w:b/>
-          <w:sz w:val="21"/>
+          <w:rFonts w:ascii="Aptos" w:hAnsi="Aptos"/>
+          <w:i/>
+          <w:color w:val="595959"/>
+          <w:sz w:val="18"/>
         </w:rPr>
-        <w:t>SIR</w:t>
+        <w:t xml:space="preserve">  |  Live closed beta</w:t>
+      </w:r>
+    </w:p>
+    <w:p>
+      <w:pPr>
+        <w:pStyle w:val="CVBullet"/>
+        <w:spacing w:after="30"/>
+        <w:ind w:left="230" w:hanging="173"/>
+      </w:pPr>
+      <w:r>
+        <w:t>• Built Claude-powered RFP analysis and proposal drafting, procurement intelligence, client and prime workflows, compliance tracking, and human-reviewed weekly digests for MBE/MWBE firms.</w:t>
+      </w:r>
+    </w:p>
+    <w:p>
+      <w:pPr>
+        <w:pStyle w:val="CVBullet"/>
+        <w:spacing w:after="30"/>
+        <w:ind w:left="230" w:hanging="173"/>
+      </w:pPr>
+      <w:r>
+        <w:t>• Implemented Next.js, Supabase/PostgreSQL RLS, Stripe, Resend, PostGrid, scheduled jobs, and a GitHub scraping worker.</w:t>
+      </w:r>
+    </w:p>
+    <w:p>
+      <w:pPr>
+        <w:pStyle w:val="CVSubhead"/>
+        <w:keepNext/>
+      </w:pPr>
+      <w:r>
+        <w:t>CrimClock  |  Legal Time Intelligence Platform</w:t>
+      </w:r>
+      <w:r>
+        <w:rPr>
+          <w:rFonts w:ascii="Aptos" w:hAnsi="Aptos"/>
+          <w:i/>
+          <w:color w:val="595959"/>
+          <w:sz w:val="18"/>
+        </w:rPr>
+        <w:t xml:space="preserve">  |  Product build</w:t>
+      </w:r>
+    </w:p>
+    <w:p>
+      <w:pPr>
+        <w:pStyle w:val="CVBullet"/>
+        <w:spacing w:after="30"/>
+        <w:ind w:left="230" w:hanging="173"/>
+      </w:pPr>
+      <w:r>
+        <w:t>• Built neutral, explainable procedural-timing and sentencing workflows with statutes, rule configuration, exclusions, tolling, calculation steps, and explicit disclaimer language.</w:t>
+      </w:r>
+    </w:p>
+    <w:p>
+      <w:pPr>
+        <w:pStyle w:val="CVSubhead"/>
+        <w:keepNext/>
+      </w:pPr>
+      <w:r>
+        <w:t>Hoopscout  |  Basketball Recruiting Intelligence</w:t>
+      </w:r>
+      <w:r>
+        <w:rPr>
+          <w:rFonts w:ascii="Aptos" w:hAnsi="Aptos"/>
+          <w:i/>
+          <w:color w:val="595959"/>
+          <w:sz w:val="18"/>
+        </w:rPr>
+        <w:t xml:space="preserve">  |  Private beta</w:t>
+      </w:r>
+    </w:p>
+    <w:p>
+      <w:pPr>
+        <w:pStyle w:val="CVBullet"/>
+        <w:spacing w:after="30"/>
+        <w:ind w:left="230" w:hanging="173"/>
+      </w:pPr>
+      <w:r>
+        <w:t>• Built coach-facing search, athlete review, fit weighting, ranked school-fit signals, messaging, transcript controls, and moderation/trust operations.</w:t>
+      </w:r>
+    </w:p>
+    <w:p>
+      <w:pPr>
+        <w:pStyle w:val="CVSection"/>
+      </w:pPr>
+      <w:r>
+        <w:t>Public Engineering Releases</w:t>
+      </w:r>
+    </w:p>
+    <w:p>
+      <w:pPr>
+        <w:pStyle w:val="CVSubhead"/>
+        <w:keepNext/>
+      </w:pPr>
+      <w:r>
+        <w:t>Quality Runner  |  Python CLI + MCP Server</w:t>
+      </w:r>
+    </w:p>
+    <w:p>
+      <w:pPr>
+        <w:pStyle w:val="CVBullet"/>
+        <w:spacing w:after="30"/>
+        <w:ind w:left="230" w:hanging="173"/>
+      </w:pPr>
+      <w:r>
+        <w:t>• Built and published a read-only quality orchestrator that compiles standards, detects checks, normalizes evidence-backed findings, and writes versioned artifacts plus remediation plans.</w:t>
+      </w:r>
+    </w:p>
+    <w:p>
+      <w:pPr>
+        <w:pStyle w:val="CVSubhead"/>
+        <w:keepNext/>
+      </w:pPr>
+      <w:r>
+        <w:t>Pre-CR Suite  |  Cross-Editor Developer Tooling</w:t>
+      </w:r>
+    </w:p>
+    <w:p>
+      <w:pPr>
+        <w:pStyle w:val="CVBullet"/>
+        <w:spacing w:after="30"/>
+        <w:ind w:left="230" w:hanging="173"/>
+      </w:pPr>
+      <w:r>
+        <w:t>• Built a TypeScript monorepo with shared core/server contracts and an LSP workflow for changed-line coverage readiness across VS Code, Neovim, and headless CLI use.</w:t>
+      </w:r>
+    </w:p>
+    <w:p>
+      <w:pPr>
+        <w:pStyle w:val="CVSubhead"/>
+        <w:keepNext/>
+      </w:pPr>
+      <w:r>
+        <w:t>Additional proof</w:t>
       </w:r>
     </w:p>
     <w:p>
       <w:pPr>
         <w:pStyle w:val="CVSmall"/>
-        <w:spacing w:after="20"/>
+        <w:spacing w:after="40"/>
       </w:pPr>
       <w:r>
-        <w:rPr>
-          <w:i/>
-          <w:color w:val="5F5F5F"/>
-        </w:rPr>
-        <w:t>January 2024 – Present</w:t>
+        <w:t>AIOS local-first agent operating system; Terrace published spec-driven AI workflow CLI; Court Vision/BBDSE basketball simulation and analytics; Soundscape web/mobile monorepo; Dsci-proj survival-analysis pipeline and triage dashboard.</w:t>
+      </w:r>
+    </w:p>
+    <w:p>
+      <w:pPr>
+        <w:pStyle w:val="CVSection"/>
+      </w:pPr>
+      <w:r>
+        <w:t>Education</w:t>
+      </w:r>
+    </w:p>
+    <w:p>
+      <w:pPr>
+        <w:pStyle w:val="CVSubhead"/>
+        <w:keepNext/>
+      </w:pPr>
+      <w:r>
+        <w:t>Case Western Reserve University, Cleveland, OH</w:t>
+      </w:r>
+    </w:p>
+    <w:p>
+      <w:pPr>
+        <w:pStyle w:val="CVSmall"/>
+        <w:spacing w:after="40"/>
+      </w:pPr>
+      <w:r>
+        <w:t>B.A. in Computer Science | Minors: Artificial Intelligence, Applied Data Science, Statistics | Expected completion: Spring 2027 | Available for full-time work immediately</w:t>
+      </w:r>
+    </w:p>
+    <w:p>
+      <w:pPr>
+        <w:pStyle w:val="CVSection"/>
+      </w:pPr>
+      <w:r>
+        <w:t>Leadership &amp; Community</w:t>
       </w:r>
     </w:p>
     <w:p>
       <w:pPr>
         <w:pStyle w:val="CVBullet"/>
-        <w:spacing w:after="0"/>
+        <w:spacing w:after="30"/>
+        <w:ind w:left="230" w:hanging="173"/>
       </w:pPr>
       <w:r>
-        <w:rPr>
-          <w:sz w:val="19"/>
-        </w:rPr>
-        <w:t>• Operated CRM models to optimize successful leads.</w:t>
+        <w:t>• President &amp; Founder, CWRU Flea Market: recurring events averaging 600+ attendees and roughly $7K in revenue per event.</w:t>
       </w:r>
     </w:p>
     <w:p>
       <w:pPr>
         <w:pStyle w:val="CVBullet"/>
-        <w:spacing w:after="0"/>
+        <w:spacing w:after="30"/>
+        <w:ind w:left="230" w:hanging="173"/>
       </w:pPr>
       <w:r>
-        <w:rPr>
-          <w:sz w:val="19"/>
-        </w:rPr>
-        <w:t>• Led meetings to introduce new additions to the company program and incentivize productivity.</w:t>
+        <w:t>• Vice President, App Developers and Innovators Club: technical development opportunities and collaboration programming.</w:t>
       </w:r>
     </w:p>
     <w:p>
       <w:pPr>
-        <w:pStyle w:val="CVSubhead"/>
-        <w:spacing w:after="0"/>
+        <w:pStyle w:val="CVSection"/>
       </w:pPr>
       <w:r>
-        <w:rPr>
-          <w:b/>
-          <w:sz w:val="21"/>
-        </w:rPr>
-        <w:t>Founder &amp; Lead Drone Pilot</w:t>
-      </w:r>
-      <w:r>
-        <w:rPr>
-          <w:color w:val="787878"/>
-        </w:rPr>
-        <w:t xml:space="preserve">  |  </w:t>
-      </w:r>
-      <w:r>
-        <w:rPr>
-          <w:b/>
-          <w:sz w:val="21"/>
-        </w:rPr>
-        <w:t>Elevated Aperture</w:t>
+        <w:t>Awards &amp; Honors</w:t>
       </w:r>
     </w:p>
     <w:p>
       <w:pPr>
         <w:pStyle w:val="CVSmall"/>
-        <w:spacing w:after="20"/>
-      </w:pPr>
-      <w:r>
-        <w:rPr>
-          <w:i/>
-          <w:color w:val="5F5F5F"/>
-        </w:rPr>
-        <w:t>2020 – Present</w:t>
-      </w:r>
-    </w:p>
-    <w:p>
-      <w:pPr>
-        <w:pStyle w:val="CVBullet"/>
         <w:spacing w:after="0"/>
       </w:pPr>
       <w:r>
-        <w:rPr>
-          <w:sz w:val="19"/>
-        </w:rPr>
-        <w:t>• Founded an aerial photography and videography company serving clients in the construction and arts industries.</w:t>
-      </w:r>
-    </w:p>
-    <w:p>
-      <w:pPr>
-        <w:pStyle w:val="CVBullet"/>
-        <w:spacing w:after="0"/>
-      </w:pPr>
-      <w:r>
-        <w:rPr>
-          <w:sz w:val="19"/>
-        </w:rPr>
-        <w:t>• Produced professional drone imagery for promotional campaigns and construction project development.</w:t>
-      </w:r>
-    </w:p>
-    <w:p>
-      <w:pPr>
-        <w:pStyle w:val="CVSubhead"/>
-        <w:spacing w:after="0"/>
-      </w:pPr>
-      <w:r>
-        <w:rPr>
-          <w:b/>
-          <w:sz w:val="21"/>
-        </w:rPr>
-        <w:t>Research Intern</w:t>
-      </w:r>
-      <w:r>
-        <w:rPr>
-          <w:color w:val="787878"/>
-        </w:rPr>
-        <w:t xml:space="preserve">  |  </w:t>
-      </w:r>
-      <w:r>
-        <w:rPr>
-          <w:b/>
-          <w:sz w:val="21"/>
-        </w:rPr>
-        <w:t>Autonomous Vehicle Group, University at Buffalo</w:t>
-      </w:r>
-    </w:p>
-    <w:p>
-      <w:pPr>
-        <w:pStyle w:val="CVSmall"/>
-        <w:spacing w:after="20"/>
-      </w:pPr>
-      <w:r>
-        <w:rPr>
-          <w:i/>
-          <w:color w:val="5F5F5F"/>
-        </w:rPr>
-        <w:t>2018 – 2020</w:t>
-      </w:r>
-    </w:p>
-    <w:p>
-      <w:pPr>
-        <w:pStyle w:val="CVBullet"/>
-        <w:spacing w:after="0"/>
-      </w:pPr>
-      <w:r>
-        <w:rPr>
-          <w:sz w:val="19"/>
-        </w:rPr>
-        <w:t>• Conducted research on the uses and limitations of LiDAR technology in autonomous vehicles.</w:t>
-      </w:r>
-    </w:p>
-    <w:p>
-      <w:pPr>
-        <w:pStyle w:val="CVSection"/>
-        <w:pBdr>
-          <w:bottom w:val="single" w:sz="8" w:space="1" w:color="D9E2F3"/>
-        </w:pBdr>
-      </w:pPr>
-      <w:r>
-        <w:t>SELECTED PROJECTS</w:t>
-      </w:r>
-    </w:p>
-    <w:p>
-      <w:pPr>
-        <w:pStyle w:val="CVSubhead"/>
-        <w:spacing w:after="0"/>
-      </w:pPr>
-      <w:r>
-        <w:rPr>
-          <w:b/>
-          <w:sz w:val="21"/>
-        </w:rPr>
-        <w:t>Soundscape</w:t>
-      </w:r>
-      <w:r>
-        <w:rPr>
-          <w:color w:val="787878"/>
-        </w:rPr>
-        <w:t xml:space="preserve">  |  </w:t>
-      </w:r>
-      <w:r>
-        <w:rPr>
-          <w:b/>
-          <w:sz w:val="21"/>
-        </w:rPr>
-        <w:t>Full-Stack Monorepo Music Platform</w:t>
-      </w:r>
-    </w:p>
-    <w:p>
-      <w:pPr>
-        <w:pStyle w:val="CVSmall"/>
-        <w:spacing w:after="20"/>
-      </w:pPr>
-      <w:r>
-        <w:rPr>
-          <w:i/>
-          <w:color w:val="5F5F5F"/>
-        </w:rPr>
-        <w:t>Current</w:t>
-      </w:r>
-    </w:p>
-    <w:p>
-      <w:pPr>
-        <w:pStyle w:val="CVBullet"/>
-        <w:spacing w:after="0"/>
-      </w:pPr>
-      <w:r>
-        <w:rPr>
-          <w:sz w:val="19"/>
-        </w:rPr>
-        <w:t>• Built and maintained a monorepo for a music social product with ratings, discovery, social feed, market and portfolio features, clubs, sets, artist briefs, and shared web/mobile platform code.</w:t>
-      </w:r>
-    </w:p>
-    <w:p>
-      <w:pPr>
-        <w:pStyle w:val="CVBullet"/>
-        <w:spacing w:after="0"/>
-      </w:pPr>
-      <w:r>
-        <w:rPr>
-          <w:sz w:val="19"/>
-        </w:rPr>
-        <w:t>• Structured the platform across a Next.js 14 web app, tRPC API/services layer, Prisma database package, shared platform logic, shared UI primitives, and an Expo mobile app.</w:t>
-      </w:r>
-    </w:p>
-    <w:p>
-      <w:pPr>
-        <w:pStyle w:val="CVBullet"/>
-        <w:spacing w:after="0"/>
-      </w:pPr>
-      <w:r>
-        <w:rPr>
-          <w:sz w:val="19"/>
-        </w:rPr>
-        <w:t>• Implemented product surfaces spanning feed, search, market, portfolio, ratings, profiles, compare, sets, charity, support, wrapped, onboarding, settings, admin tooling, feature flags, telemetry, and SEO infrastructure.</w:t>
-      </w:r>
-    </w:p>
-    <w:p>
-      <w:pPr>
-        <w:pStyle w:val="CVSubhead"/>
-        <w:spacing w:after="0"/>
-      </w:pPr>
-      <w:r>
-        <w:rPr>
-          <w:b/>
-          <w:sz w:val="21"/>
-        </w:rPr>
-        <w:t>Court Vision</w:t>
-      </w:r>
-      <w:r>
-        <w:rPr>
-          <w:color w:val="787878"/>
-        </w:rPr>
-        <w:t xml:space="preserve">  |  </w:t>
-      </w:r>
-      <w:r>
-        <w:rPr>
-          <w:b/>
-          <w:sz w:val="21"/>
-        </w:rPr>
-        <w:t>Basketball IQ Training Platform</w:t>
-      </w:r>
-    </w:p>
-    <w:p>
-      <w:pPr>
-        <w:pStyle w:val="CVSmall"/>
-        <w:spacing w:after="20"/>
-      </w:pPr>
-      <w:r>
-        <w:rPr>
-          <w:i/>
-          <w:color w:val="5F5F5F"/>
-        </w:rPr>
-        <w:t>Current</w:t>
-      </w:r>
-    </w:p>
-    <w:p>
-      <w:pPr>
-        <w:pStyle w:val="CVBullet"/>
-        <w:spacing w:after="0"/>
-      </w:pPr>
-      <w:r>
-        <w:rPr>
-          <w:sz w:val="19"/>
-        </w:rPr>
-        <w:t>• Built a free, web-first basketball IQ training platform designed to help users see the game from player, coach, and GM perspectives.</w:t>
-      </w:r>
-    </w:p>
-    <w:p>
-      <w:pPr>
-        <w:pStyle w:val="CVBullet"/>
-        <w:spacing w:after="0"/>
-      </w:pPr>
-      <w:r>
-        <w:rPr>
-          <w:sz w:val="19"/>
-        </w:rPr>
-        <w:t>• Developed the system as a multi-package application with a React 18 frontend, Node.js / Express backend, Socket.io real-time layer, and shared TypeScript schemas.</w:t>
-      </w:r>
-    </w:p>
-    <w:p>
-      <w:pPr>
-        <w:pStyle w:val="CVBullet"/>
-        <w:spacing w:after="0"/>
-      </w:pPr>
-      <w:r>
-        <w:rPr>
-          <w:sz w:val="19"/>
-        </w:rPr>
-        <w:t>• Implemented a validated foundation including real-time multiplayer draft simulation, a Monte Carlo simulation engine using 30 player features and 13 archetypes, regular-season and playoff simulation, snake-draft logic, and commissioner controls.</w:t>
-      </w:r>
-    </w:p>
-    <w:p>
-      <w:pPr>
-        <w:pStyle w:val="CVSubhead"/>
-        <w:spacing w:after="0"/>
-      </w:pPr>
-      <w:r>
-        <w:rPr>
-          <w:b/>
-          <w:sz w:val="21"/>
-        </w:rPr>
-        <w:t>Terrace</w:t>
-      </w:r>
-      <w:r>
-        <w:rPr>
-          <w:color w:val="787878"/>
-        </w:rPr>
-        <w:t xml:space="preserve">  |  </w:t>
-      </w:r>
-      <w:r>
-        <w:rPr>
-          <w:b/>
-          <w:sz w:val="21"/>
-        </w:rPr>
-        <w:t>Spec-Driven AI Development Framework</w:t>
-      </w:r>
-    </w:p>
-    <w:p>
-      <w:pPr>
-        <w:pStyle w:val="CVSmall"/>
-        <w:spacing w:after="20"/>
-      </w:pPr>
-      <w:r>
-        <w:rPr>
-          <w:i/>
-          <w:color w:val="5F5F5F"/>
-        </w:rPr>
-        <w:t>Current</w:t>
-      </w:r>
-    </w:p>
-    <w:p>
-      <w:pPr>
-        <w:pStyle w:val="CVBullet"/>
-        <w:spacing w:after="0"/>
-      </w:pPr>
-      <w:r>
-        <w:rPr>
-          <w:sz w:val="19"/>
-        </w:rPr>
-        <w:t>• Built a spec-driven, test-governed development framework for AI-assisted software projects.</w:t>
-      </w:r>
-    </w:p>
-    <w:p>
-      <w:pPr>
-        <w:pStyle w:val="CVBullet"/>
-        <w:spacing w:after="0"/>
-      </w:pPr>
-      <w:r>
-        <w:rPr>
-          <w:sz w:val="19"/>
-        </w:rPr>
-        <w:t>• Focused the framework on structured requirements, planning, and execution workflows for more reliable development iteration.</w:t>
-      </w:r>
-    </w:p>
-    <w:p>
-      <w:pPr>
-        <w:pStyle w:val="CVSubhead"/>
-        <w:spacing w:after="0"/>
-      </w:pPr>
-      <w:r>
-        <w:rPr>
-          <w:b/>
-          <w:sz w:val="21"/>
-        </w:rPr>
-        <w:t>AIOS</w:t>
-      </w:r>
-      <w:r>
-        <w:rPr>
-          <w:color w:val="787878"/>
-        </w:rPr>
-        <w:t xml:space="preserve">  |  </w:t>
-      </w:r>
-      <w:r>
-        <w:rPr>
-          <w:b/>
-          <w:sz w:val="21"/>
-        </w:rPr>
-        <w:t>Personal AI Operating System</w:t>
-      </w:r>
-    </w:p>
-    <w:p>
-      <w:pPr>
-        <w:pStyle w:val="CVSmall"/>
-        <w:spacing w:after="20"/>
-      </w:pPr>
-      <w:r>
-        <w:rPr>
-          <w:i/>
-          <w:color w:val="5F5F5F"/>
-        </w:rPr>
-        <w:t>Current</w:t>
-      </w:r>
-    </w:p>
-    <w:p>
-      <w:pPr>
-        <w:pStyle w:val="CVBullet"/>
-        <w:spacing w:after="0"/>
-      </w:pPr>
-      <w:r>
-        <w:rPr>
-          <w:sz w:val="19"/>
-        </w:rPr>
-        <w:t>• Built a personal AI operating system centered on session hooks, pattern extraction, knowledge-layer design, and second-brain infrastructure for Claude Code workflows.</w:t>
-      </w:r>
-    </w:p>
-    <w:p>
-      <w:pPr>
-        <w:pStyle w:val="CVBullet"/>
-        <w:spacing w:after="0"/>
-      </w:pPr>
-      <w:r>
-        <w:rPr>
-          <w:sz w:val="19"/>
-        </w:rPr>
-        <w:t>• Developed the system as a foundation for structured personal workflow orchestration and reusable knowledge capture.</w:t>
-      </w:r>
-    </w:p>
-    <w:p>
-      <w:pPr>
-        <w:pStyle w:val="CVSubhead"/>
-        <w:spacing w:after="0"/>
-      </w:pPr>
-      <w:r>
-        <w:rPr>
-          <w:b/>
-          <w:sz w:val="21"/>
-        </w:rPr>
-        <w:t>Pre-CR Suite</w:t>
-      </w:r>
-      <w:r>
-        <w:rPr>
-          <w:color w:val="787878"/>
-        </w:rPr>
-        <w:t xml:space="preserve">  |  </w:t>
-      </w:r>
-      <w:r>
-        <w:rPr>
-          <w:b/>
-          <w:sz w:val="21"/>
-        </w:rPr>
-        <w:t>Cross-Editor Code Review Preparation Suite</w:t>
-      </w:r>
-    </w:p>
-    <w:p>
-      <w:pPr>
-        <w:pStyle w:val="CVSmall"/>
-        <w:spacing w:after="20"/>
-      </w:pPr>
-      <w:r>
-        <w:rPr>
-          <w:i/>
-          <w:color w:val="5F5F5F"/>
-        </w:rPr>
-        <w:t>Current</w:t>
-      </w:r>
-    </w:p>
-    <w:p>
-      <w:pPr>
-        <w:pStyle w:val="CVBullet"/>
-        <w:spacing w:after="0"/>
-      </w:pPr>
-      <w:r>
-        <w:rPr>
-          <w:sz w:val="19"/>
-        </w:rPr>
-        <w:t>• Building a cross-editor pre-review tooling suite that validates test coverage on changed lines, runs smart pre-review checks, and generates documentation before a pull request is opened.</w:t>
-      </w:r>
-    </w:p>
-    <w:p>
-      <w:pPr>
-        <w:pStyle w:val="CVBullet"/>
-        <w:spacing w:after="0"/>
-      </w:pPr>
-      <w:r>
-        <w:rPr>
-          <w:sz w:val="19"/>
-        </w:rPr>
-        <w:t>• Designed to work across VS Code, Neovim, and other LSP-compatible editors through a custom language-server-based workflow.</w:t>
-      </w:r>
-    </w:p>
-    <w:p>
-      <w:pPr>
-        <w:pStyle w:val="CVSection"/>
-        <w:pBdr>
-          <w:bottom w:val="single" w:sz="8" w:space="1" w:color="D9E2F3"/>
-        </w:pBdr>
-      </w:pPr>
-      <w:r>
-        <w:t>EDUCATION</w:t>
-      </w:r>
-    </w:p>
-    <w:p>
-      <w:pPr>
-        <w:pStyle w:val="CVSubhead"/>
-      </w:pPr>
-      <w:r>
-        <w:rPr>
-          <w:b/>
-          <w:sz w:val="21"/>
-        </w:rPr>
-        <w:t>Case Western Reserve University</w:t>
-      </w:r>
-    </w:p>
-    <w:p>
-      <w:pPr>
-        <w:pStyle w:val="CVSmall"/>
-      </w:pPr>
-      <w:r>
-        <w:rPr>
-          <w:i/>
-        </w:rPr>
-        <w:t>B.A. in Computer Science | Minors: Artificial Intelligence, Applied Data Science, Statistics | Expected May 2026</w:t>
-      </w:r>
-    </w:p>
-    <w:p>
-      <w:pPr>
-        <w:pStyle w:val="CVSection"/>
-        <w:pBdr>
-          <w:bottom w:val="single" w:sz="8" w:space="1" w:color="D9E2F3"/>
-        </w:pBdr>
-      </w:pPr>
-      <w:r>
-        <w:t>LEADERSHIP &amp; CAMPUS INVOLVEMENT</w:t>
-      </w:r>
-    </w:p>
-    <w:p>
-      <w:pPr>
-        <w:pStyle w:val="CVSubhead"/>
-        <w:spacing w:after="0"/>
-      </w:pPr>
-      <w:r>
-        <w:rPr>
-          <w:b/>
-          <w:sz w:val="21"/>
-        </w:rPr>
-        <w:t>Vice President</w:t>
-      </w:r>
-      <w:r>
-        <w:rPr>
-          <w:color w:val="787878"/>
-        </w:rPr>
-        <w:t xml:space="preserve">  |  </w:t>
-      </w:r>
-      <w:r>
-        <w:rPr>
-          <w:b/>
-          <w:sz w:val="21"/>
-        </w:rPr>
-        <w:t>App Developers and Innovators Club (AIDC)</w:t>
-      </w:r>
-    </w:p>
-    <w:p>
-      <w:pPr>
-        <w:pStyle w:val="CVSmall"/>
-        <w:spacing w:after="20"/>
-      </w:pPr>
-      <w:r>
-        <w:rPr>
-          <w:i/>
-          <w:color w:val="5F5F5F"/>
-        </w:rPr>
-        <w:t>2022 – 2026</w:t>
-      </w:r>
-    </w:p>
-    <w:p>
-      <w:pPr>
-        <w:pStyle w:val="CVBullet"/>
-        <w:spacing w:after="0"/>
-      </w:pPr>
-      <w:r>
-        <w:rPr>
-          <w:sz w:val="19"/>
-        </w:rPr>
-        <w:t>• Help lead technical development opportunities for student developers.</w:t>
-      </w:r>
-    </w:p>
-    <w:p>
-      <w:pPr>
-        <w:pStyle w:val="CVBullet"/>
-        <w:spacing w:after="0"/>
-      </w:pPr>
-      <w:r>
-        <w:rPr>
-          <w:sz w:val="19"/>
-        </w:rPr>
-        <w:t>• Support coding, collaboration, and innovation-focused programming on campus.</w:t>
-      </w:r>
-    </w:p>
-    <w:p>
-      <w:pPr>
-        <w:pStyle w:val="CVSubhead"/>
-        <w:spacing w:after="0"/>
-      </w:pPr>
-      <w:r>
-        <w:rPr>
-          <w:b/>
-          <w:sz w:val="21"/>
-        </w:rPr>
-        <w:t>President &amp; Founder</w:t>
-      </w:r>
-      <w:r>
-        <w:rPr>
-          <w:color w:val="787878"/>
-        </w:rPr>
-        <w:t xml:space="preserve">  |  </w:t>
-      </w:r>
-      <w:r>
-        <w:rPr>
-          <w:b/>
-          <w:sz w:val="21"/>
-        </w:rPr>
-        <w:t>CWRU Flea Market</w:t>
-      </w:r>
-    </w:p>
-    <w:p>
-      <w:pPr>
-        <w:pStyle w:val="CVSmall"/>
-        <w:spacing w:after="20"/>
-      </w:pPr>
-      <w:r>
-        <w:rPr>
-          <w:i/>
-          <w:color w:val="5F5F5F"/>
-        </w:rPr>
-        <w:t>2022 – 2026</w:t>
-      </w:r>
-    </w:p>
-    <w:p>
-      <w:pPr>
-        <w:pStyle w:val="CVBullet"/>
-        <w:spacing w:after="0"/>
-      </w:pPr>
-      <w:r>
-        <w:rPr>
-          <w:sz w:val="19"/>
-        </w:rPr>
-        <w:t>• Built a large recurring campus entrepreneurship event.</w:t>
-      </w:r>
-    </w:p>
-    <w:p>
-      <w:pPr>
-        <w:pStyle w:val="CVBullet"/>
-        <w:spacing w:after="0"/>
-      </w:pPr>
-      <w:r>
-        <w:rPr>
-          <w:sz w:val="19"/>
-        </w:rPr>
-        <w:t>• Created a vendor ecosystem supporting students and local businesses, with events averaging 600+ attendees and roughly $7K in revenue per event.</w:t>
-      </w:r>
-    </w:p>
-    <w:p>
-      <w:pPr>
-        <w:pStyle w:val="CVSubhead"/>
-        <w:spacing w:after="0"/>
-      </w:pPr>
-      <w:r>
-        <w:rPr>
-          <w:b/>
-          <w:sz w:val="21"/>
-        </w:rPr>
-        <w:t>Member</w:t>
-      </w:r>
-      <w:r>
-        <w:rPr>
-          <w:color w:val="787878"/>
-        </w:rPr>
-        <w:t xml:space="preserve">  |  </w:t>
-      </w:r>
-      <w:r>
-        <w:rPr>
-          <w:b/>
-          <w:sz w:val="21"/>
-        </w:rPr>
-        <w:t>Nigerian Student Association</w:t>
-      </w:r>
-    </w:p>
-    <w:p>
-      <w:pPr>
-        <w:pStyle w:val="CVSmall"/>
-        <w:spacing w:after="20"/>
-      </w:pPr>
-      <w:r>
-        <w:rPr>
-          <w:i/>
-          <w:color w:val="5F5F5F"/>
-        </w:rPr>
-        <w:t>2023 – Present</w:t>
-      </w:r>
-    </w:p>
-    <w:p>
-      <w:pPr>
-        <w:pStyle w:val="CVBullet"/>
-        <w:spacing w:after="0"/>
-      </w:pPr>
-      <w:r>
-        <w:rPr>
-          <w:sz w:val="19"/>
-        </w:rPr>
-        <w:t>• Support diversity and community-building efforts on campus.</w:t>
-      </w:r>
-    </w:p>
-    <w:p>
-      <w:pPr>
-        <w:pStyle w:val="CVSubhead"/>
-        <w:spacing w:after="0"/>
-      </w:pPr>
-      <w:r>
-        <w:rPr>
-          <w:b/>
-          <w:sz w:val="21"/>
-        </w:rPr>
-        <w:t>Member</w:t>
-      </w:r>
-      <w:r>
-        <w:rPr>
-          <w:color w:val="787878"/>
-        </w:rPr>
-        <w:t xml:space="preserve">  |  </w:t>
-      </w:r>
-      <w:r>
-        <w:rPr>
-          <w:b/>
-          <w:sz w:val="21"/>
-        </w:rPr>
-        <w:t>Case Western Sports Analytics Association</w:t>
-      </w:r>
-    </w:p>
-    <w:p>
-      <w:pPr>
-        <w:pStyle w:val="CVSmall"/>
-        <w:spacing w:after="20"/>
-      </w:pPr>
-      <w:r>
-        <w:rPr>
-          <w:i/>
-          <w:color w:val="5F5F5F"/>
-        </w:rPr>
-        <w:t>2022 – Present</w:t>
-      </w:r>
-    </w:p>
-    <w:p>
-      <w:pPr>
-        <w:pStyle w:val="CVBullet"/>
-        <w:spacing w:after="0"/>
-      </w:pPr>
-      <w:r>
-        <w:rPr>
-          <w:sz w:val="19"/>
-        </w:rPr>
-        <w:t>• Develop analytics skills through collaborative learning and project participation.</w:t>
-      </w:r>
-    </w:p>
-    <w:p>
-      <w:pPr>
-        <w:pStyle w:val="CVSubhead"/>
-        <w:spacing w:after="0"/>
-      </w:pPr>
-      <w:r>
-        <w:rPr>
-          <w:b/>
-          <w:sz w:val="21"/>
-        </w:rPr>
-        <w:t>Member</w:t>
-      </w:r>
-      <w:r>
-        <w:rPr>
-          <w:color w:val="787878"/>
-        </w:rPr>
-        <w:t xml:space="preserve">  |  </w:t>
-      </w:r>
-      <w:r>
-        <w:rPr>
-          <w:b/>
-          <w:sz w:val="21"/>
-        </w:rPr>
-        <w:t>Black Employee Network, Amazon</w:t>
-      </w:r>
-    </w:p>
-    <w:p>
-      <w:pPr>
-        <w:pStyle w:val="CVSmall"/>
-        <w:spacing w:after="20"/>
-      </w:pPr>
-      <w:r>
-        <w:rPr>
-          <w:i/>
-          <w:color w:val="5F5F5F"/>
-        </w:rPr>
-        <w:t>2023 – Present</w:t>
-      </w:r>
-    </w:p>
-    <w:p>
-      <w:pPr>
-        <w:pStyle w:val="CVBullet"/>
-        <w:spacing w:after="0"/>
-      </w:pPr>
-      <w:r>
-        <w:rPr>
-          <w:sz w:val="19"/>
-        </w:rPr>
-        <w:t>• Participate in Amazon’s affinity group for Black employees.</w:t>
-      </w:r>
-    </w:p>
-    <w:p>
-      <w:pPr>
-        <w:pStyle w:val="CVSection"/>
-        <w:pBdr>
-          <w:bottom w:val="single" w:sz="8" w:space="1" w:color="D9E2F3"/>
-        </w:pBdr>
-      </w:pPr>
-      <w:r>
-        <w:t>ADDITIONAL PROGRAMS &amp; ACTIVITIES</w:t>
-      </w:r>
-    </w:p>
-    <w:tbl>
-      <w:tblPr>
-        <w:tblW w:type="auto" w:w="0"/>
-        <w:jc w:val="center"/>
-        <w:tblLayout w:type="fixed"/>
-        <w:tblLook w:firstColumn="1" w:firstRow="1" w:lastColumn="0" w:lastRow="0" w:noHBand="0" w:noVBand="1" w:val="04A0"/>
-      </w:tblPr>
-      <w:tblGrid>
-        <w:gridCol w:w="5184"/>
-        <w:gridCol w:w="5184"/>
-      </w:tblGrid>
-      <w:tr>
-        <w:tc>
-          <w:tcPr>
-            <w:tcW w:type="dxa" w:w="3168"/>
-            <w:tcMar>
-              <w:top w:w="65" w:type="dxa"/>
-              <w:start w:w="90" w:type="dxa"/>
-              <w:bottom w:w="65" w:type="dxa"/>
-              <w:end w:w="90" w:type="dxa"/>
-            </w:tcMar>
-            <w:shd w:fill="F7FAFD"/>
-            <w:tcBorders>
-              <w:left w:sz="4" w:val="single" w:color="E4EAF4"/>
-              <w:top w:sz="4" w:val="single" w:color="E4EAF4"/>
-              <w:right w:sz="4" w:val="single" w:color="E4EAF4"/>
-              <w:bottom w:sz="4" w:val="single" w:color="E4EAF4"/>
-            </w:tcBorders>
-          </w:tcPr>
-          <w:p>
-            <w:r>
-              <w:rPr>
-                <w:b/>
-                <w:sz w:val="18"/>
-              </w:rPr>
-              <w:t>Amazon Quality Assurance Beta Tester</w:t>
-            </w:r>
-          </w:p>
-        </w:tc>
-        <w:tc>
-          <w:tcPr>
-            <w:tcW w:type="dxa" w:w="7200"/>
-            <w:tcMar>
-              <w:top w:w="65" w:type="dxa"/>
-              <w:start w:w="90" w:type="dxa"/>
-              <w:bottom w:w="65" w:type="dxa"/>
-              <w:end w:w="90" w:type="dxa"/>
-            </w:tcMar>
-            <w:tcBorders>
-              <w:left w:sz="4" w:val="single" w:color="E4EAF4"/>
-              <w:top w:sz="4" w:val="single" w:color="E4EAF4"/>
-              <w:right w:sz="4" w:val="single" w:color="E4EAF4"/>
-              <w:bottom w:sz="4" w:val="single" w:color="E4EAF4"/>
-            </w:tcBorders>
-          </w:tcPr>
-          <w:p>
-            <w:r>
-              <w:rPr>
-                <w:sz w:val="18"/>
-              </w:rPr>
-              <w:t>Tested pre-release feature functionality across multiple Amazon divisions (2023 – Present).</w:t>
-            </w:r>
-          </w:p>
-        </w:tc>
-      </w:tr>
-      <w:tr>
-        <w:tc>
-          <w:tcPr>
-            <w:tcW w:type="dxa" w:w="3168"/>
-            <w:tcMar>
-              <w:top w:w="65" w:type="dxa"/>
-              <w:start w:w="90" w:type="dxa"/>
-              <w:bottom w:w="65" w:type="dxa"/>
-              <w:end w:w="90" w:type="dxa"/>
-            </w:tcMar>
-            <w:shd w:fill="F7FAFD"/>
-            <w:tcBorders>
-              <w:left w:sz="4" w:val="single" w:color="E4EAF4"/>
-              <w:top w:sz="4" w:val="single" w:color="E4EAF4"/>
-              <w:right w:sz="4" w:val="single" w:color="E4EAF4"/>
-              <w:bottom w:sz="4" w:val="single" w:color="E4EAF4"/>
-            </w:tcBorders>
-          </w:tcPr>
-          <w:p>
-            <w:r>
-              <w:rPr>
-                <w:b/>
-                <w:sz w:val="18"/>
-              </w:rPr>
-              <w:t>Machine Learning University, Amazon</w:t>
-            </w:r>
-          </w:p>
-        </w:tc>
-        <w:tc>
-          <w:tcPr>
-            <w:tcW w:type="dxa" w:w="7200"/>
-            <w:tcMar>
-              <w:top w:w="65" w:type="dxa"/>
-              <w:start w:w="90" w:type="dxa"/>
-              <w:bottom w:w="65" w:type="dxa"/>
-              <w:end w:w="90" w:type="dxa"/>
-            </w:tcMar>
-            <w:tcBorders>
-              <w:left w:sz="4" w:val="single" w:color="E4EAF4"/>
-              <w:top w:sz="4" w:val="single" w:color="E4EAF4"/>
-              <w:right w:sz="4" w:val="single" w:color="E4EAF4"/>
-              <w:bottom w:sz="4" w:val="single" w:color="E4EAF4"/>
-            </w:tcBorders>
-          </w:tcPr>
-          <w:p>
-            <w:r>
-              <w:rPr>
-                <w:sz w:val="18"/>
-              </w:rPr>
-              <w:t>Gained exposure to current machine learning implementations in high-end workplace environments (June 2023).</w:t>
-            </w:r>
-          </w:p>
-        </w:tc>
-      </w:tr>
-      <w:tr>
-        <w:tc>
-          <w:tcPr>
-            <w:tcW w:type="dxa" w:w="3168"/>
-            <w:tcMar>
-              <w:top w:w="65" w:type="dxa"/>
-              <w:start w:w="90" w:type="dxa"/>
-              <w:bottom w:w="65" w:type="dxa"/>
-              <w:end w:w="90" w:type="dxa"/>
-            </w:tcMar>
-            <w:shd w:fill="F7FAFD"/>
-            <w:tcBorders>
-              <w:left w:sz="4" w:val="single" w:color="E4EAF4"/>
-              <w:top w:sz="4" w:val="single" w:color="E4EAF4"/>
-              <w:right w:sz="4" w:val="single" w:color="E4EAF4"/>
-              <w:bottom w:sz="4" w:val="single" w:color="E4EAF4"/>
-            </w:tcBorders>
-          </w:tcPr>
-          <w:p>
-            <w:r>
-              <w:rPr>
-                <w:b/>
-                <w:sz w:val="18"/>
-              </w:rPr>
-              <w:t>Story Pirates, Amazon</w:t>
-            </w:r>
-          </w:p>
-        </w:tc>
-        <w:tc>
-          <w:tcPr>
-            <w:tcW w:type="dxa" w:w="7200"/>
-            <w:tcMar>
-              <w:top w:w="65" w:type="dxa"/>
-              <w:start w:w="90" w:type="dxa"/>
-              <w:bottom w:w="65" w:type="dxa"/>
-              <w:end w:w="90" w:type="dxa"/>
-            </w:tcMar>
-            <w:tcBorders>
-              <w:left w:sz="4" w:val="single" w:color="E4EAF4"/>
-              <w:top w:sz="4" w:val="single" w:color="E4EAF4"/>
-              <w:right w:sz="4" w:val="single" w:color="E4EAF4"/>
-              <w:bottom w:sz="4" w:val="single" w:color="E4EAF4"/>
-            </w:tcBorders>
-          </w:tcPr>
-          <w:p>
-            <w:r>
-              <w:rPr>
-                <w:sz w:val="18"/>
-              </w:rPr>
-              <w:t>Mentored and encouraged young writers through a writing-focused outreach initiative (June 2023).</w:t>
-            </w:r>
-          </w:p>
-        </w:tc>
-      </w:tr>
-      <w:tr>
-        <w:tc>
-          <w:tcPr>
-            <w:tcW w:type="dxa" w:w="3168"/>
-            <w:tcMar>
-              <w:top w:w="65" w:type="dxa"/>
-              <w:start w:w="90" w:type="dxa"/>
-              <w:bottom w:w="65" w:type="dxa"/>
-              <w:end w:w="90" w:type="dxa"/>
-            </w:tcMar>
-            <w:shd w:fill="F7FAFD"/>
-            <w:tcBorders>
-              <w:left w:sz="4" w:val="single" w:color="E4EAF4"/>
-              <w:top w:sz="4" w:val="single" w:color="E4EAF4"/>
-              <w:right w:sz="4" w:val="single" w:color="E4EAF4"/>
-              <w:bottom w:sz="4" w:val="single" w:color="E4EAF4"/>
-            </w:tcBorders>
-          </w:tcPr>
-          <w:p>
-            <w:r>
-              <w:rPr>
-                <w:b/>
-                <w:sz w:val="18"/>
-              </w:rPr>
-              <w:t>Buffalo Science Museum Science Fair Judge</w:t>
-            </w:r>
-          </w:p>
-        </w:tc>
-        <w:tc>
-          <w:tcPr>
-            <w:tcW w:type="dxa" w:w="7200"/>
-            <w:tcMar>
-              <w:top w:w="65" w:type="dxa"/>
-              <w:start w:w="90" w:type="dxa"/>
-              <w:bottom w:w="65" w:type="dxa"/>
-              <w:end w:w="90" w:type="dxa"/>
-            </w:tcMar>
-            <w:tcBorders>
-              <w:left w:sz="4" w:val="single" w:color="E4EAF4"/>
-              <w:top w:sz="4" w:val="single" w:color="E4EAF4"/>
-              <w:right w:sz="4" w:val="single" w:color="E4EAF4"/>
-              <w:bottom w:sz="4" w:val="single" w:color="E4EAF4"/>
-            </w:tcBorders>
-          </w:tcPr>
-          <w:p>
-            <w:r>
-              <w:rPr>
-                <w:sz w:val="18"/>
-              </w:rPr>
-              <w:t>Interviewed and evaluated student science fair projects (May 2022).</w:t>
-            </w:r>
-          </w:p>
-        </w:tc>
-      </w:tr>
-      <w:tr>
-        <w:tc>
-          <w:tcPr>
-            <w:tcW w:type="dxa" w:w="3168"/>
-            <w:tcMar>
-              <w:top w:w="65" w:type="dxa"/>
-              <w:start w:w="90" w:type="dxa"/>
-              <w:bottom w:w="65" w:type="dxa"/>
-              <w:end w:w="90" w:type="dxa"/>
-            </w:tcMar>
-            <w:shd w:fill="F7FAFD"/>
-            <w:tcBorders>
-              <w:left w:sz="4" w:val="single" w:color="E4EAF4"/>
-              <w:top w:sz="4" w:val="single" w:color="E4EAF4"/>
-              <w:right w:sz="4" w:val="single" w:color="E4EAF4"/>
-              <w:bottom w:sz="4" w:val="single" w:color="E4EAF4"/>
-            </w:tcBorders>
-          </w:tcPr>
-          <w:p>
-            <w:r>
-              <w:rPr>
-                <w:b/>
-                <w:sz w:val="18"/>
-              </w:rPr>
-              <w:t>Service Learning Initiative</w:t>
-            </w:r>
-          </w:p>
-        </w:tc>
-        <w:tc>
-          <w:tcPr>
-            <w:tcW w:type="dxa" w:w="7200"/>
-            <w:tcMar>
-              <w:top w:w="65" w:type="dxa"/>
-              <w:start w:w="90" w:type="dxa"/>
-              <w:bottom w:w="65" w:type="dxa"/>
-              <w:end w:w="90" w:type="dxa"/>
-            </w:tcMar>
-            <w:tcBorders>
-              <w:left w:sz="4" w:val="single" w:color="E4EAF4"/>
-              <w:top w:sz="4" w:val="single" w:color="E4EAF4"/>
-              <w:right w:sz="4" w:val="single" w:color="E4EAF4"/>
-              <w:bottom w:sz="4" w:val="single" w:color="E4EAF4"/>
-            </w:tcBorders>
-          </w:tcPr>
-          <w:p>
-            <w:r>
-              <w:rPr>
-                <w:sz w:val="18"/>
-              </w:rPr>
-              <w:t>Defined benchmarks and models for predicting performance and researched proof-of-principle algorithmic solutions (May 2022 – June 2022).</w:t>
-            </w:r>
-          </w:p>
-        </w:tc>
-      </w:tr>
-      <w:tr>
-        <w:tc>
-          <w:tcPr>
-            <w:tcW w:type="dxa" w:w="3168"/>
-            <w:tcMar>
-              <w:top w:w="65" w:type="dxa"/>
-              <w:start w:w="90" w:type="dxa"/>
-              <w:bottom w:w="65" w:type="dxa"/>
-              <w:end w:w="90" w:type="dxa"/>
-            </w:tcMar>
-            <w:shd w:fill="F7FAFD"/>
-            <w:tcBorders>
-              <w:left w:sz="4" w:val="single" w:color="E4EAF4"/>
-              <w:top w:sz="4" w:val="single" w:color="E4EAF4"/>
-              <w:right w:sz="4" w:val="single" w:color="E4EAF4"/>
-              <w:bottom w:sz="4" w:val="single" w:color="E4EAF4"/>
-            </w:tcBorders>
-          </w:tcPr>
-          <w:p>
-            <w:r>
-              <w:rPr>
-                <w:b/>
-                <w:sz w:val="18"/>
-              </w:rPr>
-              <w:t>Medical STEP, Jacobs School of Medicine and Biomedical Sciences, University at Buffalo</w:t>
-            </w:r>
-          </w:p>
-        </w:tc>
-        <w:tc>
-          <w:tcPr>
-            <w:tcW w:type="dxa" w:w="7200"/>
-            <w:tcMar>
-              <w:top w:w="65" w:type="dxa"/>
-              <w:start w:w="90" w:type="dxa"/>
-              <w:bottom w:w="65" w:type="dxa"/>
-              <w:end w:w="90" w:type="dxa"/>
-            </w:tcMar>
-            <w:tcBorders>
-              <w:left w:sz="4" w:val="single" w:color="E4EAF4"/>
-              <w:top w:sz="4" w:val="single" w:color="E4EAF4"/>
-              <w:right w:sz="4" w:val="single" w:color="E4EAF4"/>
-              <w:bottom w:sz="4" w:val="single" w:color="E4EAF4"/>
-            </w:tcBorders>
-          </w:tcPr>
-          <w:p>
-            <w:r>
-              <w:rPr>
-                <w:sz w:val="18"/>
-              </w:rPr>
-              <w:t>Completed college preparatory STEM coursework with recurring sessions in biochemistry, biophysics, math, and programming (2019 – 2022).</w:t>
-            </w:r>
-          </w:p>
-        </w:tc>
-      </w:tr>
-      <w:tr>
-        <w:tc>
-          <w:tcPr>
-            <w:tcW w:type="dxa" w:w="3168"/>
-            <w:tcMar>
-              <w:top w:w="65" w:type="dxa"/>
-              <w:start w:w="90" w:type="dxa"/>
-              <w:bottom w:w="65" w:type="dxa"/>
-              <w:end w:w="90" w:type="dxa"/>
-            </w:tcMar>
-            <w:shd w:fill="F7FAFD"/>
-            <w:tcBorders>
-              <w:left w:sz="4" w:val="single" w:color="E4EAF4"/>
-              <w:top w:sz="4" w:val="single" w:color="E4EAF4"/>
-              <w:right w:sz="4" w:val="single" w:color="E4EAF4"/>
-              <w:bottom w:sz="4" w:val="single" w:color="E4EAF4"/>
-            </w:tcBorders>
-          </w:tcPr>
-          <w:p>
-            <w:r>
-              <w:rPr>
-                <w:b/>
-                <w:sz w:val="18"/>
-              </w:rPr>
-              <w:t>Vanderbilt Mentorship Immersion</w:t>
-            </w:r>
-          </w:p>
-        </w:tc>
-        <w:tc>
-          <w:tcPr>
-            <w:tcW w:type="dxa" w:w="7200"/>
-            <w:tcMar>
-              <w:top w:w="65" w:type="dxa"/>
-              <w:start w:w="90" w:type="dxa"/>
-              <w:bottom w:w="65" w:type="dxa"/>
-              <w:end w:w="90" w:type="dxa"/>
-            </w:tcMar>
-            <w:tcBorders>
-              <w:left w:sz="4" w:val="single" w:color="E4EAF4"/>
-              <w:top w:sz="4" w:val="single" w:color="E4EAF4"/>
-              <w:right w:sz="4" w:val="single" w:color="E4EAF4"/>
-              <w:bottom w:sz="4" w:val="single" w:color="E4EAF4"/>
-            </w:tcBorders>
-          </w:tcPr>
-          <w:p>
-            <w:r>
-              <w:rPr>
-                <w:sz w:val="18"/>
-              </w:rPr>
-              <w:t>Biomedical Engineering: An Engineering Approach to Cancer Vaccine Design (2021 – 2022).</w:t>
-            </w:r>
-          </w:p>
-        </w:tc>
-      </w:tr>
-      <w:tr>
-        <w:tc>
-          <w:tcPr>
-            <w:tcW w:type="dxa" w:w="3168"/>
-            <w:tcMar>
-              <w:top w:w="65" w:type="dxa"/>
-              <w:start w:w="90" w:type="dxa"/>
-              <w:bottom w:w="65" w:type="dxa"/>
-              <w:end w:w="90" w:type="dxa"/>
-            </w:tcMar>
-            <w:shd w:fill="F7FAFD"/>
-            <w:tcBorders>
-              <w:left w:sz="4" w:val="single" w:color="E4EAF4"/>
-              <w:top w:sz="4" w:val="single" w:color="E4EAF4"/>
-              <w:right w:sz="4" w:val="single" w:color="E4EAF4"/>
-              <w:bottom w:sz="4" w:val="single" w:color="E4EAF4"/>
-            </w:tcBorders>
-          </w:tcPr>
-          <w:p>
-            <w:r>
-              <w:rPr>
-                <w:b/>
-                <w:sz w:val="18"/>
-              </w:rPr>
-              <w:t>Duke Continuing Studies</w:t>
-            </w:r>
-          </w:p>
-        </w:tc>
-        <w:tc>
-          <w:tcPr>
-            <w:tcW w:type="dxa" w:w="7200"/>
-            <w:tcMar>
-              <w:top w:w="65" w:type="dxa"/>
-              <w:start w:w="90" w:type="dxa"/>
-              <w:bottom w:w="65" w:type="dxa"/>
-              <w:end w:w="90" w:type="dxa"/>
-            </w:tcMar>
-            <w:tcBorders>
-              <w:left w:sz="4" w:val="single" w:color="E4EAF4"/>
-              <w:top w:sz="4" w:val="single" w:color="E4EAF4"/>
-              <w:right w:sz="4" w:val="single" w:color="E4EAF4"/>
-              <w:bottom w:sz="4" w:val="single" w:color="E4EAF4"/>
-            </w:tcBorders>
-          </w:tcPr>
-          <w:p>
-            <w:r>
-              <w:rPr>
-                <w:sz w:val="18"/>
-              </w:rPr>
-              <w:t>Analyzing Big Data (2021).</w:t>
-            </w:r>
-          </w:p>
-        </w:tc>
-      </w:tr>
-      <w:tr>
-        <w:tc>
-          <w:tcPr>
-            <w:tcW w:type="dxa" w:w="3168"/>
-            <w:tcMar>
-              <w:top w:w="65" w:type="dxa"/>
-              <w:start w:w="90" w:type="dxa"/>
-              <w:bottom w:w="65" w:type="dxa"/>
-              <w:end w:w="90" w:type="dxa"/>
-            </w:tcMar>
-            <w:shd w:fill="F7FAFD"/>
-            <w:tcBorders>
-              <w:left w:sz="4" w:val="single" w:color="E4EAF4"/>
-              <w:top w:sz="4" w:val="single" w:color="E4EAF4"/>
-              <w:right w:sz="4" w:val="single" w:color="E4EAF4"/>
-              <w:bottom w:sz="4" w:val="single" w:color="E4EAF4"/>
-            </w:tcBorders>
-          </w:tcPr>
-          <w:p>
-            <w:r>
-              <w:rPr>
-                <w:b/>
-                <w:sz w:val="18"/>
-              </w:rPr>
-              <w:t>Summer@Brown</w:t>
-            </w:r>
-          </w:p>
-        </w:tc>
-        <w:tc>
-          <w:tcPr>
-            <w:tcW w:type="dxa" w:w="7200"/>
-            <w:tcMar>
-              <w:top w:w="65" w:type="dxa"/>
-              <w:start w:w="90" w:type="dxa"/>
-              <w:bottom w:w="65" w:type="dxa"/>
-              <w:end w:w="90" w:type="dxa"/>
-            </w:tcMar>
-            <w:tcBorders>
-              <w:left w:sz="4" w:val="single" w:color="E4EAF4"/>
-              <w:top w:sz="4" w:val="single" w:color="E4EAF4"/>
-              <w:right w:sz="4" w:val="single" w:color="E4EAF4"/>
-              <w:bottom w:sz="4" w:val="single" w:color="E4EAF4"/>
-            </w:tcBorders>
-          </w:tcPr>
-          <w:p>
-            <w:r>
-              <w:rPr>
-                <w:sz w:val="18"/>
-              </w:rPr>
-              <w:t>Nanotechnology: Mystery Science or Small Materials Doing Big Things? (2021).</w:t>
-            </w:r>
-          </w:p>
-        </w:tc>
-      </w:tr>
-    </w:tbl>
-    <w:p>
-      <w:pPr>
-        <w:pStyle w:val="CVSection"/>
-        <w:pBdr>
-          <w:bottom w:val="single" w:sz="8" w:space="1" w:color="D9E2F3"/>
-        </w:pBdr>
-      </w:pPr>
-      <w:r>
-        <w:t>AWARDS &amp; HONORS</w:t>
-      </w:r>
-    </w:p>
-    <w:p>
-      <w:pPr>
-        <w:pStyle w:val="CVBullet"/>
-      </w:pPr>
-      <w:r>
-        <w:rPr>
-          <w:sz w:val="19"/>
-        </w:rPr>
-        <w:t>• Proclamation declaring “Jakye Amos Day,” City of Buffalo (2023)</w:t>
-      </w:r>
-    </w:p>
-    <w:p>
-      <w:pPr>
-        <w:pStyle w:val="CVBullet"/>
-      </w:pPr>
-      <w:r>
-        <w:rPr>
-          <w:sz w:val="19"/>
-        </w:rPr>
-        <w:t>• Christine Davis Award for Academic Excellence and Community Leadership (2023)</w:t>
-      </w:r>
-    </w:p>
-    <w:p>
-      <w:pPr>
-        <w:pStyle w:val="CVBullet"/>
-      </w:pPr>
-      <w:r>
-        <w:rPr>
-          <w:sz w:val="19"/>
-        </w:rPr>
-        <w:t>• Amazon Future Engineer Scholar (2022)</w:t>
-      </w:r>
-    </w:p>
-    <w:p>
-      <w:pPr>
-        <w:pStyle w:val="CVBullet"/>
-      </w:pPr>
-      <w:r>
-        <w:rPr>
-          <w:sz w:val="19"/>
-        </w:rPr>
-        <w:t>• National African American Recognition Program, College Board (2021)</w:t>
-      </w:r>
-    </w:p>
-    <w:p>
-      <w:pPr>
-        <w:pStyle w:val="CVSection"/>
-        <w:pBdr>
-          <w:bottom w:val="single" w:sz="8" w:space="1" w:color="D9E2F3"/>
-        </w:pBdr>
-      </w:pPr>
-      <w:r>
-        <w:t>CERTIFICATIONS</w:t>
-      </w:r>
-    </w:p>
-    <w:p>
-      <w:pPr>
-        <w:spacing w:after="60"/>
-      </w:pPr>
-      <w:r>
-        <w:t>Great Learning Excel for Intermediate Level, Great Learning Data Analytics Using Excel, Great Learning Front End Development, Great Learning Project Management, MATLAB Onramp</w:t>
-      </w:r>
-    </w:p>
-    <w:p>
-      <w:pPr>
-        <w:pStyle w:val="CVSection"/>
-        <w:pBdr>
-          <w:bottom w:val="single" w:sz="8" w:space="1" w:color="D9E2F3"/>
-        </w:pBdr>
-      </w:pPr>
-      <w:r>
-        <w:t>INTERESTS</w:t>
-      </w:r>
-    </w:p>
-    <w:p>
-      <w:pPr>
-        <w:spacing w:after="0"/>
-      </w:pPr>
-      <w:r>
-        <w:t>Bionics, Data Science, Psychology, Statistics and Analytics, Artificial Intelligence</w:t>
+        <w:t>Proclamation declaring “Jakye Amos Day,” City of Buffalo (2023) | Christine Davis Award (2023) | Amazon Future Engineer Scholar (2022) | National African American Recognition Program (2021)</w:t>
       </w:r>
     </w:p>
     <w:sectPr>
       <w:pgSz w:w="12240" w:h="15840"/>
-      <w:pgMar w:top="792" w:right="936" w:bottom="792" w:left="936" w:header="720" w:footer="720" w:gutter="0"/>
+      <w:pgMar w:top="691" w:right="936" w:bottom="691" w:left="936" w:header="720" w:footer="720" w:gutter="0"/>
       <w:cols w:space="720"/>
       <w:docGrid w:linePitch="360"/>
     </w:sectPr>
@@ -2393,7 +1012,7 @@
     <w:rsid w:val="00FC693F"/>
     <w:rPr>
       <w:rFonts w:ascii="Aptos" w:hAnsi="Aptos" w:eastAsia="Aptos"/>
-      <w:sz w:val="20"/>
+      <w:sz w:val="18"/>
     </w:rPr>
   </w:style>
   <w:style w:type="paragraph" w:styleId="Header">
@@ -14087,7 +12706,7 @@
       <w:rFonts w:ascii="Aptos" w:hAnsi="Aptos"/>
       <w:b/>
       <w:color w:val="2F5597"/>
-      <w:sz w:val="22"/>
+      <w:sz w:val="21"/>
     </w:rPr>
   </w:style>
   <w:style w:type="paragraph" w:customStyle="1" w:styleId="CVSubhead">
@@ -14098,7 +12717,7 @@
     <w:rPr>
       <w:rFonts w:ascii="Aptos" w:hAnsi="Aptos"/>
       <w:b/>
-      <w:sz w:val="21"/>
+      <w:sz w:val="19"/>
     </w:rPr>
   </w:style>
   <w:style w:type="paragraph" w:customStyle="1" w:styleId="CVSmall">
@@ -14114,12 +12733,12 @@
   <w:style w:type="paragraph" w:customStyle="1" w:styleId="CVBullet">
     <w:name w:val="CV Bullet"/>
     <w:pPr>
-      <w:spacing w:before="0" w:after="0" w:line="250" w:lineRule="auto"/>
+      <w:spacing w:before="0" w:after="0" w:line="240" w:lineRule="auto"/>
       <w:ind w:left="259" w:hanging="173"/>
     </w:pPr>
     <w:rPr>
       <w:rFonts w:ascii="Aptos" w:hAnsi="Aptos"/>
-      <w:sz w:val="20"/>
+      <w:sz w:val="17"/>
     </w:rPr>
   </w:style>
 </w:styles>

</xml_diff>

<commit_message>
docs: refresh portfolio career materials
</commit_message>
<xml_diff>
--- a/public/docs/Jakye_Amos_Comprehensive_CV.docx
+++ b/public/docs/Jakye_Amos_Comprehensive_CV.docx
@@ -4,647 +4,2484 @@
   <w:body>
     <w:p>
       <w:pPr>
-        <w:spacing w:after="40"/>
-        <w:jc w:val="center"/>
+        <w:spacing w:before="0" w:after="0" w:line="240" w:lineRule="auto"/>
+        <w:jc w:val="left"/>
       </w:pPr>
       <w:r>
         <w:rPr>
-          <w:rFonts w:ascii="Aptos Display" w:hAnsi="Aptos Display"/>
+          <w:rFonts w:ascii="Calibri" w:hAnsi="Calibri"/>
           <w:b/>
-          <w:color w:val="2F5597"/>
-          <w:sz w:val="40"/>
+          <w:i w:val="0"/>
+          <w:color w:val="182A44"/>
+          <w:sz w:val="48"/>
         </w:rPr>
         <w:t>JAKYE AMOS</w:t>
       </w:r>
     </w:p>
     <w:p>
       <w:pPr>
-        <w:spacing w:after="20"/>
-        <w:jc w:val="center"/>
+        <w:spacing w:before="0" w:after="30" w:line="240" w:lineRule="auto"/>
+        <w:jc w:val="left"/>
       </w:pPr>
       <w:r>
         <w:rPr>
-          <w:rFonts w:ascii="Aptos" w:hAnsi="Aptos"/>
+          <w:rFonts w:ascii="Calibri" w:hAnsi="Calibri"/>
+          <w:b w:val="0"/>
+          <w:i w:val="0"/>
+          <w:color w:val="5C6774"/>
           <w:sz w:val="17"/>
         </w:rPr>
-        <w:t>Jakyejobs@gmail.com  |  716-578-8221  |  Buffalo, NY  |  linkedin.com/in/jakyeamos</w:t>
+        <w:t>Jakyejobs@gmail.com | 716-578-8221 | Buffalo, NY</w:t>
       </w:r>
     </w:p>
     <w:p>
       <w:pPr>
-        <w:spacing w:after="20"/>
-        <w:jc w:val="center"/>
+        <w:spacing w:before="0" w:after="30" w:line="240" w:lineRule="auto"/>
+        <w:jc w:val="left"/>
       </w:pPr>
       <w:r>
         <w:rPr>
-          <w:rFonts w:ascii="Aptos" w:hAnsi="Aptos"/>
+          <w:rFonts w:ascii="Calibri" w:hAnsi="Calibri"/>
+          <w:b w:val="0"/>
+          <w:i w:val="0"/>
+          <w:color w:val="5C6774"/>
           <w:sz w:val="17"/>
         </w:rPr>
-        <w:t>github.com/jakyeamos  |  jakye.netlify.app</w:t>
+        <w:t>linkedin.com/in/jakyeamos | github.com/jakyeamos | jakye.netlify.app | x.com/soundscapeweb | orcid.org/0009-0006-0905-9633</w:t>
       </w:r>
     </w:p>
     <w:p>
       <w:pPr>
-        <w:spacing w:before="160" w:after="140"/>
+        <w:spacing w:before="0" w:after="80" w:line="240" w:lineRule="auto"/>
+        <w:jc w:val="left"/>
         <w:pBdr>
-          <w:bottom w:val="single" w:sz="16" w:space="1" w:color="2F5597"/>
+          <w:bottom w:val="single" w:sz="8" w:space="4" w:color="6E8FB3"/>
         </w:pBdr>
       </w:pPr>
     </w:p>
     <w:p>
       <w:pPr>
-        <w:pStyle w:val="CVSection"/>
+        <w:spacing w:before="140" w:after="80" w:line="240" w:lineRule="auto"/>
+        <w:jc w:val="left"/>
+        <w:pBdr>
+          <w:bottom w:val="single" w:sz="8" w:space="4" w:color="2B4A6F"/>
+        </w:pBdr>
+        <w:keepNext/>
       </w:pPr>
       <w:r>
-        <w:t>Professional Summary</w:t>
+        <w:rPr>
+          <w:rFonts w:ascii="Calibri" w:hAnsi="Calibri"/>
+          <w:b/>
+          <w:i w:val="0"/>
+          <w:color w:val="182A44"/>
+          <w:sz w:val="23"/>
+        </w:rPr>
+        <w:t>PROFESSIONAL SUMMARY</w:t>
       </w:r>
     </w:p>
     <w:p>
       <w:pPr>
-        <w:spacing w:after="80"/>
+        <w:spacing w:before="0" w:after="50" w:line="252" w:lineRule="auto"/>
+        <w:jc w:val="left"/>
       </w:pPr>
       <w:r>
-        <w:t>Software engineer with three Amazon SDE internships and CTO-level client delivery experience, building backend, AI, data, developer-tooling, and full-stack systems. Shipped measurable software for healthcare, operations, and startup clients, including Tenure, a LaunchNY cohort knowledge platform, and published quality infrastructure. Available for full-time work immediately; degree completion expected Spring 2027.</w:t>
+        <w:rPr>
+          <w:rFonts w:ascii="Calibri" w:hAnsi="Calibri"/>
+          <w:b w:val="0"/>
+          <w:i w:val="0"/>
+          <w:color w:val="202328"/>
+          <w:sz w:val="19"/>
+        </w:rPr>
+        <w:t>Software engineer and Computer Science / Data Science student at Case Western Reserve University with three Amazon SDE internships (Ads and FinTech/business-systems teams) and CTO-level client delivery experience across healthcare, operations, and startup engagements. Builds backend systems, applied-AI and LLM workflows, data pipelines, developer tooling, and full-stack products — including seven published PyPI/npm/MCP packages, an MCP and LSP tooling ecosystem, a local-first portfolio command center, and a LaunchNY cohort venture. 4,968 GitHub contributions in the past 12 months across 18 public repositories. Available for full-time work immediately.</w:t>
       </w:r>
     </w:p>
     <w:p>
       <w:pPr>
-        <w:pStyle w:val="CVSection"/>
+        <w:spacing w:before="140" w:after="80" w:line="240" w:lineRule="auto"/>
+        <w:jc w:val="left"/>
+        <w:pBdr>
+          <w:bottom w:val="single" w:sz="8" w:space="4" w:color="2B4A6F"/>
+        </w:pBdr>
+        <w:keepNext/>
       </w:pPr>
       <w:r>
-        <w:t>Technical Skills</w:t>
-      </w:r>
-    </w:p>
-    <w:tbl>
-      <w:tblPr>
-        <w:tblW w:type="auto" w:w="0"/>
-        <w:tblLayout w:type="fixed"/>
-        <w:tblLook w:firstColumn="1" w:firstRow="1" w:lastColumn="0" w:lastRow="0" w:noHBand="0" w:noVBand="1" w:val="04A0"/>
-      </w:tblPr>
-      <w:tblGrid>
-        <w:gridCol w:w="5184"/>
-        <w:gridCol w:w="5184"/>
-      </w:tblGrid>
-      <w:tr>
-        <w:tc>
-          <w:tcPr>
-            <w:tcW w:type="dxa" w:w="2376"/>
-            <w:shd w:fill="EAF0F8"/>
-          </w:tcPr>
-          <w:p>
-            <w:pPr>
-              <w:spacing w:after="20"/>
-            </w:pPr>
-            <w:r>
-              <w:rPr>
-                <w:rFonts w:ascii="Aptos" w:hAnsi="Aptos"/>
-                <w:b/>
-                <w:sz w:val="17"/>
-              </w:rPr>
-              <w:t>Languages</w:t>
-            </w:r>
-          </w:p>
-        </w:tc>
-        <w:tc>
-          <w:tcPr>
-            <w:tcW w:type="dxa" w:w="8280"/>
-          </w:tcPr>
-          <w:p>
-            <w:pPr>
-              <w:spacing w:after="20"/>
-            </w:pPr>
-            <w:r>
-              <w:rPr>
-                <w:rFonts w:ascii="Aptos" w:hAnsi="Aptos"/>
-                <w:sz w:val="17"/>
-              </w:rPr>
-              <w:t>TypeScript, JavaScript, Python, Java, Go, SQL, R, MATLAB</w:t>
-            </w:r>
-          </w:p>
-        </w:tc>
-      </w:tr>
-      <w:tr>
-        <w:tc>
-          <w:tcPr>
-            <w:tcW w:type="dxa" w:w="2376"/>
-            <w:shd w:fill="EAF0F8"/>
-          </w:tcPr>
-          <w:p>
-            <w:pPr>
-              <w:spacing w:after="20"/>
-            </w:pPr>
-            <w:r>
-              <w:rPr>
-                <w:rFonts w:ascii="Aptos" w:hAnsi="Aptos"/>
-                <w:b/>
-                <w:sz w:val="17"/>
-              </w:rPr>
-              <w:t>Backend / AI</w:t>
-            </w:r>
-          </w:p>
-        </w:tc>
-        <w:tc>
-          <w:tcPr>
-            <w:tcW w:type="dxa" w:w="8280"/>
-          </w:tcPr>
-          <w:p>
-            <w:pPr>
-              <w:spacing w:after="20"/>
-            </w:pPr>
-            <w:r>
-              <w:rPr>
-                <w:rFonts w:ascii="Aptos" w:hAnsi="Aptos"/>
-                <w:sz w:val="17"/>
-              </w:rPr>
-              <w:t>Next.js, Node.js, FastAPI, Express, PostgreSQL, Supabase, Prisma, Docker, AWS, MCP, LSP, LLM APIs</w:t>
-            </w:r>
-          </w:p>
-        </w:tc>
-      </w:tr>
-      <w:tr>
-        <w:tc>
-          <w:tcPr>
-            <w:tcW w:type="dxa" w:w="2376"/>
-            <w:shd w:fill="EAF0F8"/>
-          </w:tcPr>
-          <w:p>
-            <w:pPr>
-              <w:spacing w:after="20"/>
-            </w:pPr>
-            <w:r>
-              <w:rPr>
-                <w:rFonts w:ascii="Aptos" w:hAnsi="Aptos"/>
-                <w:b/>
-                <w:sz w:val="17"/>
-              </w:rPr>
-              <w:t>Product / Ops</w:t>
-            </w:r>
-          </w:p>
-        </w:tc>
-        <w:tc>
-          <w:tcPr>
-            <w:tcW w:type="dxa" w:w="8280"/>
-          </w:tcPr>
-          <w:p>
-            <w:pPr>
-              <w:spacing w:after="20"/>
-            </w:pPr>
-            <w:r>
-              <w:rPr>
-                <w:rFonts w:ascii="Aptos" w:hAnsi="Aptos"/>
-                <w:sz w:val="17"/>
-              </w:rPr>
-              <w:t>React, tRPC, Socket.io, Expo, SQLite, CI/CD, data pipelines, analytics, full-stack architecture, client delivery</w:t>
-            </w:r>
-          </w:p>
-        </w:tc>
-      </w:tr>
-    </w:tbl>
-    <w:p>
-      <w:pPr>
-        <w:spacing w:after="0"/>
-      </w:pPr>
-    </w:p>
-    <w:p>
-      <w:pPr>
-        <w:pStyle w:val="CVSection"/>
-      </w:pPr>
-      <w:r>
-        <w:t>Experience</w:t>
+        <w:rPr>
+          <w:rFonts w:ascii="Calibri" w:hAnsi="Calibri"/>
+          <w:b/>
+          <w:i w:val="0"/>
+          <w:color w:val="182A44"/>
+          <w:sz w:val="23"/>
+        </w:rPr>
+        <w:t>SKILLS</w:t>
       </w:r>
     </w:p>
     <w:p>
       <w:pPr>
-        <w:pStyle w:val="CVSubhead"/>
-        <w:keepNext/>
+        <w:spacing w:before="0" w:after="24" w:line="247" w:lineRule="auto"/>
+        <w:jc w:val="left"/>
       </w:pPr>
       <w:r>
-        <w:t>CTO  |  Forward Automations</w:t>
+        <w:rPr>
+          <w:rFonts w:ascii="Calibri" w:hAnsi="Calibri"/>
+          <w:b/>
+          <w:i w:val="0"/>
+          <w:color w:val="2B4A6F"/>
+          <w:sz w:val="18"/>
+        </w:rPr>
+        <w:t xml:space="preserve">Languages: </w:t>
       </w:r>
       <w:r>
         <w:rPr>
-          <w:rFonts w:ascii="Aptos" w:hAnsi="Aptos"/>
-          <w:i/>
-          <w:color w:val="595959"/>
+          <w:rFonts w:ascii="Calibri" w:hAnsi="Calibri"/>
+          <w:b w:val="0"/>
+          <w:i w:val="0"/>
+          <w:color w:val="202328"/>
           <w:sz w:val="18"/>
         </w:rPr>
-        <w:t xml:space="preserve">  |  2023 - Present</w:t>
+        <w:t>TypeScript, JavaScript, Python, Java, Go, Rust, Swift, SQL, R, MATLAB</w:t>
       </w:r>
     </w:p>
     <w:p>
       <w:pPr>
-        <w:pStyle w:val="CVBullet"/>
-        <w:spacing w:after="30"/>
-        <w:ind w:left="230" w:hanging="173"/>
+        <w:spacing w:before="0" w:after="24" w:line="247" w:lineRule="auto"/>
+        <w:jc w:val="left"/>
       </w:pPr>
       <w:r>
-        <w:t>• Delivered a Cleveland Clinic clinical-coaching MVP in 2 weeks for a regulated healthcare deployment.</w:t>
+        <w:rPr>
+          <w:rFonts w:ascii="Calibri" w:hAnsi="Calibri"/>
+          <w:b/>
+          <w:i w:val="0"/>
+          <w:color w:val="2B4A6F"/>
+          <w:sz w:val="18"/>
+        </w:rPr>
+        <w:t xml:space="preserve">Frameworks &amp; Runtimes: </w:t>
+      </w:r>
+      <w:r>
+        <w:rPr>
+          <w:rFonts w:ascii="Calibri" w:hAnsi="Calibri"/>
+          <w:b w:val="0"/>
+          <w:i w:val="0"/>
+          <w:color w:val="202328"/>
+          <w:sz w:val="18"/>
+        </w:rPr>
+        <w:t>React, Next.js, Node.js, Express, FastAPI, tRPC, Prisma, SQLAlchemy, Electron, Tauri, AppKit, Expo/React Native</w:t>
       </w:r>
     </w:p>
     <w:p>
       <w:pPr>
-        <w:pStyle w:val="CVBullet"/>
-        <w:spacing w:after="30"/>
-        <w:ind w:left="230" w:hanging="173"/>
+        <w:spacing w:before="0" w:after="24" w:line="247" w:lineRule="auto"/>
+        <w:jc w:val="left"/>
       </w:pPr>
       <w:r>
-        <w:t>• Built productivity software for a Cleveland architecture firm that increased operational output by 400%, deploying it in under 5 weeks.</w:t>
+        <w:rPr>
+          <w:rFonts w:ascii="Calibri" w:hAnsi="Calibri"/>
+          <w:b/>
+          <w:i w:val="0"/>
+          <w:color w:val="2B4A6F"/>
+          <w:sz w:val="18"/>
+        </w:rPr>
+        <w:t xml:space="preserve">Data &amp; Infra: </w:t>
+      </w:r>
+      <w:r>
+        <w:rPr>
+          <w:rFonts w:ascii="Calibri" w:hAnsi="Calibri"/>
+          <w:b w:val="0"/>
+          <w:i w:val="0"/>
+          <w:color w:val="202328"/>
+          <w:sz w:val="18"/>
+        </w:rPr>
+        <w:t>PostgreSQL, Supabase, SQLite, DuckDB, Redis, Docker, AWS, Row Level Security, pg_cron, Vercel, Railway/Render</w:t>
       </w:r>
     </w:p>
     <w:p>
       <w:pPr>
-        <w:pStyle w:val="CVBullet"/>
-        <w:spacing w:after="30"/>
-        <w:ind w:left="230" w:hanging="173"/>
+        <w:spacing w:before="0" w:after="24" w:line="247" w:lineRule="auto"/>
+        <w:jc w:val="left"/>
       </w:pPr>
       <w:r>
-        <w:t>• Led an end-to-end legacy refactor for STEM Playbook, launching a stable application in 11 days for a major live event.</w:t>
+        <w:rPr>
+          <w:rFonts w:ascii="Calibri" w:hAnsi="Calibri"/>
+          <w:b/>
+          <w:i w:val="0"/>
+          <w:color w:val="2B4A6F"/>
+          <w:sz w:val="18"/>
+        </w:rPr>
+        <w:t xml:space="preserve">Dev Tooling &amp; Protocols: </w:t>
+      </w:r>
+      <w:r>
+        <w:rPr>
+          <w:rFonts w:ascii="Calibri" w:hAnsi="Calibri"/>
+          <w:b w:val="0"/>
+          <w:i w:val="0"/>
+          <w:color w:val="202328"/>
+          <w:sz w:val="18"/>
+        </w:rPr>
+        <w:t>Model Context Protocol (MCP), Language Server Protocol (LSP), CLI design, ESLint plugin authoring, Git, CI/CD, GitHub Actions</w:t>
       </w:r>
     </w:p>
     <w:p>
       <w:pPr>
-        <w:pStyle w:val="CVBullet"/>
-        <w:spacing w:after="30"/>
-        <w:ind w:left="230" w:hanging="173"/>
+        <w:spacing w:before="0" w:after="24" w:line="247" w:lineRule="auto"/>
+        <w:jc w:val="left"/>
       </w:pPr>
       <w:r>
-        <w:t>• Developed AI marketing automation tools that reduced production timelines by 90% and generated 1.5M organic views for an a16z startup.</w:t>
+        <w:rPr>
+          <w:rFonts w:ascii="Calibri" w:hAnsi="Calibri"/>
+          <w:b/>
+          <w:i w:val="0"/>
+          <w:color w:val="2B4A6F"/>
+          <w:sz w:val="18"/>
+        </w:rPr>
+        <w:t xml:space="preserve">Applied AI: </w:t>
+      </w:r>
+      <w:r>
+        <w:rPr>
+          <w:rFonts w:ascii="Calibri" w:hAnsi="Calibri"/>
+          <w:b w:val="0"/>
+          <w:i w:val="0"/>
+          <w:color w:val="202328"/>
+          <w:sz w:val="18"/>
+        </w:rPr>
+        <w:t>Anthropic Claude, Gemini, VoyageAI embeddings, LLM extraction pipelines, hybrid vector/full-text retrieval (pgvector), agent evaluation contracts (Pydantic), prompt/eval design</w:t>
       </w:r>
     </w:p>
     <w:p>
       <w:pPr>
-        <w:pStyle w:val="CVSubhead"/>
-        <w:keepNext/>
+        <w:spacing w:before="0" w:after="24" w:line="247" w:lineRule="auto"/>
+        <w:jc w:val="left"/>
       </w:pPr>
       <w:r>
-        <w:t>Technical Consultant  |  Deepr (a16z Portfolio Company)</w:t>
+        <w:rPr>
+          <w:rFonts w:ascii="Calibri" w:hAnsi="Calibri"/>
+          <w:b/>
+          <w:i w:val="0"/>
+          <w:color w:val="2B4A6F"/>
+          <w:sz w:val="18"/>
+        </w:rPr>
+        <w:t xml:space="preserve">Testing, QA &amp; Observability: </w:t>
       </w:r>
       <w:r>
         <w:rPr>
-          <w:rFonts w:ascii="Aptos" w:hAnsi="Aptos"/>
-          <w:i/>
-          <w:color w:val="595959"/>
+          <w:rFonts w:ascii="Calibri" w:hAnsi="Calibri"/>
+          <w:b w:val="0"/>
+          <w:i w:val="0"/>
+          <w:color w:val="202328"/>
           <w:sz w:val="18"/>
         </w:rPr>
-        <w:t xml:space="preserve">  |  2025</w:t>
+        <w:t>Playwright, Vitest, pgTAP, promptfoo, OpenTelemetry, Arize</w:t>
       </w:r>
     </w:p>
     <w:p>
       <w:pPr>
-        <w:pStyle w:val="CVBullet"/>
-        <w:spacing w:after="30"/>
-        <w:ind w:left="230" w:hanging="173"/>
+        <w:spacing w:before="0" w:after="24" w:line="247" w:lineRule="auto"/>
+        <w:jc w:val="left"/>
       </w:pPr>
       <w:r>
-        <w:t>• Engineered an AI-powered photo-carousel content-generation system and an inline coverage-vector tool for real-time testing awareness during code review.</w:t>
+        <w:rPr>
+          <w:rFonts w:ascii="Calibri" w:hAnsi="Calibri"/>
+          <w:b/>
+          <w:i w:val="0"/>
+          <w:color w:val="2B4A6F"/>
+          <w:sz w:val="18"/>
+        </w:rPr>
+        <w:t xml:space="preserve">Integrations: </w:t>
+      </w:r>
+      <w:r>
+        <w:rPr>
+          <w:rFonts w:ascii="Calibri" w:hAnsi="Calibri"/>
+          <w:b w:val="0"/>
+          <w:i w:val="0"/>
+          <w:color w:val="202328"/>
+          <w:sz w:val="18"/>
+        </w:rPr>
+        <w:t>Stripe, Resend, PostGrid, Inngest, AssemblyAI, Clerk, fal.ai, Google Sheets/Apps Script, Railway</w:t>
       </w:r>
     </w:p>
     <w:p>
       <w:pPr>
-        <w:pStyle w:val="CVSubhead"/>
-        <w:keepNext/>
+        <w:spacing w:before="0" w:after="24" w:line="247" w:lineRule="auto"/>
+        <w:jc w:val="left"/>
       </w:pPr>
       <w:r>
-        <w:t>Software Development Engineer Intern  |  Amazon</w:t>
+        <w:rPr>
+          <w:rFonts w:ascii="Calibri" w:hAnsi="Calibri"/>
+          <w:b/>
+          <w:i w:val="0"/>
+          <w:color w:val="2B4A6F"/>
+          <w:sz w:val="18"/>
+        </w:rPr>
+        <w:t xml:space="preserve">Spoken Languages: </w:t>
       </w:r>
       <w:r>
         <w:rPr>
-          <w:rFonts w:ascii="Aptos" w:hAnsi="Aptos"/>
-          <w:i/>
-          <w:color w:val="595959"/>
+          <w:rFonts w:ascii="Calibri" w:hAnsi="Calibri"/>
+          <w:b w:val="0"/>
+          <w:i w:val="0"/>
+          <w:color w:val="202328"/>
           <w:sz w:val="18"/>
         </w:rPr>
-        <w:t xml:space="preserve">  |  2023 - 2025</w:t>
+        <w:t>English (Fluent), French (Intermediate)</w:t>
       </w:r>
     </w:p>
     <w:p>
       <w:pPr>
-        <w:pStyle w:val="CVBullet"/>
-        <w:spacing w:after="30"/>
-        <w:ind w:left="230" w:hanging="173"/>
+        <w:spacing w:before="140" w:after="80" w:line="240" w:lineRule="auto"/>
+        <w:jc w:val="left"/>
+        <w:pBdr>
+          <w:bottom w:val="single" w:sz="8" w:space="4" w:color="2B4A6F"/>
+        </w:pBdr>
+        <w:keepNext/>
       </w:pPr>
       <w:r>
-        <w:t>• Completed three SDE internship terms across multiple teams, including Ads and FinTech/business-systems environments.</w:t>
+        <w:rPr>
+          <w:rFonts w:ascii="Calibri" w:hAnsi="Calibri"/>
+          <w:b/>
+          <w:i w:val="0"/>
+          <w:color w:val="182A44"/>
+          <w:sz w:val="23"/>
+        </w:rPr>
+        <w:t>WORK EXPERIENCE</w:t>
       </w:r>
     </w:p>
     <w:p>
       <w:pPr>
-        <w:pStyle w:val="CVBullet"/>
-        <w:spacing w:after="30"/>
-        <w:ind w:left="230" w:hanging="173"/>
+        <w:tabs>
+          <w:tab w:pos="9432" w:val="right"/>
+        </w:tabs>
+        <w:spacing w:before="0" w:after="4" w:line="240" w:lineRule="auto"/>
+        <w:jc w:val="left"/>
+        <w:keepNext/>
       </w:pPr>
       <w:r>
-        <w:t>• Enhanced customer process efficiency and pipeline testing capabilities across distributed systems infrastructure.</w:t>
+        <w:rPr>
+          <w:rFonts w:ascii="Calibri" w:hAnsi="Calibri"/>
+          <w:b/>
+          <w:i w:val="0"/>
+          <w:color w:val="182A44"/>
+          <w:sz w:val="20"/>
+        </w:rPr>
+        <w:t>CTO</w:t>
+      </w:r>
+      <w:r>
+        <w:tab/>
+      </w:r>
+      <w:r>
+        <w:rPr>
+          <w:rFonts w:ascii="Calibri" w:hAnsi="Calibri"/>
+          <w:b w:val="0"/>
+          <w:i/>
+          <w:color w:val="5C6774"/>
+          <w:sz w:val="18"/>
+        </w:rPr>
+        <w:t>2023 - Present</w:t>
       </w:r>
     </w:p>
     <w:p>
       <w:pPr>
-        <w:pStyle w:val="CVBullet"/>
-        <w:spacing w:after="30"/>
-        <w:ind w:left="230" w:hanging="173"/>
+        <w:spacing w:before="0" w:after="30" w:line="240" w:lineRule="auto"/>
+        <w:jc w:val="left"/>
       </w:pPr>
       <w:r>
-        <w:t>• Built a data analytics project that provided actionable hiring insights to business leaders and hiring managers.</w:t>
+        <w:rPr>
+          <w:rFonts w:ascii="Calibri" w:hAnsi="Calibri"/>
+          <w:b/>
+          <w:i w:val="0"/>
+          <w:color w:val="2B4A6F"/>
+          <w:sz w:val="18"/>
+        </w:rPr>
+        <w:t>Forward Automations</w:t>
       </w:r>
     </w:p>
     <w:p>
       <w:pPr>
-        <w:pStyle w:val="CVBullet"/>
-        <w:spacing w:after="30"/>
-        <w:ind w:left="230" w:hanging="173"/>
+        <w:pStyle w:val="ListBullet"/>
+        <w:spacing w:before="0" w:after="30" w:line="247" w:lineRule="auto"/>
+        <w:ind w:left="389" w:hanging="216"/>
+        <w:jc w:val="left"/>
       </w:pPr>
       <w:r>
-        <w:t>• Completed coding projects that improved team efficiency and broadened internal testing capabilities.</w:t>
-      </w:r>
-    </w:p>
-    <w:p>
-      <w:r>
-        <w:br w:type="page"/>
+        <w:rPr>
+          <w:rFonts w:ascii="Calibri" w:hAnsi="Calibri"/>
+          <w:b w:val="0"/>
+          <w:i w:val="0"/>
+          <w:color w:val="202328"/>
+          <w:sz w:val="18"/>
+        </w:rPr>
+        <w:t>Directs technical strategy and delivery across healthcare, operations, and startup client engagements.</w:t>
       </w:r>
     </w:p>
     <w:p>
       <w:pPr>
-        <w:pStyle w:val="CVSection"/>
+        <w:pStyle w:val="ListBullet"/>
+        <w:spacing w:before="0" w:after="30" w:line="247" w:lineRule="auto"/>
+        <w:ind w:left="389" w:hanging="216"/>
+        <w:jc w:val="left"/>
       </w:pPr>
       <w:r>
-        <w:t>Selected Client &amp; Product Systems</w:t>
+        <w:rPr>
+          <w:rFonts w:ascii="Calibri" w:hAnsi="Calibri"/>
+          <w:b w:val="0"/>
+          <w:i w:val="0"/>
+          <w:color w:val="202328"/>
+          <w:sz w:val="18"/>
+        </w:rPr>
+        <w:t>Delivered a Cleveland Clinic clinical-coaching MVP in 2 weeks for a regulated healthcare deployment.</w:t>
       </w:r>
     </w:p>
     <w:p>
       <w:pPr>
-        <w:pStyle w:val="CVSubhead"/>
-        <w:keepNext/>
+        <w:pStyle w:val="ListBullet"/>
+        <w:spacing w:before="0" w:after="30" w:line="247" w:lineRule="auto"/>
+        <w:ind w:left="389" w:hanging="216"/>
+        <w:jc w:val="left"/>
       </w:pPr>
       <w:r>
-        <w:t>Tenure  |  LaunchNY Cohort Venture  |  AI Knowledge Platform</w:t>
-      </w:r>
-      <w:r>
         <w:rPr>
-          <w:rFonts w:ascii="Aptos" w:hAnsi="Aptos"/>
-          <w:i/>
-          <w:color w:val="595959"/>
+          <w:rFonts w:ascii="Calibri" w:hAnsi="Calibri"/>
+          <w:b w:val="0"/>
+          <w:i w:val="0"/>
+          <w:color w:val="202328"/>
           <w:sz w:val="18"/>
         </w:rPr>
-        <w:t xml:space="preserve">  |  Pilot-ready</w:t>
+        <w:t>Built productivity software for a Cleveland architecture firm that increased operational output ~400%, deployed in under 5 weeks.</w:t>
       </w:r>
     </w:p>
     <w:p>
       <w:pPr>
-        <w:pStyle w:val="CVBullet"/>
-        <w:spacing w:after="30"/>
-        <w:ind w:left="230" w:hanging="173"/>
+        <w:pStyle w:val="ListBullet"/>
+        <w:spacing w:before="0" w:after="30" w:line="247" w:lineRule="auto"/>
+        <w:ind w:left="389" w:hanging="216"/>
+        <w:jc w:val="left"/>
       </w:pPr>
       <w:r>
-        <w:t>• Built a platform that turns specialist-led knowledge capture into reviewed SOPs, permissioned institutional memory, cited Q&amp;A, and process intelligence reports.</w:t>
+        <w:rPr>
+          <w:rFonts w:ascii="Calibri" w:hAnsi="Calibri"/>
+          <w:b w:val="0"/>
+          <w:i w:val="0"/>
+          <w:color w:val="202328"/>
+          <w:sz w:val="18"/>
+        </w:rPr>
+        <w:t>Led an end-to-end legacy refactor for STEM Playbook, launching a stable application in 11 days ahead of a major live event.</w:t>
       </w:r>
     </w:p>
     <w:p>
       <w:pPr>
-        <w:pStyle w:val="CVBullet"/>
-        <w:spacing w:after="30"/>
-        <w:ind w:left="230" w:hanging="173"/>
+        <w:pStyle w:val="ListBullet"/>
+        <w:spacing w:before="0" w:after="30" w:line="247" w:lineRule="auto"/>
+        <w:ind w:left="389" w:hanging="216"/>
+        <w:jc w:val="left"/>
       </w:pPr>
       <w:r>
-        <w:t>• Implemented Next.js/TypeScript and Supabase/PostgreSQL systems with RLS, transcription, LLM extraction, hybrid retrieval, and human review gates; pre-pilot hardening is underway.</w:t>
+        <w:rPr>
+          <w:rFonts w:ascii="Calibri" w:hAnsi="Calibri"/>
+          <w:b w:val="0"/>
+          <w:i w:val="0"/>
+          <w:color w:val="202328"/>
+          <w:sz w:val="18"/>
+        </w:rPr>
+        <w:t>Developed AI marketing-automation tooling that cut production timelines ~90% and drove roughly 1.5M organic views for an a16z-backed startup client.</w:t>
       </w:r>
     </w:p>
     <w:p>
       <w:pPr>
-        <w:pStyle w:val="CVSubhead"/>
+        <w:tabs>
+          <w:tab w:pos="9432" w:val="right"/>
+        </w:tabs>
+        <w:spacing w:before="0" w:after="4" w:line="240" w:lineRule="auto"/>
+        <w:jc w:val="left"/>
         <w:keepNext/>
       </w:pPr>
       <w:r>
-        <w:t>BidCamp  |  Multi-Tenant Government-Contracting SaaS</w:t>
+        <w:rPr>
+          <w:rFonts w:ascii="Calibri" w:hAnsi="Calibri"/>
+          <w:b/>
+          <w:i w:val="0"/>
+          <w:color w:val="182A44"/>
+          <w:sz w:val="20"/>
+        </w:rPr>
+        <w:t>Technical Consultant</w:t>
+      </w:r>
+      <w:r>
+        <w:tab/>
       </w:r>
       <w:r>
         <w:rPr>
-          <w:rFonts w:ascii="Aptos" w:hAnsi="Aptos"/>
+          <w:rFonts w:ascii="Calibri" w:hAnsi="Calibri"/>
+          <w:b w:val="0"/>
           <w:i/>
-          <w:color w:val="595959"/>
+          <w:color w:val="5C6774"/>
           <w:sz w:val="18"/>
         </w:rPr>
-        <w:t xml:space="preserve">  |  Live closed beta</w:t>
+        <w:t>2025</w:t>
       </w:r>
     </w:p>
     <w:p>
       <w:pPr>
-        <w:pStyle w:val="CVBullet"/>
-        <w:spacing w:after="30"/>
-        <w:ind w:left="230" w:hanging="173"/>
+        <w:spacing w:before="0" w:after="30" w:line="240" w:lineRule="auto"/>
+        <w:jc w:val="left"/>
       </w:pPr>
       <w:r>
-        <w:t>• Built Claude-powered RFP analysis and proposal drafting, procurement intelligence, client and prime workflows, compliance tracking, and human-reviewed weekly digests for MBE/MWBE firms.</w:t>
+        <w:rPr>
+          <w:rFonts w:ascii="Calibri" w:hAnsi="Calibri"/>
+          <w:b/>
+          <w:i w:val="0"/>
+          <w:color w:val="2B4A6F"/>
+          <w:sz w:val="18"/>
+        </w:rPr>
+        <w:t>Deepr (a16z Portfolio Company)</w:t>
       </w:r>
     </w:p>
     <w:p>
       <w:pPr>
-        <w:pStyle w:val="CVBullet"/>
-        <w:spacing w:after="30"/>
-        <w:ind w:left="230" w:hanging="173"/>
+        <w:pStyle w:val="ListBullet"/>
+        <w:spacing w:before="0" w:after="30" w:line="247" w:lineRule="auto"/>
+        <w:ind w:left="389" w:hanging="216"/>
+        <w:jc w:val="left"/>
       </w:pPr>
       <w:r>
-        <w:t>• Implemented Next.js, Supabase/PostgreSQL RLS, Stripe, Resend, PostGrid, scheduled jobs, and a GitHub scraping worker.</w:t>
+        <w:rPr>
+          <w:rFonts w:ascii="Calibri" w:hAnsi="Calibri"/>
+          <w:b w:val="0"/>
+          <w:i w:val="0"/>
+          <w:color w:val="202328"/>
+          <w:sz w:val="18"/>
+        </w:rPr>
+        <w:t>Engineered an AI-powered photo-carousel content-generation system that drove a substantial increase in marketing viewership.</w:t>
       </w:r>
     </w:p>
     <w:p>
       <w:pPr>
-        <w:pStyle w:val="CVSubhead"/>
-        <w:keepNext/>
+        <w:pStyle w:val="ListBullet"/>
+        <w:spacing w:before="0" w:after="30" w:line="247" w:lineRule="auto"/>
+        <w:ind w:left="389" w:hanging="216"/>
+        <w:jc w:val="left"/>
       </w:pPr>
       <w:r>
-        <w:t>CrimClock  |  Legal Time Intelligence Platform</w:t>
-      </w:r>
-      <w:r>
         <w:rPr>
-          <w:rFonts w:ascii="Aptos" w:hAnsi="Aptos"/>
-          <w:i/>
-          <w:color w:val="595959"/>
+          <w:rFonts w:ascii="Calibri" w:hAnsi="Calibri"/>
+          <w:b w:val="0"/>
+          <w:i w:val="0"/>
+          <w:color w:val="202328"/>
           <w:sz w:val="18"/>
         </w:rPr>
-        <w:t xml:space="preserve">  |  Product build</w:t>
+        <w:t>Developed an inline coverage-vector tool giving engineers real-time testing-coverage awareness during code review.</w:t>
       </w:r>
     </w:p>
     <w:p>
       <w:pPr>
-        <w:pStyle w:val="CVBullet"/>
-        <w:spacing w:after="30"/>
-        <w:ind w:left="230" w:hanging="173"/>
+        <w:tabs>
+          <w:tab w:pos="9432" w:val="right"/>
+        </w:tabs>
+        <w:spacing w:before="0" w:after="4" w:line="240" w:lineRule="auto"/>
+        <w:jc w:val="left"/>
+        <w:keepNext/>
       </w:pPr>
       <w:r>
-        <w:t>• Built neutral, explainable procedural-timing and sentencing workflows with statutes, rule configuration, exclusions, tolling, calculation steps, and explicit disclaimer language.</w:t>
+        <w:rPr>
+          <w:rFonts w:ascii="Calibri" w:hAnsi="Calibri"/>
+          <w:b/>
+          <w:i w:val="0"/>
+          <w:color w:val="182A44"/>
+          <w:sz w:val="20"/>
+        </w:rPr>
+        <w:t>Software Development Engineer Intern</w:t>
+      </w:r>
+      <w:r>
+        <w:tab/>
+      </w:r>
+      <w:r>
+        <w:rPr>
+          <w:rFonts w:ascii="Calibri" w:hAnsi="Calibri"/>
+          <w:b w:val="0"/>
+          <w:i/>
+          <w:color w:val="5C6774"/>
+          <w:sz w:val="18"/>
+        </w:rPr>
+        <w:t>2023 - 2025</w:t>
       </w:r>
     </w:p>
     <w:p>
       <w:pPr>
-        <w:pStyle w:val="CVSubhead"/>
-        <w:keepNext/>
+        <w:spacing w:before="0" w:after="30" w:line="240" w:lineRule="auto"/>
+        <w:jc w:val="left"/>
       </w:pPr>
       <w:r>
-        <w:t>Hoopscout  |  Basketball Recruiting Intelligence</w:t>
-      </w:r>
-      <w:r>
         <w:rPr>
-          <w:rFonts w:ascii="Aptos" w:hAnsi="Aptos"/>
-          <w:i/>
-          <w:color w:val="595959"/>
+          <w:rFonts w:ascii="Calibri" w:hAnsi="Calibri"/>
+          <w:b/>
+          <w:i w:val="0"/>
+          <w:color w:val="2B4A6F"/>
           <w:sz w:val="18"/>
         </w:rPr>
-        <w:t xml:space="preserve">  |  Private beta</w:t>
+        <w:t>Amazon</w:t>
       </w:r>
     </w:p>
     <w:p>
       <w:pPr>
-        <w:pStyle w:val="CVBullet"/>
-        <w:spacing w:after="30"/>
-        <w:ind w:left="230" w:hanging="173"/>
+        <w:pStyle w:val="ListBullet"/>
+        <w:spacing w:before="0" w:after="30" w:line="247" w:lineRule="auto"/>
+        <w:ind w:left="389" w:hanging="216"/>
+        <w:jc w:val="left"/>
       </w:pPr>
       <w:r>
-        <w:t>• Built coach-facing search, athlete review, fit weighting, ranked school-fit signals, messaging, transcript controls, and moderation/trust operations.</w:t>
+        <w:rPr>
+          <w:rFonts w:ascii="Calibri" w:hAnsi="Calibri"/>
+          <w:b w:val="0"/>
+          <w:i w:val="0"/>
+          <w:color w:val="202328"/>
+          <w:sz w:val="18"/>
+        </w:rPr>
+        <w:t>Completed three SDE internship terms across multiple teams, including Ads and FinTech/business-systems environments.</w:t>
       </w:r>
     </w:p>
     <w:p>
       <w:pPr>
-        <w:pStyle w:val="CVSection"/>
+        <w:pStyle w:val="ListBullet"/>
+        <w:spacing w:before="0" w:after="30" w:line="247" w:lineRule="auto"/>
+        <w:ind w:left="389" w:hanging="216"/>
+        <w:jc w:val="left"/>
       </w:pPr>
       <w:r>
-        <w:t>Public Engineering Releases</w:t>
+        <w:rPr>
+          <w:rFonts w:ascii="Calibri" w:hAnsi="Calibri"/>
+          <w:b w:val="0"/>
+          <w:i w:val="0"/>
+          <w:color w:val="202328"/>
+          <w:sz w:val="18"/>
+        </w:rPr>
+        <w:t>Built a data-analytics project delivering actionable hiring insights to business leaders and hiring managers.</w:t>
       </w:r>
     </w:p>
     <w:p>
       <w:pPr>
-        <w:pStyle w:val="CVSubhead"/>
-        <w:keepNext/>
+        <w:pStyle w:val="ListBullet"/>
+        <w:spacing w:before="0" w:after="30" w:line="247" w:lineRule="auto"/>
+        <w:ind w:left="389" w:hanging="216"/>
+        <w:jc w:val="left"/>
       </w:pPr>
       <w:r>
-        <w:t>Quality Runner  |  Python CLI + MCP Server</w:t>
+        <w:rPr>
+          <w:rFonts w:ascii="Calibri" w:hAnsi="Calibri"/>
+          <w:b w:val="0"/>
+          <w:i w:val="0"/>
+          <w:color w:val="202328"/>
+          <w:sz w:val="18"/>
+        </w:rPr>
+        <w:t>Contributed to customer process efficiency and testing-pipeline capabilities across distributed-systems infrastructure.</w:t>
       </w:r>
     </w:p>
     <w:p>
       <w:pPr>
-        <w:pStyle w:val="CVBullet"/>
-        <w:spacing w:after="30"/>
-        <w:ind w:left="230" w:hanging="173"/>
+        <w:spacing w:before="140" w:after="80" w:line="240" w:lineRule="auto"/>
+        <w:jc w:val="left"/>
+        <w:pBdr>
+          <w:bottom w:val="single" w:sz="8" w:space="4" w:color="2B4A6F"/>
+        </w:pBdr>
+        <w:keepNext/>
       </w:pPr>
       <w:r>
-        <w:t>• Built and published a read-only quality orchestrator that compiles standards, detects checks, normalizes evidence-backed findings, and writes versioned artifacts plus remediation plans.</w:t>
+        <w:rPr>
+          <w:rFonts w:ascii="Calibri" w:hAnsi="Calibri"/>
+          <w:b/>
+          <w:i w:val="0"/>
+          <w:color w:val="182A44"/>
+          <w:sz w:val="23"/>
+        </w:rPr>
+        <w:t>OPEN-SOURCE &amp; PUBLISHED DEVELOPER TOOLING</w:t>
       </w:r>
     </w:p>
     <w:p>
       <w:pPr>
-        <w:pStyle w:val="CVSubhead"/>
+        <w:spacing w:before="0" w:after="24" w:line="247" w:lineRule="auto"/>
+        <w:jc w:val="left"/>
         <w:keepNext/>
       </w:pPr>
       <w:r>
-        <w:t>Pre-CR Suite  |  Cross-Editor Developer Tooling</w:t>
+        <w:rPr>
+          <w:rFonts w:ascii="Calibri" w:hAnsi="Calibri"/>
+          <w:b/>
+          <w:i w:val="0"/>
+          <w:color w:val="2B4A6F"/>
+          <w:sz w:val="19"/>
+        </w:rPr>
+        <w:t>Quality Runner</w:t>
+      </w:r>
+      <w:r>
+        <w:rPr>
+          <w:rFonts w:ascii="Calibri" w:hAnsi="Calibri"/>
+          <w:b w:val="0"/>
+          <w:i w:val="0"/>
+          <w:color w:val="5C6774"/>
+          <w:sz w:val="19"/>
+        </w:rPr>
+        <w:t xml:space="preserve"> — </w:t>
+      </w:r>
+      <w:r>
+        <w:rPr>
+          <w:rFonts w:ascii="Calibri" w:hAnsi="Calibri"/>
+          <w:b w:val="0"/>
+          <w:i w:val="0"/>
+          <w:color w:val="202328"/>
+          <w:sz w:val="18"/>
+        </w:rPr>
+        <w:t>PyPI quality-runner v0.6.0. Repo-quality CLI and MCP server that runs proof-oriented checks across a codebase and emits machine-readable, evidence-backed findings plus an ordered remediation plan; read-only by design so agents/humans review evidence before acting.</w:t>
       </w:r>
     </w:p>
     <w:p>
       <w:pPr>
-        <w:pStyle w:val="CVBullet"/>
-        <w:spacing w:after="30"/>
-        <w:ind w:left="230" w:hanging="173"/>
+        <w:spacing w:before="0" w:after="24" w:line="247" w:lineRule="auto"/>
+        <w:jc w:val="left"/>
+        <w:keepNext/>
       </w:pPr>
       <w:r>
-        <w:t>• Built a TypeScript monorepo with shared core/server contracts and an LSP workflow for changed-line coverage readiness across VS Code, Neovim, and headless CLI use.</w:t>
+        <w:rPr>
+          <w:rFonts w:ascii="Calibri" w:hAnsi="Calibri"/>
+          <w:b/>
+          <w:i w:val="0"/>
+          <w:color w:val="2B4A6F"/>
+          <w:sz w:val="19"/>
+        </w:rPr>
+        <w:t>ESLint Anti-Slop</w:t>
+      </w:r>
+      <w:r>
+        <w:rPr>
+          <w:rFonts w:ascii="Calibri" w:hAnsi="Calibri"/>
+          <w:b w:val="0"/>
+          <w:i w:val="0"/>
+          <w:color w:val="5C6774"/>
+          <w:sz w:val="19"/>
+        </w:rPr>
+        <w:t xml:space="preserve"> — </w:t>
+      </w:r>
+      <w:r>
+        <w:rPr>
+          <w:rFonts w:ascii="Calibri" w:hAnsi="Calibri"/>
+          <w:b w:val="0"/>
+          <w:i w:val="0"/>
+          <w:color w:val="202328"/>
+          <w:sz w:val="18"/>
+        </w:rPr>
+        <w:t>npm eslint-plugin-anti-slop v0.5.0. Opinionated ESLint 9 flat-config plugin catching low-signal AI/code-review patterns (unjustified client components, placeholder copy, gradient text, weak empty states) before they reach production; ships a CLI (anti-slop check / anti-slop gate) for pre-merge enforcement.</w:t>
       </w:r>
     </w:p>
     <w:p>
       <w:pPr>
-        <w:pStyle w:val="CVSubhead"/>
+        <w:spacing w:before="0" w:after="24" w:line="247" w:lineRule="auto"/>
+        <w:jc w:val="left"/>
         <w:keepNext/>
       </w:pPr>
       <w:r>
-        <w:t>Additional proof</w:t>
+        <w:rPr>
+          <w:rFonts w:ascii="Calibri" w:hAnsi="Calibri"/>
+          <w:b/>
+          <w:i w:val="0"/>
+          <w:color w:val="2B4A6F"/>
+          <w:sz w:val="19"/>
+        </w:rPr>
+        <w:t>Pre-CR Suite</w:t>
+      </w:r>
+      <w:r>
+        <w:rPr>
+          <w:rFonts w:ascii="Calibri" w:hAnsi="Calibri"/>
+          <w:b w:val="0"/>
+          <w:i w:val="0"/>
+          <w:color w:val="5C6774"/>
+          <w:sz w:val="19"/>
+        </w:rPr>
+        <w:t xml:space="preserve"> — </w:t>
+      </w:r>
+      <w:r>
+        <w:rPr>
+          <w:rFonts w:ascii="Calibri" w:hAnsi="Calibri"/>
+          <w:b w:val="0"/>
+          <w:i w:val="0"/>
+          <w:color w:val="202328"/>
+          <w:sz w:val="18"/>
+        </w:rPr>
+        <w:t>npm @pre-cr/core and @pre-cr/server v0.1.0. Coverage-first pre-PR readiness tooling with an authored Language Server (LSP) so VS Code, Neovim, and a headless CLI share one changed-line-coverage evaluation instead of duplicating logic.</w:t>
       </w:r>
     </w:p>
     <w:p>
       <w:pPr>
-        <w:pStyle w:val="CVSmall"/>
-        <w:spacing w:after="40"/>
+        <w:spacing w:before="0" w:after="24" w:line="247" w:lineRule="auto"/>
+        <w:jc w:val="left"/>
+        <w:keepNext/>
       </w:pPr>
       <w:r>
-        <w:t>AIOS local-first agent operating system; Terrace published spec-driven AI workflow CLI; Framework Labs reasoning-engine lab; Chiron's Forge multi-AI research product; Court Vision/BBDSE basketball simulation and analytics; Soundscape web/mobile monorepo; Dsci-proj survival-analysis pipeline and triage dashboard.</w:t>
+        <w:rPr>
+          <w:rFonts w:ascii="Calibri" w:hAnsi="Calibri"/>
+          <w:b/>
+          <w:i w:val="0"/>
+          <w:color w:val="2B4A6F"/>
+          <w:sz w:val="19"/>
+        </w:rPr>
+        <w:t>Agent Eval Contract</w:t>
+      </w:r>
+      <w:r>
+        <w:rPr>
+          <w:rFonts w:ascii="Calibri" w:hAnsi="Calibri"/>
+          <w:b w:val="0"/>
+          <w:i w:val="0"/>
+          <w:color w:val="5C6774"/>
+          <w:sz w:val="19"/>
+        </w:rPr>
+        <w:t xml:space="preserve"> — </w:t>
+      </w:r>
+      <w:r>
+        <w:rPr>
+          <w:rFonts w:ascii="Calibri" w:hAnsi="Calibri"/>
+          <w:b w:val="0"/>
+          <w:i w:val="0"/>
+          <w:color w:val="202328"/>
+          <w:sz w:val="18"/>
+        </w:rPr>
+        <w:t>PyPI agent-eval-contract v0.2.0; validated v0.3.0 candidate staged on dev. Typed Pydantic contracts for evaluating AI-agent runs with consistent cases, rubrics, evidence, and result payloads.</w:t>
       </w:r>
     </w:p>
     <w:p>
       <w:pPr>
-        <w:pStyle w:val="CVSection"/>
+        <w:spacing w:before="0" w:after="24" w:line="247" w:lineRule="auto"/>
+        <w:jc w:val="left"/>
+        <w:keepNext/>
       </w:pPr>
       <w:r>
-        <w:t>Education</w:t>
+        <w:rPr>
+          <w:rFonts w:ascii="Calibri" w:hAnsi="Calibri"/>
+          <w:b/>
+          <w:i w:val="0"/>
+          <w:color w:val="2B4A6F"/>
+          <w:sz w:val="19"/>
+        </w:rPr>
+        <w:t>Research Domain Writing (rdw)</w:t>
+      </w:r>
+      <w:r>
+        <w:rPr>
+          <w:rFonts w:ascii="Calibri" w:hAnsi="Calibri"/>
+          <w:b w:val="0"/>
+          <w:i w:val="0"/>
+          <w:color w:val="5C6774"/>
+          <w:sz w:val="19"/>
+        </w:rPr>
+        <w:t xml:space="preserve"> — </w:t>
+      </w:r>
+      <w:r>
+        <w:rPr>
+          <w:rFonts w:ascii="Calibri" w:hAnsi="Calibri"/>
+          <w:b w:val="0"/>
+          <w:i w:val="0"/>
+          <w:color w:val="202328"/>
+          <w:sz w:val="18"/>
+        </w:rPr>
+        <w:t>PyPI research-domain-writing v0.1.0; validated v0.3.0 candidate staged on dev. Agent-first harness for research-grounded, claim-safe writing; validates structured research packets and emits exact prompt bundles across technical/music/basketball domains.</w:t>
       </w:r>
     </w:p>
     <w:p>
       <w:pPr>
-        <w:pStyle w:val="CVSubhead"/>
+        <w:spacing w:before="0" w:after="24" w:line="247" w:lineRule="auto"/>
+        <w:jc w:val="left"/>
         <w:keepNext/>
       </w:pPr>
       <w:r>
+        <w:rPr>
+          <w:rFonts w:ascii="Calibri" w:hAnsi="Calibri"/>
+          <w:b/>
+          <w:i w:val="0"/>
+          <w:color w:val="2B4A6F"/>
+          <w:sz w:val="19"/>
+        </w:rPr>
+        <w:t>TMCP</w:t>
+      </w:r>
+      <w:r>
+        <w:rPr>
+          <w:rFonts w:ascii="Calibri" w:hAnsi="Calibri"/>
+          <w:b w:val="0"/>
+          <w:i w:val="0"/>
+          <w:color w:val="5C6774"/>
+          <w:sz w:val="19"/>
+        </w:rPr>
+        <w:t xml:space="preserve"> — </w:t>
+      </w:r>
+      <w:r>
+        <w:rPr>
+          <w:rFonts w:ascii="Calibri" w:hAnsi="Calibri"/>
+          <w:b w:val="0"/>
+          <w:i w:val="0"/>
+          <w:color w:val="202328"/>
+          <w:sz w:val="18"/>
+        </w:rPr>
+        <w:t>Claude + Codex marketplace-distributed MCP/plugin package v0.5.7. Composable skill-packet workflows for expert audits, readiness reviews, routing policies, and agent handoffs; verified across GitHub Release assets, Codex and Claude Code marketplace installs, and MCP Registry publication.</w:t>
+      </w:r>
+    </w:p>
+    <w:p>
+      <w:pPr>
+        <w:spacing w:before="0" w:after="24" w:line="247" w:lineRule="auto"/>
+        <w:jc w:val="left"/>
+        <w:keepNext/>
+      </w:pPr>
+      <w:r>
+        <w:rPr>
+          <w:rFonts w:ascii="Calibri" w:hAnsi="Calibri"/>
+          <w:b/>
+          <w:i w:val="0"/>
+          <w:color w:val="2B4A6F"/>
+          <w:sz w:val="19"/>
+        </w:rPr>
+        <w:t>Terrace</w:t>
+      </w:r>
+      <w:r>
+        <w:rPr>
+          <w:rFonts w:ascii="Calibri" w:hAnsi="Calibri"/>
+          <w:b w:val="0"/>
+          <w:i w:val="0"/>
+          <w:color w:val="5C6774"/>
+          <w:sz w:val="19"/>
+        </w:rPr>
+        <w:t xml:space="preserve"> — </w:t>
+      </w:r>
+      <w:r>
+        <w:rPr>
+          <w:rFonts w:ascii="Calibri" w:hAnsi="Calibri"/>
+          <w:b w:val="0"/>
+          <w:i w:val="0"/>
+          <w:color w:val="202328"/>
+          <w:sz w:val="18"/>
+        </w:rPr>
+        <w:t>npm @jakyeamos33/terrace v0.1.1; v0.2.0 release candidate staged on dev. Spec-driven, test-governed workflow CLI for AI-assisted development; enforces recoverable repo state, explicit spec intent, protected tests, and deterministic quality gates (ship check --json) for CI use.</w:t>
+      </w:r>
+    </w:p>
+    <w:p>
+      <w:pPr>
+        <w:spacing w:before="0" w:after="24" w:line="247" w:lineRule="auto"/>
+        <w:jc w:val="left"/>
+        <w:keepNext/>
+      </w:pPr>
+      <w:r>
+        <w:rPr>
+          <w:rFonts w:ascii="Calibri" w:hAnsi="Calibri"/>
+          <w:b/>
+          <w:i w:val="0"/>
+          <w:color w:val="2B4A6F"/>
+          <w:sz w:val="19"/>
+        </w:rPr>
+        <w:t>Portable Agentic Workbench</w:t>
+      </w:r>
+      <w:r>
+        <w:rPr>
+          <w:rFonts w:ascii="Calibri" w:hAnsi="Calibri"/>
+          <w:b w:val="0"/>
+          <w:i w:val="0"/>
+          <w:color w:val="5C6774"/>
+          <w:sz w:val="19"/>
+        </w:rPr>
+        <w:t xml:space="preserve"> — </w:t>
+      </w:r>
+      <w:r>
+        <w:rPr>
+          <w:rFonts w:ascii="Calibri" w:hAnsi="Calibri"/>
+          <w:b w:val="0"/>
+          <w:i w:val="0"/>
+          <w:color w:val="202328"/>
+          <w:sz w:val="18"/>
+        </w:rPr>
+        <w:t>public jakyeamos-agentic-setup repository. Vendor-neutral context-management, workflow-routing, safety, evaluation, and durable-handoff contracts with a manifest-aware setup engine that preserves explicit dry-run/apply and public/private provenance boundaries.</w:t>
+      </w:r>
+    </w:p>
+    <w:p>
+      <w:pPr>
+        <w:spacing w:before="0" w:after="24" w:line="247" w:lineRule="auto"/>
+        <w:jc w:val="left"/>
+        <w:keepNext/>
+      </w:pPr>
+      <w:r>
+        <w:rPr>
+          <w:rFonts w:ascii="Calibri" w:hAnsi="Calibri"/>
+          <w:b/>
+          <w:i w:val="0"/>
+          <w:color w:val="2B4A6F"/>
+          <w:sz w:val="19"/>
+        </w:rPr>
+        <w:t>Context Compiler Contract</w:t>
+      </w:r>
+      <w:r>
+        <w:rPr>
+          <w:rFonts w:ascii="Calibri" w:hAnsi="Calibri"/>
+          <w:b w:val="0"/>
+          <w:i w:val="0"/>
+          <w:color w:val="5C6774"/>
+          <w:sz w:val="19"/>
+        </w:rPr>
+        <w:t xml:space="preserve"> — </w:t>
+      </w:r>
+      <w:r>
+        <w:rPr>
+          <w:rFonts w:ascii="Calibri" w:hAnsi="Calibri"/>
+          <w:b w:val="0"/>
+          <w:i w:val="0"/>
+          <w:color w:val="202328"/>
+          <w:sz w:val="18"/>
+        </w:rPr>
+        <w:t>public portable ESM validator package. Keeps AIOS context-compiler result and routing-manifest contracts independently testable while leaving source selection, ranking, receipt writing, and compilation runtime behavior with AIOS.</w:t>
+      </w:r>
+    </w:p>
+    <w:p>
+      <w:pPr>
+        <w:spacing w:before="140" w:after="80" w:line="240" w:lineRule="auto"/>
+        <w:jc w:val="left"/>
+        <w:pBdr>
+          <w:bottom w:val="single" w:sz="8" w:space="4" w:color="2B4A6F"/>
+        </w:pBdr>
+        <w:keepNext/>
+      </w:pPr>
+      <w:r>
+        <w:rPr>
+          <w:rFonts w:ascii="Calibri" w:hAnsi="Calibri"/>
+          <w:b/>
+          <w:i w:val="0"/>
+          <w:color w:val="182A44"/>
+          <w:sz w:val="23"/>
+        </w:rPr>
+        <w:t>CURRENT SYSTEMS &amp; RUNTIMES</w:t>
+      </w:r>
+    </w:p>
+    <w:p>
+      <w:pPr>
+        <w:spacing w:before="0" w:after="24" w:line="247" w:lineRule="auto"/>
+        <w:jc w:val="left"/>
+        <w:keepNext/>
+      </w:pPr>
+      <w:r>
+        <w:rPr>
+          <w:rFonts w:ascii="Calibri" w:hAnsi="Calibri"/>
+          <w:b/>
+          <w:i w:val="0"/>
+          <w:color w:val="2B4A6F"/>
+          <w:sz w:val="19"/>
+        </w:rPr>
+        <w:t>Agent Eval Runtime</w:t>
+      </w:r>
+      <w:r>
+        <w:rPr>
+          <w:rFonts w:ascii="Calibri" w:hAnsi="Calibri"/>
+          <w:b w:val="0"/>
+          <w:i w:val="0"/>
+          <w:color w:val="5C6774"/>
+          <w:sz w:val="19"/>
+        </w:rPr>
+        <w:t xml:space="preserve"> — </w:t>
+      </w:r>
+      <w:r>
+        <w:rPr>
+          <w:rFonts w:ascii="Calibri" w:hAnsi="Calibri"/>
+          <w:b w:val="0"/>
+          <w:i w:val="0"/>
+          <w:color w:val="202328"/>
+          <w:sz w:val="18"/>
+        </w:rPr>
+        <w:t>Standalone local runtime for eval runs, paired comparisons, model selection, harnesses, benchmarks, and corpus evidence; the first slice is report-only, read-only, and keeps empty evidence explicit. Stack: Python, SQLite.</w:t>
+      </w:r>
+    </w:p>
+    <w:p>
+      <w:pPr>
+        <w:spacing w:before="0" w:after="24" w:line="247" w:lineRule="auto"/>
+        <w:jc w:val="left"/>
+        <w:keepNext/>
+      </w:pPr>
+      <w:r>
+        <w:rPr>
+          <w:rFonts w:ascii="Calibri" w:hAnsi="Calibri"/>
+          <w:b/>
+          <w:i w:val="0"/>
+          <w:color w:val="2B4A6F"/>
+          <w:sz w:val="19"/>
+        </w:rPr>
+        <w:t>AI Context Runtime</w:t>
+      </w:r>
+      <w:r>
+        <w:rPr>
+          <w:rFonts w:ascii="Calibri" w:hAnsi="Calibri"/>
+          <w:b w:val="0"/>
+          <w:i w:val="0"/>
+          <w:color w:val="5C6774"/>
+          <w:sz w:val="19"/>
+        </w:rPr>
+        <w:t xml:space="preserve"> — </w:t>
+      </w:r>
+      <w:r>
+        <w:rPr>
+          <w:rFonts w:ascii="Calibri" w:hAnsi="Calibri"/>
+          <w:b w:val="0"/>
+          <w:i w:val="0"/>
+          <w:color w:val="202328"/>
+          <w:sz w:val="18"/>
+        </w:rPr>
+        <w:t>Standalone local runtime for context compilation, knowledge packets, handoffs, and report-only session intelligence; keeps private evidence separate from AIOS, stores append-only events, and exports versioned signals. Stack: Python, SQLite.</w:t>
+      </w:r>
+    </w:p>
+    <w:p>
+      <w:pPr>
+        <w:spacing w:before="0" w:after="24" w:line="247" w:lineRule="auto"/>
+        <w:jc w:val="left"/>
+        <w:keepNext/>
+      </w:pPr>
+      <w:r>
+        <w:rPr>
+          <w:rFonts w:ascii="Calibri" w:hAnsi="Calibri"/>
+          <w:b/>
+          <w:i w:val="0"/>
+          <w:color w:val="2B4A6F"/>
+          <w:sz w:val="19"/>
+        </w:rPr>
+        <w:t>AI Workflow Leverage</w:t>
+      </w:r>
+      <w:r>
+        <w:rPr>
+          <w:rFonts w:ascii="Calibri" w:hAnsi="Calibri"/>
+          <w:b w:val="0"/>
+          <w:i w:val="0"/>
+          <w:color w:val="5C6774"/>
+          <w:sz w:val="19"/>
+        </w:rPr>
+        <w:t xml:space="preserve"> — </w:t>
+      </w:r>
+      <w:r>
+        <w:rPr>
+          <w:rFonts w:ascii="Calibri" w:hAnsi="Calibri"/>
+          <w:b w:val="0"/>
+          <w:i w:val="0"/>
+          <w:color w:val="202328"/>
+          <w:sz w:val="18"/>
+        </w:rPr>
+        <w:t>Evidence-bounded local runtime for measuring cross-repository shipping leverage through bounded reproductions, review-gated execution, acceptance evidence, and redacted public projections; execution and automatic merge remain explicitly gated. Stack: Python, SQLite.</w:t>
+      </w:r>
+    </w:p>
+    <w:p>
+      <w:pPr>
+        <w:spacing w:before="0" w:after="24" w:line="247" w:lineRule="auto"/>
+        <w:jc w:val="left"/>
+        <w:keepNext/>
+      </w:pPr>
+      <w:r>
+        <w:rPr>
+          <w:rFonts w:ascii="Calibri" w:hAnsi="Calibri"/>
+          <w:b/>
+          <w:i w:val="0"/>
+          <w:color w:val="2B4A6F"/>
+          <w:sz w:val="19"/>
+        </w:rPr>
+        <w:t>macctl</w:t>
+      </w:r>
+      <w:r>
+        <w:rPr>
+          <w:rFonts w:ascii="Calibri" w:hAnsi="Calibri"/>
+          <w:b w:val="0"/>
+          <w:i w:val="0"/>
+          <w:color w:val="5C6774"/>
+          <w:sz w:val="19"/>
+        </w:rPr>
+        <w:t xml:space="preserve"> — </w:t>
+      </w:r>
+      <w:r>
+        <w:rPr>
+          <w:rFonts w:ascii="Calibri" w:hAnsi="Calibri"/>
+          <w:b w:val="0"/>
+          <w:i w:val="0"/>
+          <w:color w:val="202328"/>
+          <w:sz w:val="18"/>
+        </w:rPr>
+        <w:t>Command-first macOS control plane with an owner-only daemon, guarded GUI workflows, local receipts, and explicit accessibility, capture, approval, and fail-closed permission boundaries. Stack: Swift, AppKit, ApplicationServices.</w:t>
+      </w:r>
+    </w:p>
+    <w:p>
+      <w:pPr>
+        <w:spacing w:before="0" w:after="24" w:line="247" w:lineRule="auto"/>
+        <w:jc w:val="left"/>
+        <w:keepNext/>
+      </w:pPr>
+      <w:r>
+        <w:rPr>
+          <w:rFonts w:ascii="Calibri" w:hAnsi="Calibri"/>
+          <w:b/>
+          <w:i w:val="0"/>
+          <w:color w:val="2B4A6F"/>
+          <w:sz w:val="19"/>
+        </w:rPr>
+        <w:t>Marketing Autoresearch</w:t>
+      </w:r>
+      <w:r>
+        <w:rPr>
+          <w:rFonts w:ascii="Calibri" w:hAnsi="Calibri"/>
+          <w:b w:val="0"/>
+          <w:i w:val="0"/>
+          <w:color w:val="5C6774"/>
+          <w:sz w:val="19"/>
+        </w:rPr>
+        <w:t xml:space="preserve"> — </w:t>
+      </w:r>
+      <w:r>
+        <w:rPr>
+          <w:rFonts w:ascii="Calibri" w:hAnsi="Calibri"/>
+          <w:b w:val="0"/>
+          <w:i w:val="0"/>
+          <w:color w:val="202328"/>
+          <w:sz w:val="18"/>
+        </w:rPr>
+        <w:t>Evidence-bounded weekly SEO/AEO research loop with fixed prompts, source-freshness checks, shadow runs, and fail-closed publication guardrails; it proposes only deterministic, reviewable technical changes. Stack: TypeScript, Node.js.</w:t>
+      </w:r>
+    </w:p>
+    <w:p>
+      <w:pPr>
+        <w:spacing w:before="0" w:after="24" w:line="247" w:lineRule="auto"/>
+        <w:jc w:val="left"/>
+        <w:keepNext/>
+      </w:pPr>
+      <w:r>
+        <w:rPr>
+          <w:rFonts w:ascii="Calibri" w:hAnsi="Calibri"/>
+          <w:b/>
+          <w:i w:val="0"/>
+          <w:color w:val="2B4A6F"/>
+          <w:sz w:val="19"/>
+        </w:rPr>
+        <w:t>Relay</w:t>
+      </w:r>
+      <w:r>
+        <w:rPr>
+          <w:rFonts w:ascii="Calibri" w:hAnsi="Calibri"/>
+          <w:b w:val="0"/>
+          <w:i w:val="0"/>
+          <w:color w:val="5C6774"/>
+          <w:sz w:val="19"/>
+        </w:rPr>
+        <w:t xml:space="preserve"> — </w:t>
+      </w:r>
+      <w:r>
+        <w:rPr>
+          <w:rFonts w:ascii="Calibri" w:hAnsi="Calibri"/>
+          <w:b w:val="0"/>
+          <w:i w:val="0"/>
+          <w:color w:val="202328"/>
+          <w:sz w:val="18"/>
+        </w:rPr>
+        <w:t>Private, keyboard-first native macOS workbench for local AI coding workflows, combining session discovery, Playbook intelligence, Usage metrics, and guarded file transactions. Stack: Swift, AppKit, SQLite.</w:t>
+      </w:r>
+    </w:p>
+    <w:p>
+      <w:pPr>
+        <w:spacing w:before="0" w:after="24" w:line="247" w:lineRule="auto"/>
+        <w:jc w:val="left"/>
+        <w:keepNext/>
+      </w:pPr>
+      <w:r>
+        <w:rPr>
+          <w:rFonts w:ascii="Calibri" w:hAnsi="Calibri"/>
+          <w:b/>
+          <w:i w:val="0"/>
+          <w:color w:val="2B4A6F"/>
+          <w:sz w:val="19"/>
+        </w:rPr>
+        <w:t>Agent Router (planning-only)</w:t>
+      </w:r>
+      <w:r>
+        <w:rPr>
+          <w:rFonts w:ascii="Calibri" w:hAnsi="Calibri"/>
+          <w:b w:val="0"/>
+          <w:i w:val="0"/>
+          <w:color w:val="5C6774"/>
+          <w:sz w:val="19"/>
+        </w:rPr>
+        <w:t xml:space="preserve"> — </w:t>
+      </w:r>
+      <w:r>
+        <w:rPr>
+          <w:rFonts w:ascii="Calibri" w:hAnsi="Calibri"/>
+          <w:b w:val="0"/>
+          <w:i w:val="0"/>
+          <w:color w:val="202328"/>
+          <w:sz w:val="18"/>
+        </w:rPr>
+        <w:t>Foundation-phase adaptive-routing workspace for routing contracts, replayable planning cases, capability-aligned decomposition, and unknown-safe usage probes; not yet an approved accomplishment claim. Stack: TypeScript, SQLite.</w:t>
+      </w:r>
+    </w:p>
+    <w:p>
+      <w:pPr>
+        <w:spacing w:before="140" w:after="80" w:line="240" w:lineRule="auto"/>
+        <w:jc w:val="left"/>
+        <w:pBdr>
+          <w:bottom w:val="single" w:sz="8" w:space="4" w:color="2B4A6F"/>
+        </w:pBdr>
+        <w:keepNext/>
+      </w:pPr>
+      <w:r>
+        <w:rPr>
+          <w:rFonts w:ascii="Calibri" w:hAnsi="Calibri"/>
+          <w:b/>
+          <w:i w:val="0"/>
+          <w:color w:val="182A44"/>
+          <w:sz w:val="23"/>
+        </w:rPr>
+        <w:t>PROJECTS</w:t>
+      </w:r>
+    </w:p>
+    <w:p>
+      <w:pPr>
+        <w:spacing w:before="0" w:after="24" w:line="247" w:lineRule="auto"/>
+        <w:jc w:val="left"/>
+        <w:keepNext/>
+      </w:pPr>
+      <w:r>
+        <w:rPr>
+          <w:rFonts w:ascii="Calibri" w:hAnsi="Calibri"/>
+          <w:b/>
+          <w:i w:val="0"/>
+          <w:color w:val="2B4A6F"/>
+          <w:sz w:val="19"/>
+        </w:rPr>
+        <w:t>Tenure | LaunchNY Cohort Venture | AI Knowledge Platform</w:t>
+      </w:r>
+      <w:r>
+        <w:rPr>
+          <w:rFonts w:ascii="Calibri" w:hAnsi="Calibri"/>
+          <w:b w:val="0"/>
+          <w:i w:val="0"/>
+          <w:color w:val="5C6774"/>
+          <w:sz w:val="19"/>
+        </w:rPr>
+        <w:t xml:space="preserve"> — </w:t>
+      </w:r>
+      <w:r>
+        <w:rPr>
+          <w:rFonts w:ascii="Calibri" w:hAnsi="Calibri"/>
+          <w:b w:val="0"/>
+          <w:i w:val="0"/>
+          <w:color w:val="202328"/>
+          <w:sz w:val="18"/>
+        </w:rPr>
+        <w:t>Built a pilot-ready platform that turns specialist-led knowledge capture into reviewed SOPs, a permissioned organizational wiki, cited Q&amp;A, and process intelligence reports. Implemented a Next.js/TypeScript and Supabase/PostgreSQL system with row-level security, transcription, LLM extraction, hybrid vector/full-text retrieval, and human review gates; pre-pilot hardening is underway.</w:t>
+      </w:r>
+      <w:r>
+        <w:rPr>
+          <w:rFonts w:ascii="Calibri" w:hAnsi="Calibri"/>
+          <w:b w:val="0"/>
+          <w:i/>
+          <w:color w:val="5C6774"/>
+          <w:sz w:val="17"/>
+        </w:rPr>
+        <w:t xml:space="preserve">  Stack: Next.js, TypeScript, Supabase/PostgreSQL, Row Level Security, Inngest, AssemblyAI, Anthropic/Gemini/VoyageAI, pgvector, OpenTelemetry/Arize, Playwright/Vitest/pgTAP/promptfoo.</w:t>
+      </w:r>
+    </w:p>
+    <w:p>
+      <w:pPr>
+        <w:spacing w:before="0" w:after="24" w:line="247" w:lineRule="auto"/>
+        <w:jc w:val="left"/>
+        <w:keepNext/>
+      </w:pPr>
+      <w:r>
+        <w:rPr>
+          <w:rFonts w:ascii="Calibri" w:hAnsi="Calibri"/>
+          <w:b/>
+          <w:i w:val="0"/>
+          <w:color w:val="2B4A6F"/>
+          <w:sz w:val="19"/>
+        </w:rPr>
+        <w:t>BidCamp | Multi-Tenant Government-Contracting SaaS</w:t>
+      </w:r>
+      <w:r>
+        <w:rPr>
+          <w:rFonts w:ascii="Calibri" w:hAnsi="Calibri"/>
+          <w:b w:val="0"/>
+          <w:i w:val="0"/>
+          <w:color w:val="5C6774"/>
+          <w:sz w:val="19"/>
+        </w:rPr>
+        <w:t xml:space="preserve"> — </w:t>
+      </w:r>
+      <w:r>
+        <w:rPr>
+          <w:rFonts w:ascii="Calibri" w:hAnsi="Calibri"/>
+          <w:b w:val="0"/>
+          <w:i w:val="0"/>
+          <w:color w:val="202328"/>
+          <w:sz w:val="18"/>
+        </w:rPr>
+        <w:t>Built a live closed-beta platform for MBE/MWBE firms with Claude-powered RFP analysis and proposal drafting, procurement intelligence, client and prime workflows, and human-reviewed weekly digests. Implemented multi-tenant Next.js and Supabase/PostgreSQL architecture with RLS, Stripe, Resend, PostGrid, scheduled jobs, and a GitHub scraping worker.</w:t>
+      </w:r>
+      <w:r>
+        <w:rPr>
+          <w:rFonts w:ascii="Calibri" w:hAnsi="Calibri"/>
+          <w:b w:val="0"/>
+          <w:i/>
+          <w:color w:val="5C6774"/>
+          <w:sz w:val="17"/>
+        </w:rPr>
+        <w:t xml:space="preserve">  Stack: Next.js, TypeScript, Supabase/PostgreSQL, RLS, Stripe, Resend, PostGrid, Vercel, pg_cron, GitHub Actions.</w:t>
+      </w:r>
+    </w:p>
+    <w:p>
+      <w:pPr>
+        <w:spacing w:before="0" w:after="24" w:line="247" w:lineRule="auto"/>
+        <w:jc w:val="left"/>
+        <w:keepNext/>
+      </w:pPr>
+      <w:r>
+        <w:rPr>
+          <w:rFonts w:ascii="Calibri" w:hAnsi="Calibri"/>
+          <w:b/>
+          <w:i w:val="0"/>
+          <w:color w:val="2B4A6F"/>
+          <w:sz w:val="19"/>
+        </w:rPr>
+        <w:t>Quality Runner | Python CLI and MCP Server</w:t>
+      </w:r>
+      <w:r>
+        <w:rPr>
+          <w:rFonts w:ascii="Calibri" w:hAnsi="Calibri"/>
+          <w:b w:val="0"/>
+          <w:i w:val="0"/>
+          <w:color w:val="5C6774"/>
+          <w:sz w:val="19"/>
+        </w:rPr>
+        <w:t xml:space="preserve"> — </w:t>
+      </w:r>
+      <w:r>
+        <w:rPr>
+          <w:rFonts w:ascii="Calibri" w:hAnsi="Calibri"/>
+          <w:b w:val="0"/>
+          <w:i w:val="0"/>
+          <w:color w:val="202328"/>
+          <w:sz w:val="18"/>
+        </w:rPr>
+        <w:t>Built and published a local-first quality orchestrator that compiles standards, detects available checks, normalizes evidence-backed findings, and writes versioned artifacts plus ordered remediation plans. Designed the read-only CLI/MCP workflow so agents and engineers can review evidence before making source changes.</w:t>
+      </w:r>
+      <w:r>
+        <w:rPr>
+          <w:rFonts w:ascii="Calibri" w:hAnsi="Calibri"/>
+          <w:b w:val="0"/>
+          <w:i/>
+          <w:color w:val="5C6774"/>
+          <w:sz w:val="17"/>
+        </w:rPr>
+        <w:t xml:space="preserve">  Stack: Python, CLI, MCP.</w:t>
+      </w:r>
+    </w:p>
+    <w:p>
+      <w:pPr>
+        <w:spacing w:before="0" w:after="24" w:line="247" w:lineRule="auto"/>
+        <w:jc w:val="left"/>
+        <w:keepNext/>
+      </w:pPr>
+      <w:r>
+        <w:rPr>
+          <w:rFonts w:ascii="Calibri" w:hAnsi="Calibri"/>
+          <w:b/>
+          <w:i w:val="0"/>
+          <w:color w:val="2B4A6F"/>
+          <w:sz w:val="19"/>
+        </w:rPr>
+        <w:t>AIOS | Local-First Operating Layer for Agent Work</w:t>
+      </w:r>
+      <w:r>
+        <w:rPr>
+          <w:rFonts w:ascii="Calibri" w:hAnsi="Calibri"/>
+          <w:b w:val="0"/>
+          <w:i w:val="0"/>
+          <w:color w:val="5C6774"/>
+          <w:sz w:val="19"/>
+        </w:rPr>
+        <w:t xml:space="preserve"> — </w:t>
+      </w:r>
+      <w:r>
+        <w:rPr>
+          <w:rFonts w:ascii="Calibri" w:hAnsi="Calibri"/>
+          <w:b w:val="0"/>
+          <w:i w:val="0"/>
+          <w:color w:val="202328"/>
+          <w:sz w:val="18"/>
+        </w:rPr>
+        <w:t>Designed a local-first operating system for agent work: session-lifecycle hooks capture events at session boundaries into a SQLite-backed event store. Built a project-memory model that separates raw automation artifacts from human-reviewed notes, treating Git repos as source of truth; documented as a public engineering case study.</w:t>
+      </w:r>
+      <w:r>
+        <w:rPr>
+          <w:rFonts w:ascii="Calibri" w:hAnsi="Calibri"/>
+          <w:b w:val="0"/>
+          <w:i/>
+          <w:color w:val="5C6774"/>
+          <w:sz w:val="17"/>
+        </w:rPr>
+        <w:t xml:space="preserve">  Stack: Python, SQLite, Next.js.</w:t>
+      </w:r>
+    </w:p>
+    <w:p>
+      <w:pPr>
+        <w:spacing w:before="0" w:after="24" w:line="247" w:lineRule="auto"/>
+        <w:jc w:val="left"/>
+        <w:keepNext/>
+      </w:pPr>
+      <w:r>
+        <w:rPr>
+          <w:rFonts w:ascii="Calibri" w:hAnsi="Calibri"/>
+          <w:b/>
+          <w:i w:val="0"/>
+          <w:color w:val="2B4A6F"/>
+          <w:sz w:val="19"/>
+        </w:rPr>
+        <w:t>CrimClock | Legal Time Intelligence Platform</w:t>
+      </w:r>
+      <w:r>
+        <w:rPr>
+          <w:rFonts w:ascii="Calibri" w:hAnsi="Calibri"/>
+          <w:b w:val="0"/>
+          <w:i w:val="0"/>
+          <w:color w:val="5C6774"/>
+          <w:sz w:val="19"/>
+        </w:rPr>
+        <w:t xml:space="preserve"> — </w:t>
+      </w:r>
+      <w:r>
+        <w:rPr>
+          <w:rFonts w:ascii="Calibri" w:hAnsi="Calibri"/>
+          <w:b w:val="0"/>
+          <w:i w:val="0"/>
+          <w:color w:val="202328"/>
+          <w:sz w:val="18"/>
+        </w:rPr>
+        <w:t>Built a neutral platform for procedural timing, sentencing, parole eligibility, custody impact, risk indicators, and plain-language explanations for legal and public-service audiences. Implemented explainable calculation outputs with statutes, rule configuration, exclusions, tolling, calculation steps, and disclaimer language. Product build / reviewer preview; never implies legal advice or established customer adoption.</w:t>
+      </w:r>
+      <w:r>
+        <w:rPr>
+          <w:rFonts w:ascii="Calibri" w:hAnsi="Calibri"/>
+          <w:b w:val="0"/>
+          <w:i/>
+          <w:color w:val="5C6774"/>
+          <w:sz w:val="17"/>
+        </w:rPr>
+        <w:t xml:space="preserve">  Stack: Next.js, TypeScript, Tailwind, FastAPI, Python, SQLAlchemy, Alembic, PostgreSQL, Supabase, Vercel, Railway/Render, Docker, GitHub Actions.</w:t>
+      </w:r>
+    </w:p>
+    <w:p>
+      <w:pPr>
+        <w:spacing w:before="0" w:after="24" w:line="247" w:lineRule="auto"/>
+        <w:jc w:val="left"/>
+        <w:keepNext/>
+      </w:pPr>
+      <w:r>
+        <w:rPr>
+          <w:rFonts w:ascii="Calibri" w:hAnsi="Calibri"/>
+          <w:b/>
+          <w:i w:val="0"/>
+          <w:color w:val="2B4A6F"/>
+          <w:sz w:val="19"/>
+        </w:rPr>
+        <w:t>Hoopscout | Basketball Recruiting Intelligence</w:t>
+      </w:r>
+      <w:r>
+        <w:rPr>
+          <w:rFonts w:ascii="Calibri" w:hAnsi="Calibri"/>
+          <w:b w:val="0"/>
+          <w:i w:val="0"/>
+          <w:color w:val="5C6774"/>
+          <w:sz w:val="19"/>
+        </w:rPr>
+        <w:t xml:space="preserve"> — </w:t>
+      </w:r>
+      <w:r>
+        <w:rPr>
+          <w:rFonts w:ascii="Calibri" w:hAnsi="Calibri"/>
+          <w:b w:val="0"/>
+          <w:i w:val="0"/>
+          <w:color w:val="202328"/>
+          <w:sz w:val="18"/>
+        </w:rPr>
+        <w:t>Built a coach-facing recruiting workflow for verified coach search, athlete profile review, coach-specific fit weighting, ranked school-fit signals, messaging, transcript controls, and trust operations. Implemented deterministic seeded private-beta flows with moderation controls and coach-specific evaluation weights across academics, shooting, production, size, geography, and readiness. Private beta.</w:t>
+      </w:r>
+      <w:r>
+        <w:rPr>
+          <w:rFonts w:ascii="Calibri" w:hAnsi="Calibri"/>
+          <w:b w:val="0"/>
+          <w:i/>
+          <w:color w:val="5C6774"/>
+          <w:sz w:val="17"/>
+        </w:rPr>
+        <w:t xml:space="preserve">  Stack: Prisma, PostgreSQL, Next.js.</w:t>
+      </w:r>
+    </w:p>
+    <w:p>
+      <w:pPr>
+        <w:spacing w:before="0" w:after="24" w:line="247" w:lineRule="auto"/>
+        <w:jc w:val="left"/>
+        <w:keepNext/>
+      </w:pPr>
+      <w:r>
+        <w:rPr>
+          <w:rFonts w:ascii="Calibri" w:hAnsi="Calibri"/>
+          <w:b/>
+          <w:i w:val="0"/>
+          <w:color w:val="2B4A6F"/>
+          <w:sz w:val="19"/>
+        </w:rPr>
+        <w:t>RemodelVision | AI Remodeling Visualization and Estimation</w:t>
+      </w:r>
+      <w:r>
+        <w:rPr>
+          <w:rFonts w:ascii="Calibri" w:hAnsi="Calibri"/>
+          <w:b w:val="0"/>
+          <w:i w:val="0"/>
+          <w:color w:val="5C6774"/>
+          <w:sz w:val="19"/>
+        </w:rPr>
+        <w:t xml:space="preserve"> — </w:t>
+      </w:r>
+      <w:r>
+        <w:rPr>
+          <w:rFonts w:ascii="Calibri" w:hAnsi="Calibri"/>
+          <w:b w:val="0"/>
+          <w:i w:val="0"/>
+          <w:color w:val="202328"/>
+          <w:sz w:val="18"/>
+        </w:rPr>
+        <w:t>Built a photo-to-visualization and rough-cost-estimation workflow using Claude vision and fal.ai image transformation services. Implemented a Next.js/TypeScript product with an agent coordinator, visual assessor, authenticated dashboard, uploads, model selection, and persisted project views. Core analysis and visualization paths work; full save flow and additional specialist agents remain incomplete.</w:t>
+      </w:r>
+      <w:r>
+        <w:rPr>
+          <w:rFonts w:ascii="Calibri" w:hAnsi="Calibri"/>
+          <w:b w:val="0"/>
+          <w:i/>
+          <w:color w:val="5C6774"/>
+          <w:sz w:val="17"/>
+        </w:rPr>
+        <w:t xml:space="preserve">  Stack: Next.js, TypeScript, Supabase/PostgreSQL, Prisma, Clerk, fal.ai.</w:t>
+      </w:r>
+    </w:p>
+    <w:p>
+      <w:pPr>
+        <w:spacing w:before="0" w:after="24" w:line="247" w:lineRule="auto"/>
+        <w:jc w:val="left"/>
+        <w:keepNext/>
+      </w:pPr>
+      <w:r>
+        <w:rPr>
+          <w:rFonts w:ascii="Calibri" w:hAnsi="Calibri"/>
+          <w:b/>
+          <w:i w:val="0"/>
+          <w:color w:val="2B4A6F"/>
+          <w:sz w:val="19"/>
+        </w:rPr>
+        <w:t>EliHealth | Mobile Health and Recovery Data Product</w:t>
+      </w:r>
+      <w:r>
+        <w:rPr>
+          <w:rFonts w:ascii="Calibri" w:hAnsi="Calibri"/>
+          <w:b w:val="0"/>
+          <w:i w:val="0"/>
+          <w:color w:val="5C6774"/>
+          <w:sz w:val="19"/>
+        </w:rPr>
+        <w:t xml:space="preserve"> — </w:t>
+      </w:r>
+      <w:r>
+        <w:rPr>
+          <w:rFonts w:ascii="Calibri" w:hAnsi="Calibri"/>
+          <w:b w:val="0"/>
+          <w:i w:val="0"/>
+          <w:color w:val="202328"/>
+          <w:sz w:val="18"/>
+        </w:rPr>
+        <w:t>Built a private, mobile-first health/recovery data product with authenticated data capture, lab imports, and human verification. Implemented Health Connect integration and explicit non-diagnostic boundaries throughout the product surface.</w:t>
+      </w:r>
+      <w:r>
+        <w:rPr>
+          <w:rFonts w:ascii="Calibri" w:hAnsi="Calibri"/>
+          <w:b w:val="0"/>
+          <w:i/>
+          <w:color w:val="5C6774"/>
+          <w:sz w:val="17"/>
+        </w:rPr>
+        <w:t xml:space="preserve">  Stack: Expo/React Native, Supabase/PostgreSQL, Auth/RLS/Storage, Health Connect.</w:t>
+      </w:r>
+    </w:p>
+    <w:p>
+      <w:pPr>
+        <w:spacing w:before="0" w:after="24" w:line="247" w:lineRule="auto"/>
+        <w:jc w:val="left"/>
+        <w:keepNext/>
+      </w:pPr>
+      <w:r>
+        <w:rPr>
+          <w:rFonts w:ascii="Calibri" w:hAnsi="Calibri"/>
+          <w:b/>
+          <w:i w:val="0"/>
+          <w:color w:val="2B4A6F"/>
+          <w:sz w:val="19"/>
+        </w:rPr>
+        <w:t>Chiron's Forge | Live Multi-Model AI Research Product</w:t>
+      </w:r>
+      <w:r>
+        <w:rPr>
+          <w:rFonts w:ascii="Calibri" w:hAnsi="Calibri"/>
+          <w:b w:val="0"/>
+          <w:i w:val="0"/>
+          <w:color w:val="5C6774"/>
+          <w:sz w:val="19"/>
+        </w:rPr>
+        <w:t xml:space="preserve"> — </w:t>
+      </w:r>
+      <w:r>
+        <w:rPr>
+          <w:rFonts w:ascii="Calibri" w:hAnsi="Calibri"/>
+          <w:b w:val="0"/>
+          <w:i w:val="0"/>
+          <w:color w:val="202328"/>
+          <w:sz w:val="18"/>
+        </w:rPr>
+        <w:t>Built a live applied-AI product that runs multi-model research, synthesis, independent judging, and refinement into skill files, research reports, and Cursor rules. Used as product/AI-workflow proof; hosts Framework Labs' Concordia reasoning engine in production. Site: chironsforge.com</w:t>
+      </w:r>
+    </w:p>
+    <w:p>
+      <w:pPr>
+        <w:spacing w:before="0" w:after="24" w:line="247" w:lineRule="auto"/>
+        <w:jc w:val="left"/>
+        <w:keepNext/>
+      </w:pPr>
+      <w:r>
+        <w:rPr>
+          <w:rFonts w:ascii="Calibri" w:hAnsi="Calibri"/>
+          <w:b/>
+          <w:i w:val="0"/>
+          <w:color w:val="2B4A6F"/>
+          <w:sz w:val="19"/>
+        </w:rPr>
+        <w:t>Framework Labs | Public Software Research Lab</w:t>
+      </w:r>
+      <w:r>
+        <w:rPr>
+          <w:rFonts w:ascii="Calibri" w:hAnsi="Calibri"/>
+          <w:b w:val="0"/>
+          <w:i w:val="0"/>
+          <w:color w:val="5C6774"/>
+          <w:sz w:val="19"/>
+        </w:rPr>
+        <w:t xml:space="preserve"> — </w:t>
+      </w:r>
+      <w:r>
+        <w:rPr>
+          <w:rFonts w:ascii="Calibri" w:hAnsi="Calibri"/>
+          <w:b w:val="0"/>
+          <w:i w:val="0"/>
+          <w:color w:val="202328"/>
+          <w:sz w:val="18"/>
+        </w:rPr>
+        <w:t>Built a public software research lab producing standalone reasoning engines: Concordia (in production at Chiron's Forge) and Continuum (in production at Tenure Systems) are live; Praxis is in development. Site: frmwrklabs.com</w:t>
+      </w:r>
+    </w:p>
+    <w:p>
+      <w:pPr>
+        <w:spacing w:before="0" w:after="24" w:line="247" w:lineRule="auto"/>
+        <w:jc w:val="left"/>
+        <w:keepNext/>
+      </w:pPr>
+      <w:r>
+        <w:rPr>
+          <w:rFonts w:ascii="Calibri" w:hAnsi="Calibri"/>
+          <w:b/>
+          <w:i w:val="0"/>
+          <w:color w:val="2B4A6F"/>
+          <w:sz w:val="19"/>
+        </w:rPr>
+        <w:t>Career-Ops | Local Career Evidence and Application Command Center</w:t>
+      </w:r>
+      <w:r>
+        <w:rPr>
+          <w:rFonts w:ascii="Calibri" w:hAnsi="Calibri"/>
+          <w:b w:val="0"/>
+          <w:i w:val="0"/>
+          <w:color w:val="5C6774"/>
+          <w:sz w:val="19"/>
+        </w:rPr>
+        <w:t xml:space="preserve"> — </w:t>
+      </w:r>
+      <w:r>
+        <w:rPr>
+          <w:rFonts w:ascii="Calibri" w:hAnsi="Calibri"/>
+          <w:b w:val="0"/>
+          <w:i w:val="0"/>
+          <w:color w:val="202328"/>
+          <w:sz w:val="18"/>
+        </w:rPr>
+        <w:t>Built and maintain a human-controlled local workflow that ranks verified roles, generates evidence-bound application artifacts, tracks freshness and outreach, and keeps public project proof claim-safe. Generated copy and queued roles remain review inputs, not submitted applications.</w:t>
+      </w:r>
+    </w:p>
+    <w:p>
+      <w:pPr>
+        <w:spacing w:before="0" w:after="24" w:line="247" w:lineRule="auto"/>
+        <w:jc w:val="left"/>
+        <w:keepNext/>
+      </w:pPr>
+      <w:r>
+        <w:rPr>
+          <w:rFonts w:ascii="Calibri" w:hAnsi="Calibri"/>
+          <w:b/>
+          <w:i w:val="0"/>
+          <w:color w:val="2B4A6F"/>
+          <w:sz w:val="19"/>
+        </w:rPr>
+        <w:t>Pronto | Local-First Portfolio Command Center</w:t>
+      </w:r>
+      <w:r>
+        <w:rPr>
+          <w:rFonts w:ascii="Calibri" w:hAnsi="Calibri"/>
+          <w:b w:val="0"/>
+          <w:i w:val="0"/>
+          <w:color w:val="5C6774"/>
+          <w:sz w:val="19"/>
+        </w:rPr>
+        <w:t xml:space="preserve"> — </w:t>
+      </w:r>
+      <w:r>
+        <w:rPr>
+          <w:rFonts w:ascii="Calibri" w:hAnsi="Calibri"/>
+          <w:b w:val="0"/>
+          <w:i w:val="0"/>
+          <w:color w:val="202328"/>
+          <w:sz w:val="18"/>
+        </w:rPr>
+        <w:t>Built and validated a public v1 desktop command center for Git repositories, with repository and worktree discovery, structured quality evidence, CI-readiness signals, provider-neutral GitHub snapshots, and remediation/release preparation previews. Implemented a Tauri and React/TypeScript desktop surface with Rust and SQLite persistence, explicit repository/root scope, read-only refresh and provider boundaries, and audited blocked actions.</w:t>
+      </w:r>
+      <w:r>
+        <w:rPr>
+          <w:rFonts w:ascii="Calibri" w:hAnsi="Calibri"/>
+          <w:b w:val="0"/>
+          <w:i/>
+          <w:color w:val="5C6774"/>
+          <w:sz w:val="17"/>
+        </w:rPr>
+        <w:t xml:space="preserve">  Stack: Tauri, React, TypeScript, Rust, SQLite.</w:t>
+      </w:r>
+    </w:p>
+    <w:p>
+      <w:pPr>
+        <w:spacing w:before="0" w:after="24" w:line="247" w:lineRule="auto"/>
+        <w:jc w:val="left"/>
+        <w:keepNext/>
+      </w:pPr>
+      <w:r>
+        <w:rPr>
+          <w:rFonts w:ascii="Calibri" w:hAnsi="Calibri"/>
+          <w:b/>
+          <w:i w:val="0"/>
+          <w:color w:val="2B4A6F"/>
+          <w:sz w:val="19"/>
+        </w:rPr>
+        <w:t>Participant Deduplication | Google Sheets Review Workflow</w:t>
+      </w:r>
+      <w:r>
+        <w:rPr>
+          <w:rFonts w:ascii="Calibri" w:hAnsi="Calibri"/>
+          <w:b w:val="0"/>
+          <w:i w:val="0"/>
+          <w:color w:val="5C6774"/>
+          <w:sz w:val="19"/>
+        </w:rPr>
+        <w:t xml:space="preserve"> — </w:t>
+      </w:r>
+      <w:r>
+        <w:rPr>
+          <w:rFonts w:ascii="Calibri" w:hAnsi="Calibri"/>
+          <w:b w:val="0"/>
+          <w:i w:val="0"/>
+          <w:color w:val="202328"/>
+          <w:sz w:val="18"/>
+        </w:rPr>
+        <w:t>Built a container-bound Google Apps Script that finds fuzzy duplicate participant rows, gives reviewers explicit keep/delete decisions, and applies confirmed changes atomically with an audit trail. Kept matching and apply boundaries explicit: large-sheet matching runs through an owned Railway backend, review/apply stays in the spreadsheet sidebar, and participant data is not stored in the repository.</w:t>
+      </w:r>
+      <w:r>
+        <w:rPr>
+          <w:rFonts w:ascii="Calibri" w:hAnsi="Calibri"/>
+          <w:b w:val="0"/>
+          <w:i/>
+          <w:color w:val="5C6774"/>
+          <w:sz w:val="17"/>
+        </w:rPr>
+        <w:t xml:space="preserve">  Stack: TypeScript, Google Apps Script, Google Sheets, Railway.</w:t>
+      </w:r>
+    </w:p>
+    <w:p>
+      <w:pPr>
+        <w:spacing w:before="0" w:after="24" w:line="247" w:lineRule="auto"/>
+        <w:jc w:val="left"/>
+        <w:keepNext/>
+      </w:pPr>
+      <w:r>
+        <w:rPr>
+          <w:rFonts w:ascii="Calibri" w:hAnsi="Calibri"/>
+          <w:b/>
+          <w:i w:val="0"/>
+          <w:color w:val="2B4A6F"/>
+          <w:sz w:val="19"/>
+        </w:rPr>
+        <w:t>Soundscape | Full-Stack Music Social Platform</w:t>
+      </w:r>
+      <w:r>
+        <w:rPr>
+          <w:rFonts w:ascii="Calibri" w:hAnsi="Calibri"/>
+          <w:b w:val="0"/>
+          <w:i w:val="0"/>
+          <w:color w:val="5C6774"/>
+          <w:sz w:val="19"/>
+        </w:rPr>
+        <w:t xml:space="preserve"> — </w:t>
+      </w:r>
+      <w:r>
+        <w:rPr>
+          <w:rFonts w:ascii="Calibri" w:hAnsi="Calibri"/>
+          <w:b w:val="0"/>
+          <w:i w:val="0"/>
+          <w:color w:val="202328"/>
+          <w:sz w:val="18"/>
+        </w:rPr>
+        <w:t>Built a typed monorepo delivering ratings, discovery, a social feed, community concerts and blogs, mobile listening flows, shareable ranking cards, and provider integrations across web and mobile.</w:t>
+      </w:r>
+      <w:r>
+        <w:rPr>
+          <w:rFonts w:ascii="Calibri" w:hAnsi="Calibri"/>
+          <w:b w:val="0"/>
+          <w:i/>
+          <w:color w:val="5C6774"/>
+          <w:sz w:val="17"/>
+        </w:rPr>
+        <w:t xml:space="preserve">  Stack: Next.js, tRPC, Prisma, PostgreSQL, Redis, Expo.</w:t>
+      </w:r>
+    </w:p>
+    <w:p>
+      <w:pPr>
+        <w:spacing w:before="0" w:after="24" w:line="247" w:lineRule="auto"/>
+        <w:jc w:val="left"/>
+        <w:keepNext/>
+      </w:pPr>
+      <w:r>
+        <w:rPr>
+          <w:rFonts w:ascii="Calibri" w:hAnsi="Calibri"/>
+          <w:b/>
+          <w:i w:val="0"/>
+          <w:color w:val="2B4A6F"/>
+          <w:sz w:val="19"/>
+        </w:rPr>
+        <w:t>Dispatches from Cyberspace | Full-Stack Publishing Platform</w:t>
+      </w:r>
+      <w:r>
+        <w:rPr>
+          <w:rFonts w:ascii="Calibri" w:hAnsi="Calibri"/>
+          <w:b w:val="0"/>
+          <w:i w:val="0"/>
+          <w:color w:val="5C6774"/>
+          <w:sz w:val="19"/>
+        </w:rPr>
+        <w:t xml:space="preserve"> — </w:t>
+      </w:r>
+      <w:r>
+        <w:rPr>
+          <w:rFonts w:ascii="Calibri" w:hAnsi="Calibri"/>
+          <w:b w:val="0"/>
+          <w:i w:val="0"/>
+          <w:color w:val="202328"/>
+          <w:sz w:val="18"/>
+        </w:rPr>
+        <w:t>Built a full-stack publishing platform with authenticated authoring, draft/published workflows, revision history, comments, reactions, feeds, JSON Feed, sitemap generation, upload boundaries, and health/readiness checks.</w:t>
+      </w:r>
+      <w:r>
+        <w:rPr>
+          <w:rFonts w:ascii="Calibri" w:hAnsi="Calibri"/>
+          <w:b w:val="0"/>
+          <w:i/>
+          <w:color w:val="5C6774"/>
+          <w:sz w:val="17"/>
+        </w:rPr>
+        <w:t xml:space="preserve">  Stack: TypeScript, Vite, Postgres, Clerk, Hono, Turbo.</w:t>
+      </w:r>
+    </w:p>
+    <w:p>
+      <w:pPr>
+        <w:spacing w:before="0" w:after="24" w:line="247" w:lineRule="auto"/>
+        <w:jc w:val="left"/>
+        <w:keepNext/>
+      </w:pPr>
+      <w:r>
+        <w:rPr>
+          <w:rFonts w:ascii="Calibri" w:hAnsi="Calibri"/>
+          <w:b/>
+          <w:i w:val="0"/>
+          <w:color w:val="2B4A6F"/>
+          <w:sz w:val="19"/>
+        </w:rPr>
+        <w:t>Court Vision (Bball) | Basketball IQ Training Platform</w:t>
+      </w:r>
+      <w:r>
+        <w:rPr>
+          <w:rFonts w:ascii="Calibri" w:hAnsi="Calibri"/>
+          <w:b w:val="0"/>
+          <w:i w:val="0"/>
+          <w:color w:val="5C6774"/>
+          <w:sz w:val="19"/>
+        </w:rPr>
+        <w:t xml:space="preserve"> — </w:t>
+      </w:r>
+      <w:r>
+        <w:rPr>
+          <w:rFonts w:ascii="Calibri" w:hAnsi="Calibri"/>
+          <w:b w:val="0"/>
+          <w:i w:val="0"/>
+          <w:color w:val="202328"/>
+          <w:sz w:val="18"/>
+        </w:rPr>
+        <w:t>Built a basketball IQ training platform with lessons, daily challenges, draft/offseason simulations, and real-time flows.</w:t>
+      </w:r>
+      <w:r>
+        <w:rPr>
+          <w:rFonts w:ascii="Calibri" w:hAnsi="Calibri"/>
+          <w:b w:val="0"/>
+          <w:i/>
+          <w:color w:val="5C6774"/>
+          <w:sz w:val="17"/>
+        </w:rPr>
+        <w:t xml:space="preserve">  Stack: React, Node/Express, Socket.io, Monte Carlo simulation.</w:t>
+      </w:r>
+    </w:p>
+    <w:p>
+      <w:pPr>
+        <w:spacing w:before="0" w:after="24" w:line="247" w:lineRule="auto"/>
+        <w:jc w:val="left"/>
+        <w:keepNext/>
+      </w:pPr>
+      <w:r>
+        <w:rPr>
+          <w:rFonts w:ascii="Calibri" w:hAnsi="Calibri"/>
+          <w:b/>
+          <w:i w:val="0"/>
+          <w:color w:val="2B4A6F"/>
+          <w:sz w:val="19"/>
+        </w:rPr>
+        <w:t>BBDSE / CourtIQ | Basketball Analytics Research Suite</w:t>
+      </w:r>
+      <w:r>
+        <w:rPr>
+          <w:rFonts w:ascii="Calibri" w:hAnsi="Calibri"/>
+          <w:b w:val="0"/>
+          <w:i w:val="0"/>
+          <w:color w:val="5C6774"/>
+          <w:sz w:val="19"/>
+        </w:rPr>
+        <w:t xml:space="preserve"> — </w:t>
+      </w:r>
+      <w:r>
+        <w:rPr>
+          <w:rFonts w:ascii="Calibri" w:hAnsi="Calibri"/>
+          <w:b w:val="0"/>
+          <w:i w:val="0"/>
+          <w:color w:val="202328"/>
+          <w:sz w:val="18"/>
+        </w:rPr>
+        <w:t>Built a basketball-analytics research and product workspace covering player evaluation, roster tools, draft signals, lineup context, coach value, and a merged CourtIQ/Court Vision draft-room runtime; absorbed the former LaxDS pro-lacrosse analytics scaffold for reusable ingestion and modeling workflows. Public Vercel deployment paused on 2026-07-10; the GitHub repository remains public.</w:t>
+      </w:r>
+      <w:r>
+        <w:rPr>
+          <w:rFonts w:ascii="Calibri" w:hAnsi="Calibri"/>
+          <w:b w:val="0"/>
+          <w:i/>
+          <w:color w:val="5C6774"/>
+          <w:sz w:val="17"/>
+        </w:rPr>
+        <w:t xml:space="preserve">  Stack: Python, R, Next.js.</w:t>
+      </w:r>
+    </w:p>
+    <w:p>
+      <w:pPr>
+        <w:spacing w:before="0" w:after="24" w:line="247" w:lineRule="auto"/>
+        <w:jc w:val="left"/>
+        <w:keepNext/>
+      </w:pPr>
+      <w:r>
+        <w:rPr>
+          <w:rFonts w:ascii="Calibri" w:hAnsi="Calibri"/>
+          <w:b/>
+          <w:i w:val="0"/>
+          <w:color w:val="2B4A6F"/>
+          <w:sz w:val="19"/>
+        </w:rPr>
+        <w:t>Dsci-proj | OSS Issue-Resolution Modeling</w:t>
+      </w:r>
+      <w:r>
+        <w:rPr>
+          <w:rFonts w:ascii="Calibri" w:hAnsi="Calibri"/>
+          <w:b w:val="0"/>
+          <w:i w:val="0"/>
+          <w:color w:val="5C6774"/>
+          <w:sz w:val="19"/>
+        </w:rPr>
+        <w:t xml:space="preserve"> — </w:t>
+      </w:r>
+      <w:r>
+        <w:rPr>
+          <w:rFonts w:ascii="Calibri" w:hAnsi="Calibri"/>
+          <w:b w:val="0"/>
+          <w:i w:val="0"/>
+          <w:color w:val="202328"/>
+          <w:sz w:val="18"/>
+        </w:rPr>
+        <w:t>Built a reproducible survival-analysis pipeline plus a Next.js triage dashboard modeling GitHub issue-resolution risk across major open-source repos, with fixture-backed UI tests, CI, and deploy automation. Pairs with the CWRU Data Science minor.</w:t>
+      </w:r>
+    </w:p>
+    <w:p>
+      <w:pPr>
+        <w:spacing w:before="0" w:after="24" w:line="247" w:lineRule="auto"/>
+        <w:jc w:val="left"/>
+        <w:keepNext/>
+      </w:pPr>
+      <w:r>
+        <w:rPr>
+          <w:rFonts w:ascii="Calibri" w:hAnsi="Calibri"/>
+          <w:b/>
+          <w:i w:val="0"/>
+          <w:color w:val="2B4A6F"/>
+          <w:sz w:val="19"/>
+        </w:rPr>
+        <w:t>Fantasy | Local-First Dynasty Fantasy-Football Intelligence App</w:t>
+      </w:r>
+      <w:r>
+        <w:rPr>
+          <w:rFonts w:ascii="Calibri" w:hAnsi="Calibri"/>
+          <w:b w:val="0"/>
+          <w:i w:val="0"/>
+          <w:color w:val="5C6774"/>
+          <w:sz w:val="19"/>
+        </w:rPr>
+        <w:t xml:space="preserve"> — </w:t>
+      </w:r>
+      <w:r>
+        <w:rPr>
+          <w:rFonts w:ascii="Calibri" w:hAnsi="Calibri"/>
+          <w:b w:val="0"/>
+          <w:i w:val="0"/>
+          <w:color w:val="202328"/>
+          <w:sz w:val="18"/>
+        </w:rPr>
+        <w:t>Built a local-first dynasty fantasy-football app with a trade engine, dashboards, draft room, and ingestion workflows.</w:t>
+      </w:r>
+      <w:r>
+        <w:rPr>
+          <w:rFonts w:ascii="Calibri" w:hAnsi="Calibri"/>
+          <w:b w:val="0"/>
+          <w:i/>
+          <w:color w:val="5C6774"/>
+          <w:sz w:val="17"/>
+        </w:rPr>
+        <w:t xml:space="preserve">  Stack: FastAPI, React/Vite, DuckDB.</w:t>
+      </w:r>
+    </w:p>
+    <w:p>
+      <w:pPr>
+        <w:spacing w:before="0" w:after="24" w:line="247" w:lineRule="auto"/>
+        <w:jc w:val="left"/>
+        <w:keepNext/>
+      </w:pPr>
+      <w:r>
+        <w:rPr>
+          <w:rFonts w:ascii="Calibri" w:hAnsi="Calibri"/>
+          <w:b/>
+          <w:i w:val="0"/>
+          <w:color w:val="2B4A6F"/>
+          <w:sz w:val="19"/>
+        </w:rPr>
+        <w:t>Portfolio | Personal Portfolio Site</w:t>
+      </w:r>
+      <w:r>
+        <w:rPr>
+          <w:rFonts w:ascii="Calibri" w:hAnsi="Calibri"/>
+          <w:b w:val="0"/>
+          <w:i w:val="0"/>
+          <w:color w:val="5C6774"/>
+          <w:sz w:val="19"/>
+        </w:rPr>
+        <w:t xml:space="preserve"> — </w:t>
+      </w:r>
+      <w:r>
+        <w:rPr>
+          <w:rFonts w:ascii="Calibri" w:hAnsi="Calibri"/>
+          <w:b w:val="0"/>
+          <w:i w:val="0"/>
+          <w:color w:val="202328"/>
+          <w:sz w:val="18"/>
+        </w:rPr>
+        <w:t>Built a personal portfolio site with project-truth sync, writing, film-room surfaces, and current-work signals.</w:t>
+      </w:r>
+      <w:r>
+        <w:rPr>
+          <w:rFonts w:ascii="Calibri" w:hAnsi="Calibri"/>
+          <w:b w:val="0"/>
+          <w:i/>
+          <w:color w:val="5C6774"/>
+          <w:sz w:val="17"/>
+        </w:rPr>
+        <w:t xml:space="preserve">  Stack: TypeScript.</w:t>
+      </w:r>
+    </w:p>
+    <w:p>
+      <w:pPr>
+        <w:spacing w:before="140" w:after="80" w:line="240" w:lineRule="auto"/>
+        <w:jc w:val="left"/>
+        <w:pBdr>
+          <w:bottom w:val="single" w:sz="8" w:space="4" w:color="2B4A6F"/>
+        </w:pBdr>
+        <w:keepNext/>
+      </w:pPr>
+      <w:r>
+        <w:rPr>
+          <w:rFonts w:ascii="Calibri" w:hAnsi="Calibri"/>
+          <w:b/>
+          <w:i w:val="0"/>
+          <w:color w:val="182A44"/>
+          <w:sz w:val="23"/>
+        </w:rPr>
+        <w:t>EDUCATION</w:t>
+      </w:r>
+    </w:p>
+    <w:p>
+      <w:pPr>
+        <w:spacing w:before="0" w:after="24" w:line="247" w:lineRule="auto"/>
+        <w:jc w:val="left"/>
+      </w:pPr>
+      <w:r>
+        <w:rPr>
+          <w:rFonts w:ascii="Calibri" w:hAnsi="Calibri"/>
+          <w:b w:val="0"/>
+          <w:i w:val="0"/>
+          <w:color w:val="202328"/>
+          <w:sz w:val="18"/>
+        </w:rPr>
         <w:t>Case Western Reserve University, Cleveland, OH</w:t>
       </w:r>
     </w:p>
     <w:p>
       <w:pPr>
-        <w:pStyle w:val="CVSmall"/>
-        <w:spacing w:after="40"/>
+        <w:spacing w:before="0" w:after="24" w:line="247" w:lineRule="auto"/>
+        <w:jc w:val="left"/>
       </w:pPr>
       <w:r>
-        <w:t>B.A. in Computer Science | Minors: Artificial Intelligence, Applied Data Science, Statistics | Expected completion: Spring 2027 | Available for full-time work immediately</w:t>
+        <w:rPr>
+          <w:rFonts w:ascii="Calibri" w:hAnsi="Calibri"/>
+          <w:b w:val="0"/>
+          <w:i w:val="0"/>
+          <w:color w:val="202328"/>
+          <w:sz w:val="18"/>
+        </w:rPr>
+        <w:t>B.A. in Computer Science | Minors: Artificial Intelligence, Applied Data Science, Statistics</w:t>
       </w:r>
     </w:p>
     <w:p>
       <w:pPr>
-        <w:pStyle w:val="CVSection"/>
+        <w:spacing w:before="0" w:after="24" w:line="247" w:lineRule="auto"/>
+        <w:jc w:val="left"/>
       </w:pPr>
       <w:r>
-        <w:t>Leadership &amp; Community</w:t>
+        <w:rPr>
+          <w:rFonts w:ascii="Calibri" w:hAnsi="Calibri"/>
+          <w:b w:val="0"/>
+          <w:i w:val="0"/>
+          <w:color w:val="202328"/>
+          <w:sz w:val="18"/>
+        </w:rPr>
+        <w:t>Available for full-time work immediately</w:t>
       </w:r>
     </w:p>
     <w:p>
       <w:pPr>
-        <w:pStyle w:val="CVBullet"/>
-        <w:spacing w:after="30"/>
-        <w:ind w:left="230" w:hanging="173"/>
+        <w:spacing w:before="140" w:after="80" w:line="240" w:lineRule="auto"/>
+        <w:jc w:val="left"/>
+        <w:pBdr>
+          <w:bottom w:val="single" w:sz="8" w:space="4" w:color="2B4A6F"/>
+        </w:pBdr>
+        <w:keepNext/>
       </w:pPr>
       <w:r>
-        <w:t>• President &amp; Founder, CWRU Flea Market: recurring events averaging 600+ attendees and roughly $7K in revenue per event.</w:t>
+        <w:rPr>
+          <w:rFonts w:ascii="Calibri" w:hAnsi="Calibri"/>
+          <w:b/>
+          <w:i w:val="0"/>
+          <w:color w:val="182A44"/>
+          <w:sz w:val="23"/>
+        </w:rPr>
+        <w:t>LEADERSHIP &amp; COMMUNITY</w:t>
       </w:r>
     </w:p>
     <w:p>
       <w:pPr>
-        <w:pStyle w:val="CVBullet"/>
-        <w:spacing w:after="30"/>
-        <w:ind w:left="230" w:hanging="173"/>
+        <w:pStyle w:val="ListBullet"/>
+        <w:spacing w:before="0" w:after="30" w:line="247" w:lineRule="auto"/>
+        <w:ind w:left="389" w:hanging="216"/>
+        <w:jc w:val="left"/>
       </w:pPr>
       <w:r>
-        <w:t>• Vice President, App Developers and Innovators Club: technical development opportunities and collaboration programming.</w:t>
+        <w:rPr>
+          <w:rFonts w:ascii="Calibri" w:hAnsi="Calibri"/>
+          <w:b w:val="0"/>
+          <w:i w:val="0"/>
+          <w:color w:val="202328"/>
+          <w:sz w:val="18"/>
+        </w:rPr>
+        <w:t>President &amp; Founder, CWRU Flea Market — recurring events averaging 600+ attendees and roughly $7K in revenue per event.</w:t>
       </w:r>
     </w:p>
     <w:p>
       <w:pPr>
-        <w:pStyle w:val="CVSection"/>
+        <w:pStyle w:val="ListBullet"/>
+        <w:spacing w:before="0" w:after="30" w:line="247" w:lineRule="auto"/>
+        <w:ind w:left="389" w:hanging="216"/>
+        <w:jc w:val="left"/>
       </w:pPr>
       <w:r>
-        <w:t>Awards &amp; Honors</w:t>
+        <w:rPr>
+          <w:rFonts w:ascii="Calibri" w:hAnsi="Calibri"/>
+          <w:b w:val="0"/>
+          <w:i w:val="0"/>
+          <w:color w:val="202328"/>
+          <w:sz w:val="18"/>
+        </w:rPr>
+        <w:t>Vice President, App Developers and Innovators Club — technical development opportunities and collaboration programming.</w:t>
       </w:r>
     </w:p>
     <w:p>
       <w:pPr>
-        <w:pStyle w:val="CVSmall"/>
-        <w:spacing w:after="0"/>
+        <w:spacing w:before="140" w:after="80" w:line="240" w:lineRule="auto"/>
+        <w:jc w:val="left"/>
+        <w:pBdr>
+          <w:bottom w:val="single" w:sz="8" w:space="4" w:color="2B4A6F"/>
+        </w:pBdr>
+        <w:keepNext/>
       </w:pPr>
       <w:r>
-        <w:t>Proclamation declaring “Jakye Amos Day,” City of Buffalo (2023) | Christine Davis Award (2023) | Amazon Future Engineer Scholar (2022) | National African American Recognition Program (2021)</w:t>
+        <w:rPr>
+          <w:rFonts w:ascii="Calibri" w:hAnsi="Calibri"/>
+          <w:b/>
+          <w:i w:val="0"/>
+          <w:color w:val="182A44"/>
+          <w:sz w:val="23"/>
+        </w:rPr>
+        <w:t>AWARDS &amp; HONORS</w:t>
+      </w:r>
+    </w:p>
+    <w:p>
+      <w:pPr>
+        <w:pStyle w:val="ListBullet"/>
+        <w:spacing w:before="0" w:after="30" w:line="247" w:lineRule="auto"/>
+        <w:ind w:left="389" w:hanging="216"/>
+        <w:jc w:val="left"/>
+      </w:pPr>
+      <w:r>
+        <w:rPr>
+          <w:rFonts w:ascii="Calibri" w:hAnsi="Calibri"/>
+          <w:b w:val="0"/>
+          <w:i w:val="0"/>
+          <w:color w:val="202328"/>
+          <w:sz w:val="18"/>
+        </w:rPr>
+        <w:t>Proclamation declaring "Jakye Amos Day," City of Buffalo (2023)</w:t>
+      </w:r>
+    </w:p>
+    <w:p>
+      <w:pPr>
+        <w:pStyle w:val="ListBullet"/>
+        <w:spacing w:before="0" w:after="30" w:line="247" w:lineRule="auto"/>
+        <w:ind w:left="389" w:hanging="216"/>
+        <w:jc w:val="left"/>
+      </w:pPr>
+      <w:r>
+        <w:rPr>
+          <w:rFonts w:ascii="Calibri" w:hAnsi="Calibri"/>
+          <w:b w:val="0"/>
+          <w:i w:val="0"/>
+          <w:color w:val="202328"/>
+          <w:sz w:val="18"/>
+        </w:rPr>
+        <w:t>Christine Davis Award (2023)</w:t>
+      </w:r>
+    </w:p>
+    <w:p>
+      <w:pPr>
+        <w:pStyle w:val="ListBullet"/>
+        <w:spacing w:before="0" w:after="30" w:line="247" w:lineRule="auto"/>
+        <w:ind w:left="389" w:hanging="216"/>
+        <w:jc w:val="left"/>
+      </w:pPr>
+      <w:r>
+        <w:rPr>
+          <w:rFonts w:ascii="Calibri" w:hAnsi="Calibri"/>
+          <w:b w:val="0"/>
+          <w:i w:val="0"/>
+          <w:color w:val="202328"/>
+          <w:sz w:val="18"/>
+        </w:rPr>
+        <w:t>Amazon Future Engineer Scholar (2022)</w:t>
+      </w:r>
+    </w:p>
+    <w:p>
+      <w:pPr>
+        <w:pStyle w:val="ListBullet"/>
+        <w:spacing w:before="0" w:after="30" w:line="247" w:lineRule="auto"/>
+        <w:ind w:left="389" w:hanging="216"/>
+        <w:jc w:val="left"/>
+      </w:pPr>
+      <w:r>
+        <w:rPr>
+          <w:rFonts w:ascii="Calibri" w:hAnsi="Calibri"/>
+          <w:b w:val="0"/>
+          <w:i w:val="0"/>
+          <w:color w:val="202328"/>
+          <w:sz w:val="18"/>
+        </w:rPr>
+        <w:t>National African American Recognition Program (2021)</w:t>
       </w:r>
     </w:p>
     <w:sectPr>
+      <w:footerReference w:type="default" r:id="rId9"/>
       <w:pgSz w:w="12240" w:h="15840"/>
-      <w:pgMar w:top="691" w:right="936" w:bottom="691" w:left="936" w:header="720" w:footer="720" w:gutter="0"/>
+      <w:pgMar w:top="893" w:right="1037" w:bottom="835" w:left="1037" w:header="360" w:footer="360" w:gutter="0"/>
       <w:cols w:space="720"/>
       <w:docGrid w:linePitch="360"/>
     </w:sectPr>
   </w:body>
 </w:document>
+</file>
+
+<file path=word/footer1.xml><?xml version="1.0" encoding="utf-8"?>
+<w:ftr xmlns:m="http://schemas.openxmlformats.org/officeDocument/2006/math" xmlns:mc="http://schemas.openxmlformats.org/markup-compatibility/2006" xmlns:mo="http://schemas.microsoft.com/office/mac/office/2008/main" xmlns:mv="urn:schemas-microsoft-com:mac:vml" xmlns:o="urn:schemas-microsoft-com:office:office" xmlns:r="http://schemas.openxmlformats.org/officeDocument/2006/relationships" xmlns:v="urn:schemas-microsoft-com:vml" xmlns:w10="urn:schemas-microsoft-com:office:word" xmlns:w14="http://schemas.microsoft.com/office/word/2010/wordml" xmlns:w="http://schemas.openxmlformats.org/wordprocessingml/2006/main" xmlns:wne="http://schemas.microsoft.com/office/word/2006/wordml" xmlns:wp14="http://schemas.microsoft.com/office/word/2010/wordprocessingDrawing" xmlns:wp="http://schemas.openxmlformats.org/drawingml/2006/wordprocessingDrawing" xmlns:wpc="http://schemas.microsoft.com/office/word/2010/wordprocessingCanvas" xmlns:wpg="http://schemas.microsoft.com/office/word/2010/wordprocessingGroup" xmlns:wpi="http://schemas.microsoft.com/office/word/2010/wordprocessingInk" xmlns:wps="http://schemas.microsoft.com/office/word/2010/wordprocessingShape" mc:Ignorable="w14 wp14">
+  <w:p>
+    <w:pPr>
+      <w:pStyle w:val="Footer"/>
+      <w:spacing w:before="0" w:after="0" w:line="240" w:lineRule="auto"/>
+      <w:jc w:val="left"/>
+    </w:pPr>
+    <w:r>
+      <w:rPr>
+        <w:rFonts w:ascii="Calibri" w:hAnsi="Calibri"/>
+        <w:b w:val="0"/>
+        <w:i w:val="0"/>
+        <w:color w:val="5C6774"/>
+        <w:sz w:val="16"/>
+      </w:rPr>
+      <w:t xml:space="preserve">Jakye Amos | Comprehensive CV | </w:t>
+    </w:r>
+    <w:r>
+      <w:rPr>
+        <w:rFonts w:ascii="Calibri" w:hAnsi="Calibri"/>
+        <w:b w:val="0"/>
+        <w:i w:val="0"/>
+        <w:color w:val="5C6774"/>
+        <w:sz w:val="16"/>
+      </w:rPr>
+      <w:fldChar w:fldCharType="begin"/>
+      <w:instrText xml:space="preserve">PAGE</w:instrText>
+      <w:fldChar w:fldCharType="separate"/>
+      <w:fldChar w:fldCharType="end"/>
+    </w:r>
+  </w:p>
+</w:ftr>
 </file>
 
 <file path=word/numbering.xml><?xml version="1.0" encoding="utf-8"?>
@@ -1010,9 +2847,13 @@
     <w:name w:val="Normal"/>
     <w:qFormat/>
     <w:rsid w:val="00FC693F"/>
+    <w:pPr>
+      <w:spacing w:after="50" w:line="252" w:lineRule="auto"/>
+    </w:pPr>
     <w:rPr>
-      <w:rFonts w:ascii="Aptos" w:hAnsi="Aptos" w:eastAsia="Aptos"/>
-      <w:sz w:val="18"/>
+      <w:rFonts w:ascii="Calibri" w:hAnsi="Calibri"/>
+      <w:color w:val="202328"/>
+      <w:sz w:val="19"/>
     </w:rPr>
   </w:style>
   <w:style w:type="paragraph" w:styleId="Header">
@@ -1543,6 +3384,11 @@
       </w:numPr>
       <w:contextualSpacing/>
     </w:pPr>
+    <w:rPr>
+      <w:rFonts w:ascii="Calibri" w:hAnsi="Calibri"/>
+      <w:color w:val="202328"/>
+      <w:sz w:val="18"/>
+    </w:rPr>
   </w:style>
   <w:style w:type="paragraph" w:styleId="ListBullet2">
     <w:name w:val="List Bullet 2"/>
@@ -12696,50 +14542,6 @@
         <w:shd w:val="clear" w:color="auto" w:fill="FBCAA2" w:themeFill="accent6" w:themeFillTint="7F"/>
       </w:tcPr>
     </w:tblStylePr>
-  </w:style>
-  <w:style w:type="paragraph" w:customStyle="1" w:styleId="CVSection">
-    <w:name w:val="CV Section"/>
-    <w:pPr>
-      <w:spacing w:before="180" w:after="60"/>
-    </w:pPr>
-    <w:rPr>
-      <w:rFonts w:ascii="Aptos" w:hAnsi="Aptos"/>
-      <w:b/>
-      <w:color w:val="2F5597"/>
-      <w:sz w:val="21"/>
-    </w:rPr>
-  </w:style>
-  <w:style w:type="paragraph" w:customStyle="1" w:styleId="CVSubhead">
-    <w:name w:val="CV Subhead"/>
-    <w:pPr>
-      <w:spacing w:before="80" w:after="0"/>
-    </w:pPr>
-    <w:rPr>
-      <w:rFonts w:ascii="Aptos" w:hAnsi="Aptos"/>
-      <w:b/>
-      <w:sz w:val="19"/>
-    </w:rPr>
-  </w:style>
-  <w:style w:type="paragraph" w:customStyle="1" w:styleId="CVSmall">
-    <w:name w:val="CV Small"/>
-    <w:pPr>
-      <w:spacing w:before="0" w:after="0"/>
-    </w:pPr>
-    <w:rPr>
-      <w:rFonts w:ascii="Aptos" w:hAnsi="Aptos"/>
-      <w:sz w:val="18"/>
-    </w:rPr>
-  </w:style>
-  <w:style w:type="paragraph" w:customStyle="1" w:styleId="CVBullet">
-    <w:name w:val="CV Bullet"/>
-    <w:pPr>
-      <w:spacing w:before="0" w:after="0" w:line="240" w:lineRule="auto"/>
-      <w:ind w:left="259" w:hanging="173"/>
-    </w:pPr>
-    <w:rPr>
-      <w:rFonts w:ascii="Aptos" w:hAnsi="Aptos"/>
-      <w:sz w:val="17"/>
-    </w:rPr>
   </w:style>
 </w:styles>
 </file>

</xml_diff>